<commit_message>
chore: solving the SP1
</commit_message>
<xml_diff>
--- a/51SP Sertyficazija PZ/1/SP_KNT-116m_Onyshchenko_15_PR1.docx
+++ b/51SP Sertyficazija PZ/1/SP_KNT-116m_Onyshchenko_15_PR1.docx
@@ -113,15 +113,7 @@
       </w:pPr>
       <w:r>
         <w:rPr/>
-        <w:t>Дисципліна «</w:t>
-      </w:r>
-      <w:r>
-        <w:rPr/>
-        <w:t>Сертифікація програмного забезпечення</w:t>
-      </w:r>
-      <w:r>
-        <w:rPr/>
-        <w:t>»</w:t>
+        <w:t>Дисципліна «Сертифікація програмного забезпечення»</w:t>
       </w:r>
     </w:p>
     <w:p>
@@ -157,15 +149,7 @@
       </w:pPr>
       <w:r>
         <w:rPr/>
-        <w:t>Тема «</w:t>
-      </w:r>
-      <w:r>
-        <w:rPr/>
-        <w:t>Розроблення настанови з якості на основі застосування стандартів у сфері якості та інженерії програмного забезпечення</w:t>
-      </w:r>
-      <w:r>
-        <w:rPr/>
-        <w:t>»</w:t>
+        <w:t>Тема «Розроблення настанови з якості на основі застосування стандартів у сфері якості та інженерії програмного забезпечення»</w:t>
       </w:r>
     </w:p>
     <w:p>
@@ -336,14 +320,7 @@
         <w:tab/>
         <w:tab/>
         <w:tab/>
-      </w:r>
-      <w:r>
-        <w:rPr/>
-        <w:t xml:space="preserve">Льовкін </w:t>
-      </w:r>
-      <w:r>
-        <w:rPr/>
-        <w:t>В.М.</w:t>
+        <w:t>Льовкін В.М.</w:t>
       </w:r>
     </w:p>
     <w:p>
@@ -441,11 +418,7 @@
       </w:pPr>
       <w:r>
         <w:rPr/>
-        <w:t xml:space="preserve">Метою роботи є </w:t>
-      </w:r>
-      <w:r>
-        <w:rPr/>
-        <w:t>ознайомитися з вимогами до систем управління якістю, які висуваються міжнародними стандартами «</w:t>
+        <w:t>Метою роботи є ознайомитися з вимогами до систем управління якістю, які висуваються міжнародними стандартами «</w:t>
       </w:r>
       <w:r>
         <w:rPr>
@@ -487,11 +460,7 @@
       </w:pPr>
       <w:r>
         <w:rPr/>
-        <w:t xml:space="preserve">Навчитися визначати цілі в галузі якості та </w:t>
-      </w:r>
-      <w:r>
-        <w:rPr/>
-        <w:t>розробляти настанову з якості.</w:t>
+        <w:t>Навчитися визначати цілі в галузі якості та розробляти настанову з якості.</w:t>
       </w:r>
     </w:p>
     <w:p>
@@ -747,34 +716,487 @@
     </w:p>
     <w:p>
       <w:pPr>
-        <w:pStyle w:val="p11"/>
-        <w:rPr>
-          <w:lang w:val="uk-UA"/>
-        </w:rPr>
-      </w:pPr>
-      <w:r>
-        <w:rPr>
-          <w:lang w:val="uk-UA"/>
-        </w:rPr>
+        <w:pStyle w:val="h11"/>
+        <w:rPr/>
+      </w:pPr>
+      <w:r>
+        <w:rPr/>
+        <w:t xml:space="preserve">Результати </w:t>
+      </w:r>
+    </w:p>
+    <w:p>
+      <w:pPr>
+        <w:pStyle w:val="p11"/>
+        <w:rPr/>
+      </w:pPr>
+      <w:r>
+        <w:rPr/>
+      </w:r>
+    </w:p>
+    <w:p>
+      <w:pPr>
+        <w:pStyle w:val="p11"/>
+        <w:rPr>
+          <w:lang w:val="uk-UA"/>
+        </w:rPr>
+      </w:pPr>
+      <w:r>
+        <w:rPr>
+          <w:lang w:val="uk-UA"/>
+        </w:rPr>
+        <w:t>Індивідуальне завдання обрано за номером варіанта: 15. Медіа-компанія.</w:t>
+      </w:r>
+    </w:p>
+    <w:p>
+      <w:pPr>
+        <w:pStyle w:val="p11"/>
+        <w:rPr>
+          <w:lang w:val="uk-UA"/>
+        </w:rPr>
+      </w:pPr>
+      <w:r>
+        <w:rPr>
+          <w:lang w:val="uk-UA"/>
+        </w:rPr>
+      </w:r>
+    </w:p>
+    <w:p>
+      <w:pPr>
+        <w:pStyle w:val="H2"/>
+        <w:rPr/>
+      </w:pPr>
+      <w:r>
+        <w:rPr/>
         <w:t>Характеристика спеціалізації підприємства</w:t>
       </w:r>
     </w:p>
     <w:p>
       <w:pPr>
-        <w:pStyle w:val="p11"/>
-        <w:rPr>
-          <w:lang w:val="uk-UA"/>
-        </w:rPr>
-      </w:pPr>
-      <w:r>
-        <w:rPr>
-          <w:lang w:val="uk-UA"/>
-        </w:rPr>
+        <w:pStyle w:val="P1"/>
+        <w:rPr/>
+      </w:pPr>
+      <w:r>
+        <w:rPr/>
+      </w:r>
+    </w:p>
+    <w:p>
+      <w:pPr>
+        <w:pStyle w:val="P1"/>
+        <w:rPr/>
+      </w:pPr>
+      <w:r>
+        <w:rPr/>
+        <w:t xml:space="preserve">Підприємство медіа компанії спеціалізується на виготовленні та розповсюдженні медіа контенту. </w:t>
+      </w:r>
+      <w:r>
+        <w:rPr>
+          <w:lang w:val="uk-UA"/>
+        </w:rPr>
+        <w:t>Медіа контент це всілякий аудіовізуальний та цифровий контент, який користувач може переглядати (споживати).</w:t>
+      </w:r>
+    </w:p>
+    <w:p>
+      <w:pPr>
+        <w:pStyle w:val="P1"/>
+        <w:rPr>
+          <w:lang w:val="uk-UA"/>
+        </w:rPr>
+      </w:pPr>
+      <w:r>
+        <w:rPr>
+          <w:lang w:val="uk-UA"/>
+        </w:rPr>
+        <w:t>Медіа компанії функціонують в три етапи:</w:t>
+      </w:r>
+    </w:p>
+    <w:p>
+      <w:pPr>
+        <w:pStyle w:val="P1"/>
+        <w:widowControl/>
+        <w:numPr>
+          <w:ilvl w:val="0"/>
+          <w:numId w:val="1"/>
+        </w:numPr>
+        <w:suppressAutoHyphens w:val="true"/>
+        <w:bidi w:val="0"/>
+        <w:spacing w:lineRule="auto" w:line="360" w:before="0" w:after="0"/>
+        <w:ind w:firstLine="850" w:left="0" w:right="0"/>
+        <w:jc w:val="both"/>
+        <w:rPr>
+          <w:lang w:val="uk-UA"/>
+        </w:rPr>
+      </w:pPr>
+      <w:r>
+        <w:rPr>
+          <w:lang w:val="uk-UA"/>
+        </w:rPr>
+        <w:t>створення: новий контент обраного формату створюється;</w:t>
+      </w:r>
+    </w:p>
+    <w:p>
+      <w:pPr>
+        <w:pStyle w:val="P1"/>
+        <w:widowControl/>
+        <w:numPr>
+          <w:ilvl w:val="0"/>
+          <w:numId w:val="1"/>
+        </w:numPr>
+        <w:suppressAutoHyphens w:val="true"/>
+        <w:bidi w:val="0"/>
+        <w:spacing w:lineRule="auto" w:line="360" w:before="0" w:after="0"/>
+        <w:ind w:firstLine="850" w:left="0" w:right="0"/>
+        <w:jc w:val="both"/>
+        <w:rPr>
+          <w:lang w:val="uk-UA"/>
+        </w:rPr>
+      </w:pPr>
+      <w:r>
+        <w:rPr>
+          <w:lang w:val="uk-UA"/>
+        </w:rPr>
+        <w:t>маркетинг: інформація про цей контент розповсюджується;</w:t>
+      </w:r>
+    </w:p>
+    <w:p>
+      <w:pPr>
+        <w:pStyle w:val="P1"/>
+        <w:widowControl/>
+        <w:numPr>
+          <w:ilvl w:val="0"/>
+          <w:numId w:val="1"/>
+        </w:numPr>
+        <w:suppressAutoHyphens w:val="true"/>
+        <w:bidi w:val="0"/>
+        <w:spacing w:lineRule="auto" w:line="360" w:before="0" w:after="0"/>
+        <w:ind w:firstLine="850" w:left="0" w:right="0"/>
+        <w:jc w:val="both"/>
+        <w:rPr>
+          <w:lang w:val="uk-UA"/>
+        </w:rPr>
+      </w:pPr>
+      <w:r>
+        <w:rPr>
+          <w:lang w:val="uk-UA"/>
+        </w:rPr>
+        <w:t>розповсюдження: цей контент рекламується та передається на відповідні платформи, де його можна спожити.</w:t>
+      </w:r>
+    </w:p>
+    <w:p>
+      <w:pPr>
+        <w:pStyle w:val="P1"/>
+        <w:widowControl/>
+        <w:suppressAutoHyphens w:val="true"/>
+        <w:bidi w:val="0"/>
+        <w:spacing w:lineRule="auto" w:line="360" w:before="0" w:after="0"/>
+        <w:ind w:firstLine="850" w:left="0" w:right="0"/>
+        <w:jc w:val="both"/>
+        <w:rPr>
+          <w:lang w:val="uk-UA"/>
+        </w:rPr>
+      </w:pPr>
+      <w:r>
+        <w:rPr>
+          <w:lang w:val="uk-UA"/>
+        </w:rPr>
+        <w:t>Медіа компанії потребують таке програмне забезпечення:</w:t>
+      </w:r>
+    </w:p>
+    <w:p>
+      <w:pPr>
+        <w:pStyle w:val="P1"/>
+        <w:widowControl/>
+        <w:numPr>
+          <w:ilvl w:val="0"/>
+          <w:numId w:val="1"/>
+        </w:numPr>
+        <w:suppressAutoHyphens w:val="true"/>
+        <w:bidi w:val="0"/>
+        <w:spacing w:lineRule="auto" w:line="360" w:before="0" w:after="0"/>
+        <w:ind w:firstLine="850" w:left="0" w:right="0"/>
+        <w:jc w:val="both"/>
+        <w:rPr>
+          <w:lang w:val="uk-UA"/>
+        </w:rPr>
+      </w:pPr>
+      <w:r>
+        <w:rPr>
+          <w:lang w:val="uk-UA"/>
+        </w:rPr>
+        <w:t>стримінгові платформи: дозволяють користувачеві отримувати доступ до контенту в реальному часі, без його завантаження;</w:t>
+      </w:r>
+    </w:p>
+    <w:p>
+      <w:pPr>
+        <w:pStyle w:val="P1"/>
+        <w:widowControl/>
+        <w:numPr>
+          <w:ilvl w:val="0"/>
+          <w:numId w:val="1"/>
+        </w:numPr>
+        <w:suppressAutoHyphens w:val="true"/>
+        <w:bidi w:val="0"/>
+        <w:spacing w:lineRule="auto" w:line="360" w:before="0" w:after="0"/>
+        <w:ind w:firstLine="850" w:left="0" w:right="0"/>
+        <w:jc w:val="both"/>
+        <w:rPr>
+          <w:lang w:val="uk-UA"/>
+        </w:rPr>
+      </w:pPr>
+      <w:r>
+        <w:rPr>
+          <w:lang w:val="uk-UA"/>
+        </w:rPr>
+        <w:t>програми для соціальних мереж: медіа компанія потребує допомоги в розповсюджені контенту, для цього можуть бути використані соціальні мережі;</w:t>
+      </w:r>
+    </w:p>
+    <w:p>
+      <w:pPr>
+        <w:pStyle w:val="P1"/>
+        <w:widowControl/>
+        <w:numPr>
+          <w:ilvl w:val="0"/>
+          <w:numId w:val="1"/>
+        </w:numPr>
+        <w:suppressAutoHyphens w:val="true"/>
+        <w:bidi w:val="0"/>
+        <w:spacing w:lineRule="auto" w:line="360" w:before="0" w:after="0"/>
+        <w:ind w:firstLine="850" w:left="0" w:right="0"/>
+        <w:jc w:val="both"/>
+        <w:rPr>
+          <w:lang w:val="uk-UA"/>
+        </w:rPr>
+      </w:pPr>
+      <w:r>
+        <w:rPr>
+          <w:lang w:val="uk-UA"/>
+        </w:rPr>
+        <w:t>системи менеджменту контенту (</w:t>
+      </w:r>
+      <w:r>
+        <w:rPr>
+          <w:lang w:val="en-US"/>
+        </w:rPr>
+        <w:t xml:space="preserve">CMS): </w:t>
+      </w:r>
+      <w:r>
+        <w:rPr>
+          <w:lang w:val="uk-UA"/>
+        </w:rPr>
+        <w:t>системи для керування контентом.</w:t>
+      </w:r>
+    </w:p>
+    <w:p>
+      <w:pPr>
+        <w:pStyle w:val="P1"/>
+        <w:rPr>
+          <w:lang w:val="uk-UA"/>
+        </w:rPr>
+      </w:pPr>
+      <w:r>
+        <w:rPr>
+          <w:lang w:val="uk-UA"/>
+        </w:rPr>
+      </w:r>
+    </w:p>
+    <w:p>
+      <w:pPr>
+        <w:pStyle w:val="H2"/>
+        <w:rPr/>
+      </w:pPr>
+      <w:r>
+        <w:rPr/>
         <w:t>Організаційна структура підприємства з коротким описом обов’язків</w:t>
       </w:r>
     </w:p>
     <w:p>
       <w:pPr>
+        <w:pStyle w:val="P1"/>
+        <w:rPr>
+          <w:lang w:val="uk-UA"/>
+        </w:rPr>
+      </w:pPr>
+      <w:r>
+        <w:rPr>
+          <w:lang w:val="uk-UA"/>
+        </w:rPr>
+      </w:r>
+    </w:p>
+    <w:p>
+      <w:pPr>
+        <w:pStyle w:val="P1"/>
+        <w:rPr>
+          <w:lang w:val="uk-UA"/>
+        </w:rPr>
+      </w:pPr>
+      <w:r>
+        <w:rPr>
+          <w:lang w:val="uk-UA"/>
+        </w:rPr>
+        <w:t>Уявімо, що наша медіа компанія займається публікацією новин. Тоді оргструктура компанії буде наступною:</w:t>
+      </w:r>
+    </w:p>
+    <w:p>
+      <w:pPr>
+        <w:pStyle w:val="P1"/>
+        <w:rPr>
+          <w:lang w:val="uk-UA"/>
+        </w:rPr>
+      </w:pPr>
+      <w:r>
+        <w:rPr>
+          <w:lang w:val="uk-UA"/>
+        </w:rPr>
+      </w:r>
+    </w:p>
+    <w:p>
+      <w:pPr>
+        <w:pStyle w:val="P1"/>
+        <w:rPr>
+          <w:lang w:val="uk-UA"/>
+        </w:rPr>
+      </w:pPr>
+      <w:r>
+        <w:rPr>
+          <w:lang w:val="uk-UA"/>
+        </w:rPr>
+        <w:t>Директор</w:t>
+      </w:r>
+    </w:p>
+    <w:p>
+      <w:pPr>
+        <w:pStyle w:val="P1"/>
+        <w:rPr>
+          <w:lang w:val="uk-UA"/>
+        </w:rPr>
+      </w:pPr>
+      <w:r>
+        <w:rPr>
+          <w:lang w:val="uk-UA"/>
+        </w:rPr>
+        <w:t xml:space="preserve">├── </w:t>
+      </w:r>
+      <w:r>
+        <w:rPr>
+          <w:lang w:val="uk-UA"/>
+        </w:rPr>
+        <w:t>Керівник відділу збору (створення) новин</w:t>
+      </w:r>
+    </w:p>
+    <w:p>
+      <w:pPr>
+        <w:pStyle w:val="P1"/>
+        <w:rPr>
+          <w:lang w:val="uk-UA"/>
+        </w:rPr>
+      </w:pPr>
+      <w:r>
+        <w:rPr>
+          <w:lang w:val="uk-UA"/>
+        </w:rPr>
+        <w:t xml:space="preserve">│   └── </w:t>
+      </w:r>
+      <w:r>
+        <w:rPr>
+          <w:lang w:val="uk-UA"/>
+        </w:rPr>
+        <w:t>Підлеглі відділу збору (створення) новин...</w:t>
+      </w:r>
+    </w:p>
+    <w:p>
+      <w:pPr>
+        <w:pStyle w:val="P1"/>
+        <w:rPr>
+          <w:lang w:val="uk-UA"/>
+        </w:rPr>
+      </w:pPr>
+      <w:r>
+        <w:rPr>
+          <w:lang w:val="uk-UA"/>
+        </w:rPr>
+        <w:t xml:space="preserve">├── </w:t>
+      </w:r>
+      <w:r>
+        <w:rPr>
+          <w:lang w:val="uk-UA"/>
+        </w:rPr>
+        <w:t>Керівник відділу публікації новин в соціальних мережах</w:t>
+      </w:r>
+    </w:p>
+    <w:p>
+      <w:pPr>
+        <w:pStyle w:val="P1"/>
+        <w:rPr>
+          <w:lang w:val="uk-UA"/>
+        </w:rPr>
+      </w:pPr>
+      <w:r>
+        <w:rPr>
+          <w:lang w:val="uk-UA"/>
+        </w:rPr>
+        <w:t xml:space="preserve">│   └── </w:t>
+      </w:r>
+      <w:r>
+        <w:rPr>
+          <w:lang w:val="uk-UA"/>
+        </w:rPr>
+        <w:t>Підлеглі відділу публікації новин в соціальних мережах...</w:t>
+      </w:r>
+    </w:p>
+    <w:p>
+      <w:pPr>
+        <w:pStyle w:val="P1"/>
+        <w:rPr>
+          <w:lang w:val="uk-UA"/>
+        </w:rPr>
+      </w:pPr>
+      <w:r>
+        <w:rPr>
+          <w:lang w:val="uk-UA"/>
+        </w:rPr>
+        <w:t xml:space="preserve">└── </w:t>
+      </w:r>
+      <w:r>
+        <w:rPr>
+          <w:lang w:val="uk-UA"/>
+        </w:rPr>
+        <w:t>Керівник відділу публікації новин на вебсайті</w:t>
+      </w:r>
+    </w:p>
+    <w:p>
+      <w:pPr>
+        <w:pStyle w:val="P1"/>
+        <w:rPr>
+          <w:lang w:val="uk-UA"/>
+        </w:rPr>
+      </w:pPr>
+      <w:r>
+        <w:rPr>
+          <w:lang w:val="uk-UA"/>
+        </w:rPr>
+        <w:t xml:space="preserve">    └── </w:t>
+      </w:r>
+      <w:r>
+        <w:rPr>
+          <w:lang w:val="uk-UA"/>
+        </w:rPr>
+        <w:t>Підлеглі відділу публікації новин на вебсайті...</w:t>
+      </w:r>
+    </w:p>
+    <w:p>
+      <w:pPr>
+        <w:pStyle w:val="P1"/>
+        <w:rPr>
+          <w:lang w:val="uk-UA"/>
+        </w:rPr>
+      </w:pPr>
+      <w:r>
+        <w:rPr>
+          <w:lang w:val="uk-UA"/>
+        </w:rPr>
+      </w:r>
+    </w:p>
+    <w:p>
+      <w:pPr>
         <w:pStyle w:val="p11"/>
         <w:rPr>
           <w:lang w:val="uk-UA"/>
@@ -798,6 +1220,45 @@
         <w:rPr>
           <w:lang w:val="uk-UA"/>
         </w:rPr>
+      </w:r>
+    </w:p>
+    <w:p>
+      <w:pPr>
+        <w:pStyle w:val="p11"/>
+        <w:rPr>
+          <w:lang w:val="uk-UA"/>
+        </w:rPr>
+      </w:pPr>
+      <w:r>
+        <w:rPr>
+          <w:lang w:val="uk-UA"/>
+        </w:rPr>
+      </w:r>
+    </w:p>
+    <w:p>
+      <w:pPr>
+        <w:pStyle w:val="p11"/>
+        <w:rPr>
+          <w:lang w:val="uk-UA"/>
+        </w:rPr>
+      </w:pPr>
+      <w:r>
+        <w:rPr>
+          <w:lang w:val="uk-UA"/>
+        </w:rPr>
+      </w:r>
+    </w:p>
+    <w:p>
+      <w:pPr>
+        <w:pStyle w:val="p11"/>
+        <w:rPr>
+          <w:lang w:val="uk-UA"/>
+        </w:rPr>
+      </w:pPr>
+      <w:r>
+        <w:rPr>
+          <w:lang w:val="uk-UA"/>
+        </w:rPr>
         <w:t>Настанова з якості, яку запропоновано побудувати на основі наступних розділів:</w:t>
       </w:r>
     </w:p>
@@ -924,7 +1385,43 @@
         <w:rPr>
           <w:lang w:val="uk-UA"/>
         </w:rPr>
-        <w:t>Висновки, що містять відповіді на контрольні запитання, а також відображають результати виконання роботи та їх критичний аналіз</w:t>
+      </w:r>
+    </w:p>
+    <w:p>
+      <w:pPr>
+        <w:pStyle w:val="h11"/>
+        <w:rPr/>
+      </w:pPr>
+      <w:r>
+        <w:rPr/>
+        <w:t>Висновки</w:t>
+      </w:r>
+    </w:p>
+    <w:p>
+      <w:pPr>
+        <w:pStyle w:val="p11"/>
+        <w:rPr>
+          <w:lang w:val="uk-UA"/>
+        </w:rPr>
+      </w:pPr>
+      <w:r>
+        <w:rPr>
+          <w:lang w:val="uk-UA"/>
+        </w:rPr>
+      </w:r>
+    </w:p>
+    <w:p>
+      <w:pPr>
+        <w:pStyle w:val="p11"/>
+        <w:rPr>
+          <w:lang w:val="uk-UA"/>
+        </w:rPr>
+      </w:pPr>
+      <w:r>
+        <w:rPr>
+          <w:lang w:val="uk-UA"/>
+        </w:rPr>
+        <w:t>що містять відповіді на контрольні запитання, а також відображають результати виконання роботи та їх критичний аналіз</w:t>
       </w:r>
     </w:p>
     <w:p>
@@ -1075,6 +1572,273 @@
     </w:sectPr>
   </w:body>
 </w:document>
+</file>
+
+<file path=word/numbering.xml><?xml version="1.0" encoding="utf-8"?>
+<w:numbering xmlns:w="http://schemas.openxmlformats.org/wordprocessingml/2006/main" xmlns:o="urn:schemas-microsoft-com:office:office" xmlns:r="http://schemas.openxmlformats.org/officeDocument/2006/relationships" xmlns:v="urn:schemas-microsoft-com:vml" xmlns:mc="http://schemas.openxmlformats.org/markup-compatibility/2006" xmlns:w14="http://schemas.microsoft.com/office/word/2010/wordml" mc:Ignorable="w14">
+  <w:abstractNum w:abstractNumId="1">
+    <w:lvl w:ilvl="0">
+      <w:start w:val="1"/>
+      <w:numFmt w:val="bullet"/>
+      <w:lvlText w:val="-"/>
+      <w:lvlJc w:val="left"/>
+      <w:pPr>
+        <w:tabs>
+          <w:tab w:val="num" w:pos="720"/>
+        </w:tabs>
+        <w:ind w:left="720" w:hanging="360"/>
+      </w:pPr>
+      <w:rPr>
+        <w:rFonts w:ascii="OpenSymbol" w:hAnsi="OpenSymbol" w:cs="OpenSymbol" w:hint="default"/>
+      </w:rPr>
+    </w:lvl>
+    <w:lvl w:ilvl="1">
+      <w:start w:val="1"/>
+      <w:numFmt w:val="bullet"/>
+      <w:lvlText w:val="◦"/>
+      <w:lvlJc w:val="left"/>
+      <w:pPr>
+        <w:tabs>
+          <w:tab w:val="num" w:pos="1080"/>
+        </w:tabs>
+        <w:ind w:left="1080" w:hanging="360"/>
+      </w:pPr>
+      <w:rPr>
+        <w:rFonts w:ascii="OpenSymbol" w:hAnsi="OpenSymbol" w:cs="OpenSymbol" w:hint="default"/>
+      </w:rPr>
+    </w:lvl>
+    <w:lvl w:ilvl="2">
+      <w:start w:val="1"/>
+      <w:numFmt w:val="bullet"/>
+      <w:lvlText w:val="▪"/>
+      <w:lvlJc w:val="left"/>
+      <w:pPr>
+        <w:tabs>
+          <w:tab w:val="num" w:pos="1440"/>
+        </w:tabs>
+        <w:ind w:left="1440" w:hanging="360"/>
+      </w:pPr>
+      <w:rPr>
+        <w:rFonts w:ascii="OpenSymbol" w:hAnsi="OpenSymbol" w:cs="OpenSymbol" w:hint="default"/>
+      </w:rPr>
+    </w:lvl>
+    <w:lvl w:ilvl="3">
+      <w:start w:val="1"/>
+      <w:numFmt w:val="bullet"/>
+      <w:lvlText w:val=""/>
+      <w:lvlJc w:val="left"/>
+      <w:pPr>
+        <w:tabs>
+          <w:tab w:val="num" w:pos="1800"/>
+        </w:tabs>
+        <w:ind w:left="1800" w:hanging="360"/>
+      </w:pPr>
+      <w:rPr>
+        <w:rFonts w:ascii="Symbol" w:hAnsi="Symbol" w:cs="Symbol" w:hint="default"/>
+      </w:rPr>
+    </w:lvl>
+    <w:lvl w:ilvl="4">
+      <w:start w:val="1"/>
+      <w:numFmt w:val="bullet"/>
+      <w:lvlText w:val="◦"/>
+      <w:lvlJc w:val="left"/>
+      <w:pPr>
+        <w:tabs>
+          <w:tab w:val="num" w:pos="2160"/>
+        </w:tabs>
+        <w:ind w:left="2160" w:hanging="360"/>
+      </w:pPr>
+      <w:rPr>
+        <w:rFonts w:ascii="OpenSymbol" w:hAnsi="OpenSymbol" w:cs="OpenSymbol" w:hint="default"/>
+      </w:rPr>
+    </w:lvl>
+    <w:lvl w:ilvl="5">
+      <w:start w:val="1"/>
+      <w:numFmt w:val="bullet"/>
+      <w:lvlText w:val="▪"/>
+      <w:lvlJc w:val="left"/>
+      <w:pPr>
+        <w:tabs>
+          <w:tab w:val="num" w:pos="2520"/>
+        </w:tabs>
+        <w:ind w:left="2520" w:hanging="360"/>
+      </w:pPr>
+      <w:rPr>
+        <w:rFonts w:ascii="OpenSymbol" w:hAnsi="OpenSymbol" w:cs="OpenSymbol" w:hint="default"/>
+      </w:rPr>
+    </w:lvl>
+    <w:lvl w:ilvl="6">
+      <w:start w:val="1"/>
+      <w:numFmt w:val="bullet"/>
+      <w:lvlText w:val=""/>
+      <w:lvlJc w:val="left"/>
+      <w:pPr>
+        <w:tabs>
+          <w:tab w:val="num" w:pos="2880"/>
+        </w:tabs>
+        <w:ind w:left="2880" w:hanging="360"/>
+      </w:pPr>
+      <w:rPr>
+        <w:rFonts w:ascii="Symbol" w:hAnsi="Symbol" w:cs="Symbol" w:hint="default"/>
+      </w:rPr>
+    </w:lvl>
+    <w:lvl w:ilvl="7">
+      <w:start w:val="1"/>
+      <w:numFmt w:val="bullet"/>
+      <w:lvlText w:val="◦"/>
+      <w:lvlJc w:val="left"/>
+      <w:pPr>
+        <w:tabs>
+          <w:tab w:val="num" w:pos="3240"/>
+        </w:tabs>
+        <w:ind w:left="3240" w:hanging="360"/>
+      </w:pPr>
+      <w:rPr>
+        <w:rFonts w:ascii="OpenSymbol" w:hAnsi="OpenSymbol" w:cs="OpenSymbol" w:hint="default"/>
+      </w:rPr>
+    </w:lvl>
+    <w:lvl w:ilvl="8">
+      <w:start w:val="1"/>
+      <w:numFmt w:val="bullet"/>
+      <w:lvlText w:val="▪"/>
+      <w:lvlJc w:val="left"/>
+      <w:pPr>
+        <w:tabs>
+          <w:tab w:val="num" w:pos="3600"/>
+        </w:tabs>
+        <w:ind w:left="3600" w:hanging="360"/>
+      </w:pPr>
+      <w:rPr>
+        <w:rFonts w:ascii="OpenSymbol" w:hAnsi="OpenSymbol" w:cs="OpenSymbol" w:hint="default"/>
+      </w:rPr>
+    </w:lvl>
+  </w:abstractNum>
+  <w:abstractNum w:abstractNumId="2">
+    <w:lvl w:ilvl="0">
+      <w:start w:val="1"/>
+      <w:numFmt w:val="none"/>
+      <w:suff w:val="nothing"/>
+      <w:lvlText w:val=""/>
+      <w:lvlJc w:val="left"/>
+      <w:pPr>
+        <w:tabs>
+          <w:tab w:val="num" w:pos="0"/>
+        </w:tabs>
+        <w:ind w:left="0" w:hanging="0"/>
+      </w:pPr>
+    </w:lvl>
+    <w:lvl w:ilvl="1">
+      <w:start w:val="1"/>
+      <w:numFmt w:val="none"/>
+      <w:suff w:val="nothing"/>
+      <w:lvlText w:val=""/>
+      <w:lvlJc w:val="left"/>
+      <w:pPr>
+        <w:tabs>
+          <w:tab w:val="num" w:pos="0"/>
+        </w:tabs>
+        <w:ind w:left="0" w:hanging="0"/>
+      </w:pPr>
+    </w:lvl>
+    <w:lvl w:ilvl="2">
+      <w:start w:val="1"/>
+      <w:numFmt w:val="none"/>
+      <w:suff w:val="nothing"/>
+      <w:lvlText w:val=""/>
+      <w:lvlJc w:val="left"/>
+      <w:pPr>
+        <w:tabs>
+          <w:tab w:val="num" w:pos="0"/>
+        </w:tabs>
+        <w:ind w:left="0" w:hanging="0"/>
+      </w:pPr>
+    </w:lvl>
+    <w:lvl w:ilvl="3">
+      <w:start w:val="1"/>
+      <w:numFmt w:val="none"/>
+      <w:suff w:val="nothing"/>
+      <w:lvlText w:val=""/>
+      <w:lvlJc w:val="left"/>
+      <w:pPr>
+        <w:tabs>
+          <w:tab w:val="num" w:pos="0"/>
+        </w:tabs>
+        <w:ind w:left="0" w:hanging="0"/>
+      </w:pPr>
+    </w:lvl>
+    <w:lvl w:ilvl="4">
+      <w:start w:val="1"/>
+      <w:numFmt w:val="none"/>
+      <w:suff w:val="nothing"/>
+      <w:lvlText w:val=""/>
+      <w:lvlJc w:val="left"/>
+      <w:pPr>
+        <w:tabs>
+          <w:tab w:val="num" w:pos="0"/>
+        </w:tabs>
+        <w:ind w:left="0" w:hanging="0"/>
+      </w:pPr>
+    </w:lvl>
+    <w:lvl w:ilvl="5">
+      <w:start w:val="1"/>
+      <w:numFmt w:val="none"/>
+      <w:suff w:val="nothing"/>
+      <w:lvlText w:val=""/>
+      <w:lvlJc w:val="left"/>
+      <w:pPr>
+        <w:tabs>
+          <w:tab w:val="num" w:pos="0"/>
+        </w:tabs>
+        <w:ind w:left="0" w:hanging="0"/>
+      </w:pPr>
+    </w:lvl>
+    <w:lvl w:ilvl="6">
+      <w:start w:val="1"/>
+      <w:numFmt w:val="none"/>
+      <w:suff w:val="nothing"/>
+      <w:lvlText w:val=""/>
+      <w:lvlJc w:val="left"/>
+      <w:pPr>
+        <w:tabs>
+          <w:tab w:val="num" w:pos="0"/>
+        </w:tabs>
+        <w:ind w:left="0" w:hanging="0"/>
+      </w:pPr>
+    </w:lvl>
+    <w:lvl w:ilvl="7">
+      <w:start w:val="1"/>
+      <w:numFmt w:val="none"/>
+      <w:suff w:val="nothing"/>
+      <w:lvlText w:val=""/>
+      <w:lvlJc w:val="left"/>
+      <w:pPr>
+        <w:tabs>
+          <w:tab w:val="num" w:pos="0"/>
+        </w:tabs>
+        <w:ind w:left="0" w:hanging="0"/>
+      </w:pPr>
+    </w:lvl>
+    <w:lvl w:ilvl="8">
+      <w:start w:val="1"/>
+      <w:numFmt w:val="none"/>
+      <w:suff w:val="nothing"/>
+      <w:lvlText w:val=""/>
+      <w:lvlJc w:val="left"/>
+      <w:pPr>
+        <w:tabs>
+          <w:tab w:val="num" w:pos="0"/>
+        </w:tabs>
+        <w:ind w:left="0" w:hanging="0"/>
+      </w:pPr>
+    </w:lvl>
+  </w:abstractNum>
+  <w:num w:numId="1">
+    <w:abstractNumId w:val="1"/>
+  </w:num>
+  <w:num w:numId="2">
+    <w:abstractNumId w:val="2"/>
+  </w:num>
+</w:numbering>
 </file>
 
 <file path=word/styles.xml><?xml version="1.0" encoding="utf-8"?>
@@ -1862,12 +2626,19 @@
       <w:lang w:val="en-US" w:eastAsia="uk-UA"/>
     </w:rPr>
   </w:style>
-  <w:style w:type="character" w:styleId="user">
-    <w:name w:val="Символ нумерації (user)"/>
+  <w:style w:type="character" w:styleId="Style12">
+    <w:name w:val="Символ нумерації"/>
     <w:qFormat/>
     <w:rPr/>
   </w:style>
-  <w:style w:type="paragraph" w:styleId="Style12">
+  <w:style w:type="character" w:styleId="Style13">
+    <w:name w:val="Маркери"/>
+    <w:qFormat/>
+    <w:rPr>
+      <w:rFonts w:ascii="OpenSymbol" w:hAnsi="OpenSymbol" w:eastAsia="OpenSymbol" w:cs="OpenSymbol"/>
+    </w:rPr>
+  </w:style>
+  <w:style w:type="paragraph" w:styleId="Style14">
     <w:name w:val="Заголовок"/>
     <w:basedOn w:val="Normal"/>
     <w:next w:val="BodyText"/>
@@ -1877,7 +2648,7 @@
       <w:spacing w:before="240" w:after="120"/>
     </w:pPr>
     <w:rPr>
-      <w:rFonts w:ascii="Liberation Sans" w:hAnsi="Liberation Sans" w:eastAsia="Microsoft YaHei" w:cs="Arial Unicode MS"/>
+      <w:rFonts w:ascii="Liberation Sans" w:hAnsi="Liberation Sans" w:eastAsia="Microsoft YaHei" w:cs="Lucida Sans"/>
       <w:sz w:val="28"/>
       <w:szCs w:val="28"/>
     </w:rPr>
@@ -1914,7 +2685,7 @@
       <w:szCs w:val="24"/>
     </w:rPr>
   </w:style>
-  <w:style w:type="paragraph" w:styleId="Style13">
+  <w:style w:type="paragraph" w:styleId="Style15">
     <w:name w:val="Покажчик"/>
     <w:basedOn w:val="Normal"/>
     <w:qFormat/>
@@ -1922,10 +2693,10 @@
       <w:suppressLineNumbers/>
     </w:pPr>
     <w:rPr>
-      <w:rFonts w:cs="Arial Unicode MS"/>
-    </w:rPr>
-  </w:style>
-  <w:style w:type="paragraph" w:styleId="user1">
+      <w:rFonts w:cs="Lucida Sans"/>
+    </w:rPr>
+  </w:style>
+  <w:style w:type="paragraph" w:styleId="user">
     <w:name w:val="Заголовок (user)"/>
     <w:basedOn w:val="Normal"/>
     <w:next w:val="BodyText"/>
@@ -1935,12 +2706,12 @@
       <w:spacing w:before="240" w:after="120"/>
     </w:pPr>
     <w:rPr>
-      <w:rFonts w:ascii="Liberation Sans" w:hAnsi="Liberation Sans" w:eastAsia="Microsoft YaHei" w:cs="Lucida Sans"/>
+      <w:rFonts w:ascii="Liberation Sans" w:hAnsi="Liberation Sans" w:eastAsia="Microsoft YaHei" w:cs="Arial Unicode MS"/>
       <w:sz w:val="28"/>
       <w:szCs w:val="28"/>
     </w:rPr>
   </w:style>
-  <w:style w:type="paragraph" w:styleId="user2">
+  <w:style w:type="paragraph" w:styleId="user1">
     <w:name w:val="Покажчик (user)"/>
     <w:basedOn w:val="Normal"/>
     <w:qFormat/>
@@ -1948,12 +2719,12 @@
       <w:suppressLineNumbers/>
     </w:pPr>
     <w:rPr>
-      <w:rFonts w:cs="Lucida Sans"/>
+      <w:rFonts w:cs="Arial Unicode MS"/>
     </w:rPr>
   </w:style>
   <w:style w:type="paragraph" w:styleId="IndexHeading">
     <w:name w:val="index heading"/>
-    <w:basedOn w:val="Style12"/>
+    <w:basedOn w:val="user"/>
     <w:pPr/>
     <w:rPr/>
   </w:style>
@@ -2229,8 +3000,8 @@
     </w:pPr>
     <w:rPr/>
   </w:style>
-  <w:style w:type="numbering" w:styleId="Style14" w:default="1">
-    <w:name w:val="Без маркерів"/>
+  <w:style w:type="numbering" w:styleId="user2" w:default="1">
+    <w:name w:val="Без маркерів (user)"/>
     <w:uiPriority w:val="99"/>
     <w:semiHidden/>
     <w:unhideWhenUsed/>

</xml_diff>

<commit_message>
feat: add the tasks
</commit_message>
<xml_diff>
--- a/51SP Sertyficazija PZ/1/SP_KNT-116m_Onyshchenko_15_PR1.docx
+++ b/51SP Sertyficazija PZ/1/SP_KNT-116m_Onyshchenko_15_PR1.docx
@@ -236,7 +236,14 @@
           <w:b/>
           <w:bCs/>
         </w:rPr>
-        <w:t>Виконав варіант 19</w:t>
+        <w:t xml:space="preserve">Виконав варіант </w:t>
+      </w:r>
+      <w:r>
+        <w:rPr>
+          <w:b/>
+          <w:bCs/>
+        </w:rPr>
+        <w:t>15</w:t>
       </w:r>
     </w:p>
     <w:p>
@@ -1197,69 +1204,1377 @@
     </w:p>
     <w:p>
       <w:pPr>
-        <w:pStyle w:val="p11"/>
-        <w:rPr>
-          <w:lang w:val="uk-UA"/>
-        </w:rPr>
-      </w:pPr>
-      <w:r>
-        <w:rPr>
-          <w:lang w:val="uk-UA"/>
-        </w:rPr>
-        <w:t>Цілі в галузі якості та відповідний набір показників ступеня досягнення цілей в галузі якості</w:t>
-      </w:r>
-    </w:p>
-    <w:p>
-      <w:pPr>
-        <w:pStyle w:val="p11"/>
-        <w:rPr>
-          <w:lang w:val="uk-UA"/>
-        </w:rPr>
-      </w:pPr>
-      <w:r>
-        <w:rPr>
-          <w:lang w:val="uk-UA"/>
-        </w:rPr>
-      </w:r>
-    </w:p>
-    <w:p>
-      <w:pPr>
-        <w:pStyle w:val="p11"/>
-        <w:rPr>
-          <w:lang w:val="uk-UA"/>
-        </w:rPr>
-      </w:pPr>
-      <w:r>
-        <w:rPr>
-          <w:lang w:val="uk-UA"/>
-        </w:rPr>
-      </w:r>
-    </w:p>
-    <w:p>
-      <w:pPr>
-        <w:pStyle w:val="p11"/>
-        <w:rPr>
-          <w:lang w:val="uk-UA"/>
-        </w:rPr>
-      </w:pPr>
-      <w:r>
-        <w:rPr>
-          <w:lang w:val="uk-UA"/>
-        </w:rPr>
-      </w:r>
-    </w:p>
-    <w:p>
-      <w:pPr>
-        <w:pStyle w:val="p11"/>
-        <w:rPr>
-          <w:lang w:val="uk-UA"/>
-        </w:rPr>
-      </w:pPr>
-      <w:r>
-        <w:rPr>
-          <w:lang w:val="uk-UA"/>
-        </w:rPr>
-        <w:t>Настанова з якості, яку запропоновано побудувати на основі наступних розділів:</w:t>
+        <w:pStyle w:val="P1"/>
+        <w:rPr>
+          <w:lang w:val="uk-UA"/>
+        </w:rPr>
+      </w:pPr>
+      <w:r>
+        <w:rPr>
+          <w:lang w:val="uk-UA"/>
+        </w:rPr>
+        <w:t>У вигляді діаграми оргструктура наведена на рисунку 1.1.</w:t>
+      </w:r>
+    </w:p>
+    <w:p>
+      <w:pPr>
+        <w:pStyle w:val="P1"/>
+        <w:rPr>
+          <w:lang w:val="uk-UA"/>
+        </w:rPr>
+      </w:pPr>
+      <w:r>
+        <w:rPr>
+          <w:lang w:val="uk-UA"/>
+        </w:rPr>
+      </w:r>
+    </w:p>
+    <w:p>
+      <w:pPr>
+        <w:pStyle w:val="img1"/>
+        <w:rPr/>
+      </w:pPr>
+      <w:r>
+        <w:rPr/>
+        <w:drawing>
+          <wp:inline distT="0" distB="0" distL="0" distR="0">
+            <wp:extent cx="5731510" cy="1111250"/>
+            <wp:effectExtent l="0" t="0" r="0" b="0"/>
+            <wp:docPr id="1" name="Зображення1"/>
+            <wp:cNvGraphicFramePr>
+              <a:graphicFrameLocks xmlns:a="http://schemas.openxmlformats.org/drawingml/2006/main" noChangeAspect="1"/>
+            </wp:cNvGraphicFramePr>
+            <a:graphic xmlns:a="http://schemas.openxmlformats.org/drawingml/2006/main">
+              <a:graphicData uri="http://schemas.openxmlformats.org/drawingml/2006/picture">
+                <pic:pic xmlns:pic="http://schemas.openxmlformats.org/drawingml/2006/picture">
+                  <pic:nvPicPr>
+                    <pic:cNvPr id="1" name="Зображення1"/>
+                    <pic:cNvPicPr>
+                      <a:picLocks noChangeAspect="1" noChangeArrowheads="1"/>
+                    </pic:cNvPicPr>
+                  </pic:nvPicPr>
+                  <pic:blipFill>
+                    <a:blip r:embed="rId2"/>
+                    <a:stretch>
+                      <a:fillRect/>
+                    </a:stretch>
+                  </pic:blipFill>
+                  <pic:spPr bwMode="auto">
+                    <a:xfrm>
+                      <a:off x="0" y="0"/>
+                      <a:ext cx="5731510" cy="1111250"/>
+                    </a:xfrm>
+                    <a:prstGeom prst="rect">
+                      <a:avLst/>
+                    </a:prstGeom>
+                    <a:noFill/>
+                  </pic:spPr>
+                </pic:pic>
+              </a:graphicData>
+            </a:graphic>
+          </wp:inline>
+        </w:drawing>
+      </w:r>
+    </w:p>
+    <w:p>
+      <w:pPr>
+        <w:pStyle w:val="img1"/>
+        <w:rPr/>
+      </w:pPr>
+      <w:r>
+        <w:rPr/>
+        <w:t>Рисунок 1.1 — Організаційна структура підприємства</w:t>
+      </w:r>
+    </w:p>
+    <w:p>
+      <w:pPr>
+        <w:pStyle w:val="P1"/>
+        <w:rPr>
+          <w:lang w:val="uk-UA"/>
+        </w:rPr>
+      </w:pPr>
+      <w:r>
+        <w:rPr>
+          <w:lang w:val="uk-UA"/>
+        </w:rPr>
+      </w:r>
+    </w:p>
+    <w:p>
+      <w:pPr>
+        <w:pStyle w:val="P1"/>
+        <w:rPr>
+          <w:lang w:val="uk-UA"/>
+        </w:rPr>
+      </w:pPr>
+      <w:r>
+        <w:rPr>
+          <w:lang w:val="uk-UA"/>
+        </w:rPr>
+        <w:t>Обов’язки директора є керування компанією та делегація задач керівникам відділів.</w:t>
+      </w:r>
+    </w:p>
+    <w:p>
+      <w:pPr>
+        <w:pStyle w:val="P1"/>
+        <w:rPr>
+          <w:lang w:val="uk-UA"/>
+        </w:rPr>
+      </w:pPr>
+      <w:r>
+        <w:rPr>
+          <w:lang w:val="uk-UA"/>
+        </w:rPr>
+        <w:t>Обов’язки керівника відділу створення (збирання) новин є організація підлеглих для збору та створення новин.</w:t>
+      </w:r>
+    </w:p>
+    <w:p>
+      <w:pPr>
+        <w:pStyle w:val="P1"/>
+        <w:rPr>
+          <w:lang w:val="uk-UA"/>
+        </w:rPr>
+      </w:pPr>
+      <w:r>
+        <w:rPr>
+          <w:lang w:val="uk-UA"/>
+        </w:rPr>
+        <w:t>Обов’язки керівника відділу з соціальних мереж є делегація підлеглим налаштування каналів у соціальних мережах та публікації новин в них.</w:t>
+      </w:r>
+    </w:p>
+    <w:p>
+      <w:pPr>
+        <w:pStyle w:val="P1"/>
+        <w:rPr>
+          <w:lang w:val="uk-UA"/>
+        </w:rPr>
+      </w:pPr>
+      <w:r>
+        <w:rPr>
+          <w:lang w:val="uk-UA"/>
+        </w:rPr>
+        <w:t>Обов’язки керівника відділу публікації новин на вебсайті є організація підлеглих для створення та публікації новин на вебсайті компанії.</w:t>
+      </w:r>
+    </w:p>
+    <w:p>
+      <w:pPr>
+        <w:pStyle w:val="P1"/>
+        <w:rPr>
+          <w:lang w:val="uk-UA"/>
+        </w:rPr>
+      </w:pPr>
+      <w:r>
+        <w:rPr>
+          <w:lang w:val="uk-UA"/>
+        </w:rPr>
+      </w:r>
+    </w:p>
+    <w:p>
+      <w:pPr>
+        <w:pStyle w:val="H2"/>
+        <w:rPr/>
+      </w:pPr>
+      <w:r>
+        <w:rPr/>
+        <w:t xml:space="preserve">Цілі в галузі якості </w:t>
+      </w:r>
+    </w:p>
+    <w:p>
+      <w:pPr>
+        <w:pStyle w:val="p11"/>
+        <w:rPr/>
+      </w:pPr>
+      <w:r>
+        <w:rPr/>
+      </w:r>
+    </w:p>
+    <w:p>
+      <w:pPr>
+        <w:pStyle w:val="p11"/>
+        <w:rPr/>
+      </w:pPr>
+      <w:r>
+        <w:rPr/>
+        <w:t>Спершу треба визначити групи користувачів, для яких будуть формуватися вимоги. Це:</w:t>
+      </w:r>
+    </w:p>
+    <w:p>
+      <w:pPr>
+        <w:pStyle w:val="p11"/>
+        <w:rPr/>
+      </w:pPr>
+      <w:r>
+        <w:rPr/>
+        <w:t>1. Користувач веб-сайту або соціальної мережі;</w:t>
+      </w:r>
+    </w:p>
+    <w:p>
+      <w:pPr>
+        <w:pStyle w:val="p11"/>
+        <w:rPr/>
+      </w:pPr>
+      <w:r>
+        <w:rPr/>
+        <w:t>2. Рекламодавець;</w:t>
+      </w:r>
+    </w:p>
+    <w:p>
+      <w:pPr>
+        <w:pStyle w:val="p11"/>
+        <w:rPr/>
+      </w:pPr>
+      <w:r>
+        <w:rPr/>
+        <w:t>3. Адміністратор.</w:t>
+      </w:r>
+    </w:p>
+    <w:p>
+      <w:pPr>
+        <w:pStyle w:val="p11"/>
+        <w:rPr/>
+      </w:pPr>
+      <w:r>
+        <w:rPr/>
+        <w:t>Цілі в галузі якості є такі:</w:t>
+      </w:r>
+    </w:p>
+    <w:p>
+      <w:pPr>
+        <w:pStyle w:val="p11"/>
+        <w:rPr/>
+      </w:pPr>
+      <w:r>
+        <w:rPr/>
+      </w:r>
+    </w:p>
+    <w:p>
+      <w:pPr>
+        <w:pStyle w:val="p11"/>
+        <w:rPr/>
+      </w:pPr>
+      <w:r>
+        <w:rPr/>
+        <w:t>Таблиця 1.1 — Цілі в галузі якості та відповідні показники ступеня їх досягнення</w:t>
+      </w:r>
+    </w:p>
+    <w:tbl>
+      <w:tblPr>
+        <w:tblW w:w="9026" w:type="dxa"/>
+        <w:jc w:val="left"/>
+        <w:tblInd w:w="55" w:type="dxa"/>
+        <w:tblLayout w:type="fixed"/>
+        <w:tblCellMar>
+          <w:top w:w="55" w:type="dxa"/>
+          <w:left w:w="55" w:type="dxa"/>
+          <w:bottom w:w="55" w:type="dxa"/>
+          <w:right w:w="55" w:type="dxa"/>
+        </w:tblCellMar>
+      </w:tblPr>
+      <w:tblGrid>
+        <w:gridCol w:w="372"/>
+        <w:gridCol w:w="1672"/>
+        <w:gridCol w:w="3372"/>
+        <w:gridCol w:w="1805"/>
+        <w:gridCol w:w="1805"/>
+      </w:tblGrid>
+      <w:tr>
+        <w:trPr>
+          <w:tblHeader w:val="true"/>
+        </w:trPr>
+        <w:tc>
+          <w:tcPr>
+            <w:tcW w:w="372" w:type="dxa"/>
+            <w:tcBorders>
+              <w:top w:val="single" w:sz="4" w:space="0" w:color="000000"/>
+              <w:left w:val="single" w:sz="4" w:space="0" w:color="000000"/>
+              <w:bottom w:val="single" w:sz="4" w:space="0" w:color="000000"/>
+            </w:tcBorders>
+            <w:vAlign w:val="center"/>
+          </w:tcPr>
+          <w:p>
+            <w:pPr>
+              <w:pStyle w:val="Style16"/>
+              <w:spacing w:lineRule="auto" w:line="240"/>
+              <w:ind w:hanging="0" w:left="0"/>
+              <w:jc w:val="center"/>
+              <w:rPr>
+                <w:b/>
+                <w:bCs/>
+                <w:sz w:val="24"/>
+                <w:szCs w:val="24"/>
+              </w:rPr>
+            </w:pPr>
+            <w:r>
+              <w:rPr>
+                <w:b/>
+                <w:bCs/>
+                <w:sz w:val="24"/>
+                <w:szCs w:val="24"/>
+              </w:rPr>
+              <w:t>№</w:t>
+            </w:r>
+          </w:p>
+        </w:tc>
+        <w:tc>
+          <w:tcPr>
+            <w:tcW w:w="1672" w:type="dxa"/>
+            <w:tcBorders>
+              <w:top w:val="single" w:sz="4" w:space="0" w:color="000000"/>
+              <w:left w:val="single" w:sz="4" w:space="0" w:color="000000"/>
+              <w:bottom w:val="single" w:sz="4" w:space="0" w:color="000000"/>
+            </w:tcBorders>
+            <w:vAlign w:val="center"/>
+          </w:tcPr>
+          <w:p>
+            <w:pPr>
+              <w:pStyle w:val="Style16"/>
+              <w:spacing w:lineRule="auto" w:line="240"/>
+              <w:ind w:hanging="0" w:left="0"/>
+              <w:jc w:val="center"/>
+              <w:rPr>
+                <w:b/>
+                <w:bCs/>
+                <w:sz w:val="24"/>
+                <w:szCs w:val="24"/>
+              </w:rPr>
+            </w:pPr>
+            <w:r>
+              <w:rPr>
+                <w:b/>
+                <w:bCs/>
+                <w:sz w:val="24"/>
+                <w:szCs w:val="24"/>
+              </w:rPr>
+              <w:t>Роль</w:t>
+            </w:r>
+          </w:p>
+        </w:tc>
+        <w:tc>
+          <w:tcPr>
+            <w:tcW w:w="3372" w:type="dxa"/>
+            <w:tcBorders>
+              <w:top w:val="single" w:sz="4" w:space="0" w:color="000000"/>
+              <w:left w:val="single" w:sz="4" w:space="0" w:color="000000"/>
+              <w:bottom w:val="single" w:sz="4" w:space="0" w:color="000000"/>
+            </w:tcBorders>
+            <w:vAlign w:val="center"/>
+          </w:tcPr>
+          <w:p>
+            <w:pPr>
+              <w:pStyle w:val="Style16"/>
+              <w:spacing w:lineRule="auto" w:line="240"/>
+              <w:ind w:hanging="0" w:left="0"/>
+              <w:jc w:val="center"/>
+              <w:rPr>
+                <w:b/>
+                <w:bCs/>
+                <w:sz w:val="24"/>
+                <w:szCs w:val="24"/>
+              </w:rPr>
+            </w:pPr>
+            <w:r>
+              <w:rPr>
+                <w:b/>
+                <w:bCs/>
+                <w:sz w:val="24"/>
+                <w:szCs w:val="24"/>
+              </w:rPr>
+              <w:t>Ціль</w:t>
+            </w:r>
+          </w:p>
+        </w:tc>
+        <w:tc>
+          <w:tcPr>
+            <w:tcW w:w="1805" w:type="dxa"/>
+            <w:tcBorders>
+              <w:top w:val="single" w:sz="4" w:space="0" w:color="000000"/>
+              <w:left w:val="single" w:sz="4" w:space="0" w:color="000000"/>
+              <w:bottom w:val="single" w:sz="4" w:space="0" w:color="000000"/>
+            </w:tcBorders>
+            <w:vAlign w:val="center"/>
+          </w:tcPr>
+          <w:p>
+            <w:pPr>
+              <w:pStyle w:val="Style16"/>
+              <w:spacing w:lineRule="auto" w:line="240"/>
+              <w:ind w:hanging="0" w:left="0"/>
+              <w:jc w:val="center"/>
+              <w:rPr>
+                <w:b/>
+                <w:bCs/>
+                <w:sz w:val="24"/>
+                <w:szCs w:val="24"/>
+              </w:rPr>
+            </w:pPr>
+            <w:r>
+              <w:rPr>
+                <w:b/>
+                <w:bCs/>
+                <w:sz w:val="24"/>
+                <w:szCs w:val="24"/>
+              </w:rPr>
+              <w:t>Термін</w:t>
+            </w:r>
+          </w:p>
+        </w:tc>
+        <w:tc>
+          <w:tcPr>
+            <w:tcW w:w="1805" w:type="dxa"/>
+            <w:tcBorders>
+              <w:top w:val="single" w:sz="4" w:space="0" w:color="000000"/>
+              <w:left w:val="single" w:sz="4" w:space="0" w:color="000000"/>
+              <w:bottom w:val="single" w:sz="4" w:space="0" w:color="000000"/>
+              <w:right w:val="single" w:sz="4" w:space="0" w:color="000000"/>
+            </w:tcBorders>
+            <w:vAlign w:val="center"/>
+          </w:tcPr>
+          <w:p>
+            <w:pPr>
+              <w:pStyle w:val="p11"/>
+              <w:spacing w:lineRule="auto" w:line="240"/>
+              <w:ind w:hanging="0" w:left="0"/>
+              <w:jc w:val="center"/>
+              <w:rPr>
+                <w:b/>
+                <w:bCs/>
+                <w:sz w:val="24"/>
+                <w:szCs w:val="24"/>
+              </w:rPr>
+            </w:pPr>
+            <w:r>
+              <w:rPr>
+                <w:b/>
+                <w:bCs/>
+                <w:sz w:val="24"/>
+                <w:szCs w:val="24"/>
+              </w:rPr>
+              <w:t>Показник досягнення</w:t>
+            </w:r>
+          </w:p>
+        </w:tc>
+      </w:tr>
+      <w:tr>
+        <w:trPr/>
+        <w:tc>
+          <w:tcPr>
+            <w:tcW w:w="372" w:type="dxa"/>
+            <w:tcBorders>
+              <w:left w:val="single" w:sz="4" w:space="0" w:color="000000"/>
+              <w:bottom w:val="single" w:sz="4" w:space="0" w:color="000000"/>
+            </w:tcBorders>
+            <w:vAlign w:val="center"/>
+          </w:tcPr>
+          <w:p>
+            <w:pPr>
+              <w:pStyle w:val="Style16"/>
+              <w:spacing w:lineRule="auto" w:line="240"/>
+              <w:ind w:hanging="0" w:left="0"/>
+              <w:rPr>
+                <w:sz w:val="24"/>
+                <w:szCs w:val="24"/>
+              </w:rPr>
+            </w:pPr>
+            <w:r>
+              <w:rPr>
+                <w:sz w:val="24"/>
+                <w:szCs w:val="24"/>
+              </w:rPr>
+              <w:t>1</w:t>
+            </w:r>
+          </w:p>
+        </w:tc>
+        <w:tc>
+          <w:tcPr>
+            <w:tcW w:w="1672" w:type="dxa"/>
+            <w:tcBorders>
+              <w:left w:val="single" w:sz="4" w:space="0" w:color="000000"/>
+              <w:bottom w:val="single" w:sz="4" w:space="0" w:color="000000"/>
+            </w:tcBorders>
+            <w:vAlign w:val="center"/>
+          </w:tcPr>
+          <w:p>
+            <w:pPr>
+              <w:pStyle w:val="Style16"/>
+              <w:spacing w:lineRule="auto" w:line="240"/>
+              <w:ind w:hanging="0" w:left="0"/>
+              <w:rPr>
+                <w:sz w:val="24"/>
+                <w:szCs w:val="24"/>
+              </w:rPr>
+            </w:pPr>
+            <w:r>
+              <w:rPr>
+                <w:sz w:val="24"/>
+                <w:szCs w:val="24"/>
+              </w:rPr>
+              <w:t>Користувач</w:t>
+            </w:r>
+          </w:p>
+        </w:tc>
+        <w:tc>
+          <w:tcPr>
+            <w:tcW w:w="3372" w:type="dxa"/>
+            <w:tcBorders>
+              <w:left w:val="single" w:sz="4" w:space="0" w:color="000000"/>
+              <w:bottom w:val="single" w:sz="4" w:space="0" w:color="000000"/>
+            </w:tcBorders>
+            <w:vAlign w:val="center"/>
+          </w:tcPr>
+          <w:p>
+            <w:pPr>
+              <w:pStyle w:val="p11"/>
+              <w:spacing w:lineRule="auto" w:line="240"/>
+              <w:ind w:hanging="0" w:left="0"/>
+              <w:rPr>
+                <w:sz w:val="24"/>
+                <w:szCs w:val="24"/>
+              </w:rPr>
+            </w:pPr>
+            <w:r>
+              <w:rPr>
+                <w:sz w:val="24"/>
+                <w:szCs w:val="24"/>
+              </w:rPr>
+              <w:t>Веб-сайт має завантажуватися менш ніж за три секунди</w:t>
+            </w:r>
+          </w:p>
+        </w:tc>
+        <w:tc>
+          <w:tcPr>
+            <w:tcW w:w="1805" w:type="dxa"/>
+            <w:tcBorders>
+              <w:left w:val="single" w:sz="4" w:space="0" w:color="000000"/>
+              <w:bottom w:val="single" w:sz="4" w:space="0" w:color="000000"/>
+            </w:tcBorders>
+            <w:vAlign w:val="center"/>
+          </w:tcPr>
+          <w:p>
+            <w:pPr>
+              <w:pStyle w:val="p11"/>
+              <w:spacing w:lineRule="auto" w:line="240"/>
+              <w:ind w:hanging="0" w:left="0"/>
+              <w:rPr>
+                <w:sz w:val="24"/>
+                <w:szCs w:val="24"/>
+              </w:rPr>
+            </w:pPr>
+            <w:r>
+              <w:rPr>
+                <w:sz w:val="24"/>
+                <w:szCs w:val="24"/>
+              </w:rPr>
+              <w:t>До кінця цього кварталу</w:t>
+            </w:r>
+          </w:p>
+        </w:tc>
+        <w:tc>
+          <w:tcPr>
+            <w:tcW w:w="1805" w:type="dxa"/>
+            <w:tcBorders>
+              <w:left w:val="single" w:sz="4" w:space="0" w:color="000000"/>
+              <w:bottom w:val="single" w:sz="4" w:space="0" w:color="000000"/>
+              <w:right w:val="single" w:sz="4" w:space="0" w:color="000000"/>
+            </w:tcBorders>
+            <w:vAlign w:val="center"/>
+          </w:tcPr>
+          <w:p>
+            <w:pPr>
+              <w:pStyle w:val="p11"/>
+              <w:spacing w:lineRule="auto" w:line="240"/>
+              <w:ind w:hanging="0" w:left="0"/>
+              <w:rPr>
+                <w:sz w:val="24"/>
+                <w:szCs w:val="24"/>
+              </w:rPr>
+            </w:pPr>
+            <w:r>
+              <w:rPr>
+                <w:sz w:val="24"/>
+                <w:szCs w:val="24"/>
+              </w:rPr>
+              <w:t>Веб-сайт завантажується менше ніж за три секунди</w:t>
+            </w:r>
+          </w:p>
+        </w:tc>
+      </w:tr>
+      <w:tr>
+        <w:trPr/>
+        <w:tc>
+          <w:tcPr>
+            <w:tcW w:w="372" w:type="dxa"/>
+            <w:tcBorders>
+              <w:left w:val="single" w:sz="4" w:space="0" w:color="000000"/>
+              <w:bottom w:val="single" w:sz="4" w:space="0" w:color="000000"/>
+            </w:tcBorders>
+            <w:vAlign w:val="center"/>
+          </w:tcPr>
+          <w:p>
+            <w:pPr>
+              <w:pStyle w:val="Style16"/>
+              <w:spacing w:lineRule="auto" w:line="240"/>
+              <w:ind w:hanging="0" w:left="0"/>
+              <w:rPr>
+                <w:sz w:val="24"/>
+                <w:szCs w:val="24"/>
+              </w:rPr>
+            </w:pPr>
+            <w:r>
+              <w:rPr>
+                <w:sz w:val="24"/>
+                <w:szCs w:val="24"/>
+              </w:rPr>
+              <w:t>2</w:t>
+            </w:r>
+          </w:p>
+        </w:tc>
+        <w:tc>
+          <w:tcPr>
+            <w:tcW w:w="1672" w:type="dxa"/>
+            <w:tcBorders>
+              <w:left w:val="single" w:sz="4" w:space="0" w:color="000000"/>
+              <w:bottom w:val="single" w:sz="4" w:space="0" w:color="000000"/>
+            </w:tcBorders>
+            <w:vAlign w:val="center"/>
+          </w:tcPr>
+          <w:p>
+            <w:pPr>
+              <w:pStyle w:val="Style16"/>
+              <w:spacing w:lineRule="auto" w:line="240"/>
+              <w:ind w:hanging="0" w:left="0"/>
+              <w:rPr>
+                <w:sz w:val="24"/>
+                <w:szCs w:val="24"/>
+              </w:rPr>
+            </w:pPr>
+            <w:r>
+              <w:rPr>
+                <w:sz w:val="24"/>
+                <w:szCs w:val="24"/>
+              </w:rPr>
+              <w:t>Користувач</w:t>
+            </w:r>
+          </w:p>
+        </w:tc>
+        <w:tc>
+          <w:tcPr>
+            <w:tcW w:w="3372" w:type="dxa"/>
+            <w:tcBorders>
+              <w:left w:val="single" w:sz="4" w:space="0" w:color="000000"/>
+              <w:bottom w:val="single" w:sz="4" w:space="0" w:color="000000"/>
+            </w:tcBorders>
+            <w:vAlign w:val="center"/>
+          </w:tcPr>
+          <w:p>
+            <w:pPr>
+              <w:pStyle w:val="Style16"/>
+              <w:spacing w:lineRule="auto" w:line="240"/>
+              <w:ind w:hanging="0" w:left="0"/>
+              <w:rPr>
+                <w:sz w:val="24"/>
+                <w:szCs w:val="24"/>
+              </w:rPr>
+            </w:pPr>
+            <w:r>
+              <w:rPr>
+                <w:sz w:val="24"/>
+                <w:szCs w:val="24"/>
+              </w:rPr>
+              <w:t>Веб-сайт має працювати в 99% часу доби</w:t>
+            </w:r>
+          </w:p>
+        </w:tc>
+        <w:tc>
+          <w:tcPr>
+            <w:tcW w:w="1805" w:type="dxa"/>
+            <w:tcBorders>
+              <w:left w:val="single" w:sz="4" w:space="0" w:color="000000"/>
+              <w:bottom w:val="single" w:sz="4" w:space="0" w:color="000000"/>
+            </w:tcBorders>
+            <w:vAlign w:val="center"/>
+          </w:tcPr>
+          <w:p>
+            <w:pPr>
+              <w:pStyle w:val="Style16"/>
+              <w:spacing w:lineRule="auto" w:line="240"/>
+              <w:ind w:hanging="0" w:left="0"/>
+              <w:rPr>
+                <w:sz w:val="24"/>
+                <w:szCs w:val="24"/>
+              </w:rPr>
+            </w:pPr>
+            <w:r>
+              <w:rPr>
+                <w:sz w:val="24"/>
+                <w:szCs w:val="24"/>
+              </w:rPr>
+              <w:t>До кінця року</w:t>
+            </w:r>
+          </w:p>
+        </w:tc>
+        <w:tc>
+          <w:tcPr>
+            <w:tcW w:w="1805" w:type="dxa"/>
+            <w:tcBorders>
+              <w:left w:val="single" w:sz="4" w:space="0" w:color="000000"/>
+              <w:bottom w:val="single" w:sz="4" w:space="0" w:color="000000"/>
+              <w:right w:val="single" w:sz="4" w:space="0" w:color="000000"/>
+            </w:tcBorders>
+            <w:vAlign w:val="center"/>
+          </w:tcPr>
+          <w:p>
+            <w:pPr>
+              <w:pStyle w:val="p11"/>
+              <w:spacing w:lineRule="auto" w:line="240"/>
+              <w:ind w:hanging="0" w:left="0"/>
+              <w:rPr>
+                <w:sz w:val="24"/>
+                <w:szCs w:val="24"/>
+              </w:rPr>
+            </w:pPr>
+            <w:r>
+              <w:rPr>
+                <w:sz w:val="24"/>
+                <w:szCs w:val="24"/>
+              </w:rPr>
+              <w:t>Веб-сайт працює в 99% часу доби</w:t>
+            </w:r>
+          </w:p>
+        </w:tc>
+      </w:tr>
+      <w:tr>
+        <w:trPr/>
+        <w:tc>
+          <w:tcPr>
+            <w:tcW w:w="372" w:type="dxa"/>
+            <w:tcBorders>
+              <w:left w:val="single" w:sz="4" w:space="0" w:color="000000"/>
+              <w:bottom w:val="single" w:sz="4" w:space="0" w:color="000000"/>
+            </w:tcBorders>
+            <w:vAlign w:val="center"/>
+          </w:tcPr>
+          <w:p>
+            <w:pPr>
+              <w:pStyle w:val="Style16"/>
+              <w:spacing w:lineRule="auto" w:line="240"/>
+              <w:ind w:hanging="0" w:left="0"/>
+              <w:rPr>
+                <w:sz w:val="24"/>
+                <w:szCs w:val="24"/>
+              </w:rPr>
+            </w:pPr>
+            <w:r>
+              <w:rPr>
+                <w:sz w:val="24"/>
+                <w:szCs w:val="24"/>
+              </w:rPr>
+              <w:t>3</w:t>
+            </w:r>
+          </w:p>
+        </w:tc>
+        <w:tc>
+          <w:tcPr>
+            <w:tcW w:w="1672" w:type="dxa"/>
+            <w:tcBorders>
+              <w:left w:val="single" w:sz="4" w:space="0" w:color="000000"/>
+              <w:bottom w:val="single" w:sz="4" w:space="0" w:color="000000"/>
+            </w:tcBorders>
+            <w:vAlign w:val="center"/>
+          </w:tcPr>
+          <w:p>
+            <w:pPr>
+              <w:pStyle w:val="Style16"/>
+              <w:spacing w:lineRule="auto" w:line="240"/>
+              <w:ind w:hanging="0" w:left="0"/>
+              <w:rPr>
+                <w:sz w:val="24"/>
+                <w:szCs w:val="24"/>
+              </w:rPr>
+            </w:pPr>
+            <w:r>
+              <w:rPr>
+                <w:sz w:val="24"/>
+                <w:szCs w:val="24"/>
+              </w:rPr>
+              <w:t>Користувач</w:t>
+            </w:r>
+          </w:p>
+        </w:tc>
+        <w:tc>
+          <w:tcPr>
+            <w:tcW w:w="3372" w:type="dxa"/>
+            <w:tcBorders>
+              <w:left w:val="single" w:sz="4" w:space="0" w:color="000000"/>
+              <w:bottom w:val="single" w:sz="4" w:space="0" w:color="000000"/>
+            </w:tcBorders>
+            <w:vAlign w:val="center"/>
+          </w:tcPr>
+          <w:p>
+            <w:pPr>
+              <w:pStyle w:val="Style16"/>
+              <w:spacing w:lineRule="auto" w:line="240"/>
+              <w:ind w:hanging="0" w:left="0"/>
+              <w:rPr>
+                <w:sz w:val="24"/>
+                <w:szCs w:val="24"/>
+              </w:rPr>
+            </w:pPr>
+            <w:r>
+              <w:rPr>
+                <w:sz w:val="24"/>
+                <w:szCs w:val="24"/>
+              </w:rPr>
+              <w:t>Соціальні мережі мають бути такими, що легко знаходяться у пошуку мережі</w:t>
+            </w:r>
+          </w:p>
+        </w:tc>
+        <w:tc>
+          <w:tcPr>
+            <w:tcW w:w="1805" w:type="dxa"/>
+            <w:tcBorders>
+              <w:left w:val="single" w:sz="4" w:space="0" w:color="000000"/>
+              <w:bottom w:val="single" w:sz="4" w:space="0" w:color="000000"/>
+            </w:tcBorders>
+            <w:vAlign w:val="center"/>
+          </w:tcPr>
+          <w:p>
+            <w:pPr>
+              <w:pStyle w:val="Style16"/>
+              <w:spacing w:lineRule="auto" w:line="240"/>
+              <w:ind w:hanging="0" w:left="0"/>
+              <w:rPr>
+                <w:sz w:val="24"/>
+                <w:szCs w:val="24"/>
+              </w:rPr>
+            </w:pPr>
+            <w:r>
+              <w:rPr>
+                <w:sz w:val="24"/>
+                <w:szCs w:val="24"/>
+              </w:rPr>
+              <w:t>До кінця кварталу</w:t>
+            </w:r>
+          </w:p>
+        </w:tc>
+        <w:tc>
+          <w:tcPr>
+            <w:tcW w:w="1805" w:type="dxa"/>
+            <w:tcBorders>
+              <w:left w:val="single" w:sz="4" w:space="0" w:color="000000"/>
+              <w:bottom w:val="single" w:sz="4" w:space="0" w:color="000000"/>
+              <w:right w:val="single" w:sz="4" w:space="0" w:color="000000"/>
+            </w:tcBorders>
+            <w:vAlign w:val="center"/>
+          </w:tcPr>
+          <w:p>
+            <w:pPr>
+              <w:pStyle w:val="p11"/>
+              <w:spacing w:lineRule="auto" w:line="240"/>
+              <w:ind w:hanging="0" w:left="0"/>
+              <w:rPr>
+                <w:sz w:val="24"/>
+                <w:szCs w:val="24"/>
+              </w:rPr>
+            </w:pPr>
+            <w:r>
+              <w:rPr>
+                <w:sz w:val="24"/>
+                <w:szCs w:val="24"/>
+              </w:rPr>
+              <w:t>Сторінки в соціальних мережах знаходяться менше ніж за 5 секунд</w:t>
+            </w:r>
+          </w:p>
+        </w:tc>
+      </w:tr>
+      <w:tr>
+        <w:trPr/>
+        <w:tc>
+          <w:tcPr>
+            <w:tcW w:w="372" w:type="dxa"/>
+            <w:tcBorders>
+              <w:left w:val="single" w:sz="4" w:space="0" w:color="000000"/>
+              <w:bottom w:val="single" w:sz="4" w:space="0" w:color="000000"/>
+            </w:tcBorders>
+            <w:vAlign w:val="center"/>
+          </w:tcPr>
+          <w:p>
+            <w:pPr>
+              <w:pStyle w:val="Style16"/>
+              <w:spacing w:lineRule="auto" w:line="240"/>
+              <w:ind w:hanging="0" w:left="0"/>
+              <w:rPr>
+                <w:sz w:val="24"/>
+                <w:szCs w:val="24"/>
+              </w:rPr>
+            </w:pPr>
+            <w:r>
+              <w:rPr>
+                <w:sz w:val="24"/>
+                <w:szCs w:val="24"/>
+              </w:rPr>
+              <w:t>4</w:t>
+            </w:r>
+          </w:p>
+        </w:tc>
+        <w:tc>
+          <w:tcPr>
+            <w:tcW w:w="1672" w:type="dxa"/>
+            <w:tcBorders>
+              <w:left w:val="single" w:sz="4" w:space="0" w:color="000000"/>
+              <w:bottom w:val="single" w:sz="4" w:space="0" w:color="000000"/>
+            </w:tcBorders>
+            <w:vAlign w:val="center"/>
+          </w:tcPr>
+          <w:p>
+            <w:pPr>
+              <w:pStyle w:val="Style16"/>
+              <w:spacing w:lineRule="auto" w:line="240"/>
+              <w:ind w:hanging="0" w:left="0"/>
+              <w:rPr>
+                <w:sz w:val="24"/>
+                <w:szCs w:val="24"/>
+              </w:rPr>
+            </w:pPr>
+            <w:r>
+              <w:rPr>
+                <w:sz w:val="24"/>
+                <w:szCs w:val="24"/>
+              </w:rPr>
+              <w:t>Користувач</w:t>
+            </w:r>
+          </w:p>
+        </w:tc>
+        <w:tc>
+          <w:tcPr>
+            <w:tcW w:w="3372" w:type="dxa"/>
+            <w:tcBorders>
+              <w:left w:val="single" w:sz="4" w:space="0" w:color="000000"/>
+              <w:bottom w:val="single" w:sz="4" w:space="0" w:color="000000"/>
+            </w:tcBorders>
+            <w:vAlign w:val="center"/>
+          </w:tcPr>
+          <w:p>
+            <w:pPr>
+              <w:pStyle w:val="Style16"/>
+              <w:spacing w:lineRule="auto" w:line="240"/>
+              <w:ind w:hanging="0" w:left="0"/>
+              <w:rPr>
+                <w:sz w:val="24"/>
+                <w:szCs w:val="24"/>
+              </w:rPr>
+            </w:pPr>
+            <w:r>
+              <w:rPr>
+                <w:sz w:val="24"/>
+                <w:szCs w:val="24"/>
+              </w:rPr>
+              <w:t>Соціальні мережі повинні містити картинки разом з текстом новини</w:t>
+            </w:r>
+          </w:p>
+        </w:tc>
+        <w:tc>
+          <w:tcPr>
+            <w:tcW w:w="1805" w:type="dxa"/>
+            <w:tcBorders>
+              <w:left w:val="single" w:sz="4" w:space="0" w:color="000000"/>
+              <w:bottom w:val="single" w:sz="4" w:space="0" w:color="000000"/>
+            </w:tcBorders>
+            <w:vAlign w:val="center"/>
+          </w:tcPr>
+          <w:p>
+            <w:pPr>
+              <w:pStyle w:val="Style16"/>
+              <w:spacing w:lineRule="auto" w:line="240"/>
+              <w:ind w:hanging="0" w:left="0"/>
+              <w:rPr>
+                <w:sz w:val="24"/>
+                <w:szCs w:val="24"/>
+              </w:rPr>
+            </w:pPr>
+            <w:r>
+              <w:rPr>
+                <w:sz w:val="24"/>
+                <w:szCs w:val="24"/>
+              </w:rPr>
+              <w:t>До кінця тижня</w:t>
+            </w:r>
+          </w:p>
+        </w:tc>
+        <w:tc>
+          <w:tcPr>
+            <w:tcW w:w="1805" w:type="dxa"/>
+            <w:tcBorders>
+              <w:left w:val="single" w:sz="4" w:space="0" w:color="000000"/>
+              <w:bottom w:val="single" w:sz="4" w:space="0" w:color="000000"/>
+              <w:right w:val="single" w:sz="4" w:space="0" w:color="000000"/>
+            </w:tcBorders>
+            <w:vAlign w:val="center"/>
+          </w:tcPr>
+          <w:p>
+            <w:pPr>
+              <w:pStyle w:val="p11"/>
+              <w:spacing w:lineRule="auto" w:line="240"/>
+              <w:ind w:hanging="0" w:left="0"/>
+              <w:rPr>
+                <w:sz w:val="24"/>
+                <w:szCs w:val="24"/>
+              </w:rPr>
+            </w:pPr>
+            <w:r>
+              <w:rPr>
+                <w:sz w:val="24"/>
+                <w:szCs w:val="24"/>
+              </w:rPr>
+              <w:t>Всі пости в соціальних мережах містять картинки</w:t>
+            </w:r>
+          </w:p>
+        </w:tc>
+      </w:tr>
+      <w:tr>
+        <w:trPr/>
+        <w:tc>
+          <w:tcPr>
+            <w:tcW w:w="372" w:type="dxa"/>
+            <w:tcBorders>
+              <w:left w:val="single" w:sz="4" w:space="0" w:color="000000"/>
+              <w:bottom w:val="single" w:sz="4" w:space="0" w:color="000000"/>
+            </w:tcBorders>
+            <w:vAlign w:val="center"/>
+          </w:tcPr>
+          <w:p>
+            <w:pPr>
+              <w:pStyle w:val="Style16"/>
+              <w:spacing w:lineRule="auto" w:line="240"/>
+              <w:ind w:hanging="0" w:left="0"/>
+              <w:rPr>
+                <w:sz w:val="24"/>
+                <w:szCs w:val="24"/>
+              </w:rPr>
+            </w:pPr>
+            <w:r>
+              <w:rPr>
+                <w:sz w:val="24"/>
+                <w:szCs w:val="24"/>
+              </w:rPr>
+              <w:t>5</w:t>
+            </w:r>
+          </w:p>
+        </w:tc>
+        <w:tc>
+          <w:tcPr>
+            <w:tcW w:w="1672" w:type="dxa"/>
+            <w:tcBorders>
+              <w:left w:val="single" w:sz="4" w:space="0" w:color="000000"/>
+              <w:bottom w:val="single" w:sz="4" w:space="0" w:color="000000"/>
+            </w:tcBorders>
+            <w:vAlign w:val="center"/>
+          </w:tcPr>
+          <w:p>
+            <w:pPr>
+              <w:pStyle w:val="Style16"/>
+              <w:spacing w:lineRule="auto" w:line="240"/>
+              <w:ind w:hanging="0" w:left="0"/>
+              <w:rPr>
+                <w:sz w:val="24"/>
+                <w:szCs w:val="24"/>
+              </w:rPr>
+            </w:pPr>
+            <w:r>
+              <w:rPr>
+                <w:sz w:val="24"/>
+                <w:szCs w:val="24"/>
+              </w:rPr>
+              <w:t>Рекламодавець</w:t>
+            </w:r>
+          </w:p>
+        </w:tc>
+        <w:tc>
+          <w:tcPr>
+            <w:tcW w:w="3372" w:type="dxa"/>
+            <w:tcBorders>
+              <w:left w:val="single" w:sz="4" w:space="0" w:color="000000"/>
+              <w:bottom w:val="single" w:sz="4" w:space="0" w:color="000000"/>
+            </w:tcBorders>
+            <w:vAlign w:val="center"/>
+          </w:tcPr>
+          <w:p>
+            <w:pPr>
+              <w:pStyle w:val="Style16"/>
+              <w:spacing w:lineRule="auto" w:line="240"/>
+              <w:ind w:hanging="0" w:left="0"/>
+              <w:rPr>
+                <w:sz w:val="24"/>
+                <w:szCs w:val="24"/>
+              </w:rPr>
+            </w:pPr>
+            <w:r>
+              <w:rPr>
+                <w:sz w:val="24"/>
+                <w:szCs w:val="24"/>
+              </w:rPr>
+              <w:t>Система CMS має містити форми для додавання новин до бази даних у зручному місці</w:t>
+            </w:r>
+          </w:p>
+        </w:tc>
+        <w:tc>
+          <w:tcPr>
+            <w:tcW w:w="1805" w:type="dxa"/>
+            <w:tcBorders>
+              <w:left w:val="single" w:sz="4" w:space="0" w:color="000000"/>
+              <w:bottom w:val="single" w:sz="4" w:space="0" w:color="000000"/>
+            </w:tcBorders>
+            <w:vAlign w:val="center"/>
+          </w:tcPr>
+          <w:p>
+            <w:pPr>
+              <w:pStyle w:val="Style16"/>
+              <w:spacing w:lineRule="auto" w:line="240"/>
+              <w:ind w:hanging="0" w:left="0"/>
+              <w:rPr>
+                <w:sz w:val="24"/>
+                <w:szCs w:val="24"/>
+              </w:rPr>
+            </w:pPr>
+            <w:r>
+              <w:rPr>
+                <w:sz w:val="24"/>
+                <w:szCs w:val="24"/>
+              </w:rPr>
+              <w:t>До кінця кварталу</w:t>
+            </w:r>
+          </w:p>
+        </w:tc>
+        <w:tc>
+          <w:tcPr>
+            <w:tcW w:w="1805" w:type="dxa"/>
+            <w:tcBorders>
+              <w:left w:val="single" w:sz="4" w:space="0" w:color="000000"/>
+              <w:bottom w:val="single" w:sz="4" w:space="0" w:color="000000"/>
+              <w:right w:val="single" w:sz="4" w:space="0" w:color="000000"/>
+            </w:tcBorders>
+            <w:vAlign w:val="center"/>
+          </w:tcPr>
+          <w:p>
+            <w:pPr>
+              <w:pStyle w:val="p11"/>
+              <w:spacing w:lineRule="auto" w:line="240"/>
+              <w:ind w:hanging="0" w:left="0"/>
+              <w:rPr>
+                <w:sz w:val="24"/>
+                <w:szCs w:val="24"/>
+              </w:rPr>
+            </w:pPr>
+            <w:r>
+              <w:rPr>
+                <w:sz w:val="24"/>
+                <w:szCs w:val="24"/>
+              </w:rPr>
+              <w:t>Система містить форми додавання новин у зручно розташованому місці</w:t>
+            </w:r>
+          </w:p>
+        </w:tc>
+      </w:tr>
+      <w:tr>
+        <w:trPr/>
+        <w:tc>
+          <w:tcPr>
+            <w:tcW w:w="372" w:type="dxa"/>
+            <w:tcBorders>
+              <w:left w:val="single" w:sz="4" w:space="0" w:color="000000"/>
+              <w:bottom w:val="single" w:sz="4" w:space="0" w:color="000000"/>
+            </w:tcBorders>
+            <w:vAlign w:val="center"/>
+          </w:tcPr>
+          <w:p>
+            <w:pPr>
+              <w:pStyle w:val="Style16"/>
+              <w:spacing w:lineRule="auto" w:line="240"/>
+              <w:ind w:hanging="0" w:left="0"/>
+              <w:rPr>
+                <w:sz w:val="24"/>
+                <w:szCs w:val="24"/>
+              </w:rPr>
+            </w:pPr>
+            <w:r>
+              <w:rPr>
+                <w:sz w:val="24"/>
+                <w:szCs w:val="24"/>
+              </w:rPr>
+              <w:t>6</w:t>
+            </w:r>
+          </w:p>
+        </w:tc>
+        <w:tc>
+          <w:tcPr>
+            <w:tcW w:w="1672" w:type="dxa"/>
+            <w:tcBorders>
+              <w:left w:val="single" w:sz="4" w:space="0" w:color="000000"/>
+              <w:bottom w:val="single" w:sz="4" w:space="0" w:color="000000"/>
+            </w:tcBorders>
+            <w:vAlign w:val="center"/>
+          </w:tcPr>
+          <w:p>
+            <w:pPr>
+              <w:pStyle w:val="Style16"/>
+              <w:spacing w:lineRule="auto" w:line="240"/>
+              <w:ind w:hanging="0" w:left="0"/>
+              <w:rPr>
+                <w:sz w:val="24"/>
+                <w:szCs w:val="24"/>
+              </w:rPr>
+            </w:pPr>
+            <w:r>
+              <w:rPr>
+                <w:sz w:val="24"/>
+                <w:szCs w:val="24"/>
+              </w:rPr>
+              <w:t>Адміністратор</w:t>
+            </w:r>
+          </w:p>
+        </w:tc>
+        <w:tc>
+          <w:tcPr>
+            <w:tcW w:w="3372" w:type="dxa"/>
+            <w:tcBorders>
+              <w:left w:val="single" w:sz="4" w:space="0" w:color="000000"/>
+              <w:bottom w:val="single" w:sz="4" w:space="0" w:color="000000"/>
+            </w:tcBorders>
+            <w:vAlign w:val="center"/>
+          </w:tcPr>
+          <w:p>
+            <w:pPr>
+              <w:pStyle w:val="Style16"/>
+              <w:spacing w:lineRule="auto" w:line="240"/>
+              <w:ind w:hanging="0" w:left="0"/>
+              <w:rPr>
+                <w:sz w:val="24"/>
+                <w:szCs w:val="24"/>
+              </w:rPr>
+            </w:pPr>
+            <w:r>
+              <w:rPr>
+                <w:sz w:val="24"/>
+                <w:szCs w:val="24"/>
+              </w:rPr>
+              <w:t>Платформа менеджменту контенту повинна містити статистику переглядів як сайту, так і соціальних мереж</w:t>
+            </w:r>
+          </w:p>
+        </w:tc>
+        <w:tc>
+          <w:tcPr>
+            <w:tcW w:w="1805" w:type="dxa"/>
+            <w:tcBorders>
+              <w:left w:val="single" w:sz="4" w:space="0" w:color="000000"/>
+              <w:bottom w:val="single" w:sz="4" w:space="0" w:color="000000"/>
+            </w:tcBorders>
+            <w:vAlign w:val="center"/>
+          </w:tcPr>
+          <w:p>
+            <w:pPr>
+              <w:pStyle w:val="Style16"/>
+              <w:spacing w:lineRule="auto" w:line="240"/>
+              <w:ind w:hanging="0" w:left="0"/>
+              <w:rPr>
+                <w:sz w:val="24"/>
+                <w:szCs w:val="24"/>
+              </w:rPr>
+            </w:pPr>
+            <w:r>
+              <w:rPr>
+                <w:sz w:val="24"/>
+                <w:szCs w:val="24"/>
+              </w:rPr>
+              <w:t>До кінця року</w:t>
+            </w:r>
+          </w:p>
+        </w:tc>
+        <w:tc>
+          <w:tcPr>
+            <w:tcW w:w="1805" w:type="dxa"/>
+            <w:tcBorders>
+              <w:left w:val="single" w:sz="4" w:space="0" w:color="000000"/>
+              <w:bottom w:val="single" w:sz="4" w:space="0" w:color="000000"/>
+              <w:right w:val="single" w:sz="4" w:space="0" w:color="000000"/>
+            </w:tcBorders>
+            <w:vAlign w:val="center"/>
+          </w:tcPr>
+          <w:p>
+            <w:pPr>
+              <w:pStyle w:val="p11"/>
+              <w:spacing w:lineRule="auto" w:line="240"/>
+              <w:ind w:hanging="0" w:left="0"/>
+              <w:rPr>
+                <w:sz w:val="24"/>
+                <w:szCs w:val="24"/>
+              </w:rPr>
+            </w:pPr>
+            <w:r>
+              <w:rPr>
+                <w:sz w:val="24"/>
+                <w:szCs w:val="24"/>
+              </w:rPr>
+              <w:t>Платформа містить статистику переглядів сайту та соціальних мереж</w:t>
+            </w:r>
+          </w:p>
+        </w:tc>
+      </w:tr>
+    </w:tbl>
+    <w:p>
+      <w:pPr>
+        <w:pStyle w:val="p11"/>
+        <w:rPr/>
+      </w:pPr>
+      <w:r>
+        <w:rPr/>
+        <w:tab/>
+      </w:r>
+    </w:p>
+    <w:p>
+      <w:pPr>
+        <w:pStyle w:val="p11"/>
+        <w:rPr>
+          <w:lang w:val="uk-UA"/>
+        </w:rPr>
+      </w:pPr>
+      <w:r>
+        <w:rPr>
+          <w:lang w:val="uk-UA"/>
+        </w:rPr>
+      </w:r>
+    </w:p>
+    <w:p>
+      <w:pPr>
+        <w:pStyle w:val="H2"/>
+        <w:rPr/>
+      </w:pPr>
+      <w:r>
+        <w:rPr/>
+        <w:t>Настанова з якості</w:t>
+      </w:r>
+    </w:p>
+    <w:p>
+      <w:pPr>
+        <w:pStyle w:val="p11"/>
+        <w:rPr>
+          <w:lang w:val="uk-UA"/>
+        </w:rPr>
+      </w:pPr>
+      <w:r>
+        <w:rPr>
+          <w:lang w:val="uk-UA"/>
+        </w:rPr>
+      </w:r>
+    </w:p>
+    <w:p>
+      <w:pPr>
+        <w:pStyle w:val="p11"/>
+        <w:rPr>
+          <w:lang w:val="uk-UA"/>
+        </w:rPr>
+      </w:pPr>
+      <w:r>
+        <w:rPr>
+          <w:lang w:val="uk-UA"/>
+        </w:rPr>
+        <w:t>яку запропоновано побудувати на основі наступних розділів:</w:t>
       </w:r>
     </w:p>
     <w:p>
@@ -1422,6 +2737,19 @@
           <w:lang w:val="uk-UA"/>
         </w:rPr>
         <w:t>що містять відповіді на контрольні запитання, а також відображають результати виконання роботи та їх критичний аналіз</w:t>
+      </w:r>
+    </w:p>
+    <w:p>
+      <w:pPr>
+        <w:pStyle w:val="p11"/>
+        <w:rPr>
+          <w:lang w:val="uk-UA"/>
+        </w:rPr>
+      </w:pPr>
+      <w:r>
+        <w:rPr>
+          <w:lang w:val="uk-UA"/>
+        </w:rPr>
       </w:r>
     </w:p>
     <w:p>
@@ -3000,6 +4328,16 @@
     </w:pPr>
     <w:rPr/>
   </w:style>
+  <w:style w:type="paragraph" w:styleId="Style16">
+    <w:name w:val="Вміст таблиці"/>
+    <w:basedOn w:val="Normal"/>
+    <w:qFormat/>
+    <w:pPr>
+      <w:widowControl w:val="false"/>
+      <w:suppressLineNumbers/>
+    </w:pPr>
+    <w:rPr/>
+  </w:style>
   <w:style w:type="numbering" w:styleId="user2" w:default="1">
     <w:name w:val="Без маркерів (user)"/>
     <w:uiPriority w:val="99"/>

</xml_diff>

<commit_message>
feat: SP1 report done, pending questions
</commit_message>
<xml_diff>
--- a/51SP Sertyficazija PZ/1/SP_KNT-116m_Onyshchenko_15_PR1.docx
+++ b/51SP Sertyficazija PZ/1/SP_KNT-116m_Onyshchenko_15_PR1.docx
@@ -1180,7 +1180,7 @@
         <w:rPr>
           <w:lang w:val="uk-UA"/>
         </w:rPr>
-        <w:t xml:space="preserve">    └── </w:t>
+        <w:t xml:space="preserve">      └── </w:t>
       </w:r>
       <w:r>
         <w:rPr>
@@ -2529,19 +2529,6 @@
     </w:p>
     <w:p>
       <w:pPr>
-        <w:pStyle w:val="p11"/>
-        <w:rPr>
-          <w:lang w:val="uk-UA"/>
-        </w:rPr>
-      </w:pPr>
-      <w:r>
-        <w:rPr>
-          <w:lang w:val="uk-UA"/>
-        </w:rPr>
-      </w:r>
-    </w:p>
-    <w:p>
-      <w:pPr>
         <w:pStyle w:val="H2"/>
         <w:rPr/>
       </w:pPr>
@@ -2552,141 +2539,694 @@
     </w:p>
     <w:p>
       <w:pPr>
-        <w:pStyle w:val="p11"/>
-        <w:rPr>
-          <w:lang w:val="uk-UA"/>
-        </w:rPr>
-      </w:pPr>
-      <w:r>
-        <w:rPr>
-          <w:lang w:val="uk-UA"/>
-        </w:rPr>
-      </w:r>
-    </w:p>
-    <w:p>
-      <w:pPr>
-        <w:pStyle w:val="p11"/>
-        <w:rPr>
-          <w:lang w:val="uk-UA"/>
-        </w:rPr>
-      </w:pPr>
-      <w:r>
-        <w:rPr>
-          <w:lang w:val="uk-UA"/>
-        </w:rPr>
-        <w:t>яку запропоновано побудувати на основі наступних розділів:</w:t>
-      </w:r>
-    </w:p>
-    <w:p>
-      <w:pPr>
-        <w:pStyle w:val="p11"/>
-        <w:rPr>
-          <w:lang w:val="uk-UA"/>
-        </w:rPr>
-      </w:pPr>
-      <w:r>
-        <w:rPr>
-          <w:lang w:val="uk-UA"/>
-        </w:rPr>
-        <w:t>- сфера застосування;</w:t>
-      </w:r>
-    </w:p>
-    <w:p>
-      <w:pPr>
-        <w:pStyle w:val="p11"/>
-        <w:rPr>
-          <w:lang w:val="uk-UA"/>
-        </w:rPr>
-      </w:pPr>
-      <w:r>
-        <w:rPr>
-          <w:lang w:val="uk-UA"/>
-        </w:rPr>
-        <w:t>- характеристика діяльності;</w:t>
-      </w:r>
-    </w:p>
-    <w:p>
-      <w:pPr>
-        <w:pStyle w:val="p11"/>
-        <w:rPr>
-          <w:lang w:val="uk-UA"/>
-        </w:rPr>
-      </w:pPr>
-      <w:r>
-        <w:rPr>
-          <w:lang w:val="uk-UA"/>
-        </w:rPr>
-        <w:t>- терміни та визначення понять;</w:t>
-      </w:r>
-    </w:p>
-    <w:p>
-      <w:pPr>
-        <w:pStyle w:val="p11"/>
-        <w:rPr>
-          <w:lang w:val="uk-UA"/>
-        </w:rPr>
-      </w:pPr>
-      <w:r>
-        <w:rPr>
-          <w:lang w:val="uk-UA"/>
-        </w:rPr>
-        <w:t>- система управління якістю;</w:t>
-      </w:r>
-    </w:p>
-    <w:p>
-      <w:pPr>
-        <w:pStyle w:val="p11"/>
-        <w:rPr>
-          <w:lang w:val="uk-UA"/>
-        </w:rPr>
-      </w:pPr>
-      <w:r>
-        <w:rPr>
-          <w:lang w:val="uk-UA"/>
-        </w:rPr>
-        <w:t>- відповідальність керівництва;</w:t>
-      </w:r>
-    </w:p>
-    <w:p>
-      <w:pPr>
-        <w:pStyle w:val="p11"/>
-        <w:rPr>
-          <w:lang w:val="uk-UA"/>
-        </w:rPr>
-      </w:pPr>
-      <w:r>
-        <w:rPr>
-          <w:lang w:val="uk-UA"/>
-        </w:rPr>
-        <w:t>- керування ресурсами;</w:t>
-      </w:r>
-    </w:p>
-    <w:p>
-      <w:pPr>
-        <w:pStyle w:val="p11"/>
-        <w:rPr>
-          <w:lang w:val="uk-UA"/>
-        </w:rPr>
-      </w:pPr>
-      <w:r>
-        <w:rPr>
-          <w:lang w:val="uk-UA"/>
-        </w:rPr>
-        <w:t>- виготовлення продукції;</w:t>
-      </w:r>
-    </w:p>
-    <w:p>
-      <w:pPr>
-        <w:pStyle w:val="p11"/>
-        <w:rPr>
-          <w:lang w:val="uk-UA"/>
-        </w:rPr>
-      </w:pPr>
-      <w:r>
-        <w:rPr>
-          <w:lang w:val="uk-UA"/>
-        </w:rPr>
-        <w:t>- вимірювання, аналізування та поліпшування.</w:t>
+        <w:pStyle w:val="H3"/>
+        <w:spacing w:before="0" w:after="0"/>
+        <w:rPr/>
+      </w:pPr>
+      <w:r>
+        <w:rPr>
+          <w:lang w:val="uk-UA"/>
+        </w:rPr>
+        <w:t>С</w:t>
+      </w:r>
+      <w:r>
+        <w:rPr/>
+        <w:t>фера застосування</w:t>
+      </w:r>
+    </w:p>
+    <w:p>
+      <w:pPr>
+        <w:pStyle w:val="P1"/>
+        <w:spacing w:before="0" w:after="0"/>
+        <w:rPr/>
+      </w:pPr>
+      <w:r>
+        <w:rPr/>
+      </w:r>
+    </w:p>
+    <w:p>
+      <w:pPr>
+        <w:pStyle w:val="P1"/>
+        <w:spacing w:before="0" w:after="0"/>
+        <w:rPr>
+          <w:lang w:val="uk-UA"/>
+        </w:rPr>
+      </w:pPr>
+      <w:r>
+        <w:rPr>
+          <w:lang w:val="uk-UA"/>
+        </w:rPr>
+        <w:t xml:space="preserve">Компанія займається виготовленням та поширенням новин на своєму веб-сайті та сторінках у соціальних мережах. </w:t>
+      </w:r>
+    </w:p>
+    <w:p>
+      <w:pPr>
+        <w:pStyle w:val="P1"/>
+        <w:spacing w:before="0" w:after="0"/>
+        <w:rPr>
+          <w:lang w:val="uk-UA"/>
+        </w:rPr>
+      </w:pPr>
+      <w:r>
+        <w:rPr>
+          <w:lang w:val="uk-UA"/>
+        </w:rPr>
+      </w:r>
+    </w:p>
+    <w:p>
+      <w:pPr>
+        <w:pStyle w:val="H3"/>
+        <w:spacing w:before="0" w:after="0"/>
+        <w:rPr/>
+      </w:pPr>
+      <w:r>
+        <w:rPr/>
+        <w:t>Х</w:t>
+      </w:r>
+      <w:r>
+        <w:rPr/>
+        <w:t>арактеристика діяльності</w:t>
+      </w:r>
+    </w:p>
+    <w:p>
+      <w:pPr>
+        <w:pStyle w:val="P1"/>
+        <w:spacing w:before="0" w:after="0"/>
+        <w:rPr/>
+      </w:pPr>
+      <w:r>
+        <w:rPr/>
+      </w:r>
+    </w:p>
+    <w:p>
+      <w:pPr>
+        <w:pStyle w:val="P1"/>
+        <w:spacing w:before="0" w:after="0"/>
+        <w:rPr/>
+      </w:pPr>
+      <w:r>
+        <w:rPr/>
+        <w:t xml:space="preserve">Діяльність компанії полягає в пошуку, фільтрації та поширенні новин. </w:t>
+      </w:r>
+    </w:p>
+    <w:p>
+      <w:pPr>
+        <w:pStyle w:val="P1"/>
+        <w:spacing w:before="0" w:after="0"/>
+        <w:rPr/>
+      </w:pPr>
+      <w:r>
+        <w:rPr/>
+      </w:r>
+    </w:p>
+    <w:p>
+      <w:pPr>
+        <w:pStyle w:val="H3"/>
+        <w:spacing w:before="0" w:after="0"/>
+        <w:rPr/>
+      </w:pPr>
+      <w:r>
+        <w:rPr/>
+        <w:t>Т</w:t>
+      </w:r>
+      <w:r>
+        <w:rPr/>
+        <w:t>ерміни та визначення понять</w:t>
+      </w:r>
+    </w:p>
+    <w:p>
+      <w:pPr>
+        <w:pStyle w:val="P1"/>
+        <w:spacing w:before="0" w:after="0"/>
+        <w:rPr/>
+      </w:pPr>
+      <w:r>
+        <w:rPr/>
+      </w:r>
+    </w:p>
+    <w:p>
+      <w:pPr>
+        <w:pStyle w:val="P1"/>
+        <w:spacing w:before="0" w:after="0"/>
+        <w:rPr/>
+      </w:pPr>
+      <w:r>
+        <w:rPr/>
+        <w:t>Новина — стислий виклад якоїсь актуальної інформації, яка сталася нещодавно.</w:t>
+      </w:r>
+    </w:p>
+    <w:p>
+      <w:pPr>
+        <w:pStyle w:val="P1"/>
+        <w:spacing w:before="0" w:after="0"/>
+        <w:rPr/>
+      </w:pPr>
+      <w:r>
+        <w:rPr/>
+        <w:t>Якість — ступінь, до якого сукупність власних характеристик об’єкта задовольняє вимоги.</w:t>
+      </w:r>
+    </w:p>
+    <w:p>
+      <w:pPr>
+        <w:pStyle w:val="P1"/>
+        <w:spacing w:before="0" w:after="0"/>
+        <w:rPr/>
+      </w:pPr>
+      <w:r>
+        <w:rPr/>
+        <w:t>Медіа — канали та інструменти для зберігання, передавання та подачі інформації чи даних.</w:t>
+      </w:r>
+    </w:p>
+    <w:p>
+      <w:pPr>
+        <w:pStyle w:val="P1"/>
+        <w:spacing w:before="0" w:after="0"/>
+        <w:rPr/>
+      </w:pPr>
+      <w:r>
+        <w:rPr/>
+      </w:r>
+    </w:p>
+    <w:p>
+      <w:pPr>
+        <w:pStyle w:val="H3"/>
+        <w:spacing w:before="0" w:after="0"/>
+        <w:rPr/>
+      </w:pPr>
+      <w:r>
+        <w:rPr/>
+        <w:t>С</w:t>
+      </w:r>
+      <w:r>
+        <w:rPr/>
+        <w:t>истема управління якістю</w:t>
+      </w:r>
+    </w:p>
+    <w:p>
+      <w:pPr>
+        <w:pStyle w:val="P1"/>
+        <w:spacing w:before="0" w:after="0"/>
+        <w:rPr/>
+      </w:pPr>
+      <w:r>
+        <w:rPr/>
+      </w:r>
+    </w:p>
+    <w:p>
+      <w:pPr>
+        <w:pStyle w:val="P1"/>
+        <w:spacing w:before="0" w:after="0"/>
+        <w:rPr/>
+      </w:pPr>
+      <w:r>
+        <w:rPr/>
+        <w:t xml:space="preserve">Система управління якістю відповідає вимогам ДСТУ </w:t>
+      </w:r>
+      <w:r>
+        <w:rPr>
+          <w:lang w:val="en-US"/>
+        </w:rPr>
+        <w:t xml:space="preserve">ISO 9001 </w:t>
+      </w:r>
+      <w:r>
+        <w:rPr>
+          <w:lang w:val="uk-UA"/>
+        </w:rPr>
+        <w:t>та орієнтована на клієнта.</w:t>
+      </w:r>
+    </w:p>
+    <w:p>
+      <w:pPr>
+        <w:pStyle w:val="P1"/>
+        <w:spacing w:before="0" w:after="0"/>
+        <w:rPr>
+          <w:lang w:val="uk-UA"/>
+        </w:rPr>
+      </w:pPr>
+      <w:r>
+        <w:rPr>
+          <w:lang w:val="uk-UA"/>
+        </w:rPr>
+        <w:t>Вона поділяється на чотири процеси:</w:t>
+      </w:r>
+    </w:p>
+    <w:p>
+      <w:pPr>
+        <w:pStyle w:val="P1"/>
+        <w:spacing w:before="0" w:after="0"/>
+        <w:rPr>
+          <w:lang w:val="uk-UA"/>
+        </w:rPr>
+      </w:pPr>
+      <w:r>
+        <w:rPr>
+          <w:lang w:val="uk-UA"/>
+        </w:rPr>
+        <w:t>1. Редакційний: новини збираються та перевіряються;</w:t>
+      </w:r>
+    </w:p>
+    <w:p>
+      <w:pPr>
+        <w:pStyle w:val="P1"/>
+        <w:spacing w:before="0" w:after="0"/>
+        <w:rPr>
+          <w:lang w:val="uk-UA"/>
+        </w:rPr>
+      </w:pPr>
+      <w:r>
+        <w:rPr>
+          <w:lang w:val="uk-UA"/>
+        </w:rPr>
+        <w:t xml:space="preserve">2. Технологічний: новини публікуються на сайті через </w:t>
+      </w:r>
+      <w:r>
+        <w:rPr>
+          <w:lang w:val="en-US"/>
+        </w:rPr>
+        <w:t>CMS</w:t>
+      </w:r>
+      <w:r>
+        <w:rPr>
+          <w:lang w:val="uk-UA"/>
+        </w:rPr>
+        <w:t>;</w:t>
+      </w:r>
+    </w:p>
+    <w:p>
+      <w:pPr>
+        <w:pStyle w:val="P1"/>
+        <w:spacing w:before="0" w:after="0"/>
+        <w:rPr>
+          <w:lang w:val="uk-UA"/>
+        </w:rPr>
+      </w:pPr>
+      <w:r>
+        <w:rPr>
+          <w:lang w:val="uk-UA"/>
+        </w:rPr>
+        <w:t>3. Комерційний: новини просуваються та публікується реклама;</w:t>
+      </w:r>
+    </w:p>
+    <w:p>
+      <w:pPr>
+        <w:pStyle w:val="P1"/>
+        <w:spacing w:before="0" w:after="0"/>
+        <w:rPr>
+          <w:lang w:val="uk-UA"/>
+        </w:rPr>
+      </w:pPr>
+      <w:r>
+        <w:rPr>
+          <w:lang w:val="uk-UA"/>
+        </w:rPr>
+        <w:t>4. Управлінський: процеси документуються та корегуються.</w:t>
+      </w:r>
+    </w:p>
+    <w:p>
+      <w:pPr>
+        <w:pStyle w:val="P1"/>
+        <w:spacing w:before="0" w:after="0"/>
+        <w:rPr>
+          <w:lang w:val="uk-UA"/>
+        </w:rPr>
+      </w:pPr>
+      <w:r>
+        <w:rPr>
+          <w:lang w:val="uk-UA"/>
+        </w:rPr>
+        <w:t>Взаємодія процесів наведена нижче на рисунку 2.1.</w:t>
+      </w:r>
+    </w:p>
+    <w:p>
+      <w:pPr>
+        <w:pStyle w:val="P1"/>
+        <w:spacing w:before="0" w:after="0"/>
+        <w:rPr>
+          <w:lang w:val="uk-UA"/>
+        </w:rPr>
+      </w:pPr>
+      <w:r>
+        <w:rPr>
+          <w:lang w:val="uk-UA"/>
+        </w:rPr>
+      </w:r>
+    </w:p>
+    <w:p>
+      <w:pPr>
+        <w:pStyle w:val="img1"/>
+        <w:rPr/>
+      </w:pPr>
+      <w:r>
+        <w:rPr/>
+        <w:drawing>
+          <wp:inline distT="0" distB="0" distL="0" distR="0">
+            <wp:extent cx="2075815" cy="3636645"/>
+            <wp:effectExtent l="0" t="0" r="0" b="0"/>
+            <wp:docPr id="2" name="Зображення2"/>
+            <wp:cNvGraphicFramePr>
+              <a:graphicFrameLocks xmlns:a="http://schemas.openxmlformats.org/drawingml/2006/main" noChangeAspect="1"/>
+            </wp:cNvGraphicFramePr>
+            <a:graphic xmlns:a="http://schemas.openxmlformats.org/drawingml/2006/main">
+              <a:graphicData uri="http://schemas.openxmlformats.org/drawingml/2006/picture">
+                <pic:pic xmlns:pic="http://schemas.openxmlformats.org/drawingml/2006/picture">
+                  <pic:nvPicPr>
+                    <pic:cNvPr id="2" name="Зображення2"/>
+                    <pic:cNvPicPr>
+                      <a:picLocks noChangeAspect="1" noChangeArrowheads="1"/>
+                    </pic:cNvPicPr>
+                  </pic:nvPicPr>
+                  <pic:blipFill>
+                    <a:blip r:embed="rId3"/>
+                    <a:stretch>
+                      <a:fillRect/>
+                    </a:stretch>
+                  </pic:blipFill>
+                  <pic:spPr bwMode="auto">
+                    <a:xfrm>
+                      <a:off x="0" y="0"/>
+                      <a:ext cx="2075815" cy="3636645"/>
+                    </a:xfrm>
+                    <a:prstGeom prst="rect">
+                      <a:avLst/>
+                    </a:prstGeom>
+                    <a:noFill/>
+                  </pic:spPr>
+                </pic:pic>
+              </a:graphicData>
+            </a:graphic>
+          </wp:inline>
+        </w:drawing>
+      </w:r>
+    </w:p>
+    <w:p>
+      <w:pPr>
+        <w:pStyle w:val="img1"/>
+        <w:rPr/>
+      </w:pPr>
+      <w:r>
+        <w:rPr/>
+        <w:t>Рисунок 2.1 — Взаємодія процесів в компанії</w:t>
+      </w:r>
+    </w:p>
+    <w:p>
+      <w:pPr>
+        <w:pStyle w:val="P1"/>
+        <w:spacing w:before="0" w:after="0"/>
+        <w:rPr/>
+      </w:pPr>
+      <w:r>
+        <w:rPr/>
+      </w:r>
+    </w:p>
+    <w:p>
+      <w:pPr>
+        <w:pStyle w:val="H3"/>
+        <w:spacing w:before="0" w:after="0"/>
+        <w:rPr/>
+      </w:pPr>
+      <w:r>
+        <w:rPr/>
+        <w:t>Ві</w:t>
+      </w:r>
+      <w:r>
+        <w:rPr/>
+        <w:t>дповідальність керівництва</w:t>
+      </w:r>
+    </w:p>
+    <w:p>
+      <w:pPr>
+        <w:pStyle w:val="P1"/>
+        <w:spacing w:before="0" w:after="0"/>
+        <w:rPr/>
+      </w:pPr>
+      <w:r>
+        <w:rPr/>
+      </w:r>
+    </w:p>
+    <w:p>
+      <w:pPr>
+        <w:pStyle w:val="P1"/>
+        <w:spacing w:before="0" w:after="0"/>
+        <w:rPr/>
+      </w:pPr>
+      <w:r>
+        <w:rPr/>
+        <w:t>Керівництво має відповідати за делегацію відповідальностей до керівників відділів, а також про планування та імплементацію стандартів якості у компанії.</w:t>
+      </w:r>
+    </w:p>
+    <w:p>
+      <w:pPr>
+        <w:pStyle w:val="P1"/>
+        <w:spacing w:before="0" w:after="0"/>
+        <w:rPr/>
+      </w:pPr>
+      <w:r>
+        <w:rPr/>
+      </w:r>
+    </w:p>
+    <w:p>
+      <w:pPr>
+        <w:pStyle w:val="H3"/>
+        <w:spacing w:before="0" w:after="0"/>
+        <w:rPr/>
+      </w:pPr>
+      <w:r>
+        <w:rPr/>
+        <w:t>К</w:t>
+      </w:r>
+      <w:r>
+        <w:rPr/>
+        <w:t>ерування ресурсами</w:t>
+      </w:r>
+    </w:p>
+    <w:p>
+      <w:pPr>
+        <w:pStyle w:val="P1"/>
+        <w:spacing w:before="0" w:after="0"/>
+        <w:rPr/>
+      </w:pPr>
+      <w:r>
+        <w:rPr/>
+      </w:r>
+    </w:p>
+    <w:p>
+      <w:pPr>
+        <w:pStyle w:val="P1"/>
+        <w:spacing w:before="0" w:after="0"/>
+        <w:rPr/>
+      </w:pPr>
+      <w:r>
+        <w:rPr/>
+        <w:t>Ресурси розподіляються по відділах відповідно до потреб. Керівники відділів створюють запити на ресурси (послуги, товари тощо). Директор компанії розглядає та погоджує ці запити. Після погодження закупівля здійснюється.</w:t>
+      </w:r>
+    </w:p>
+    <w:p>
+      <w:pPr>
+        <w:pStyle w:val="P1"/>
+        <w:spacing w:before="0" w:after="0"/>
+        <w:rPr/>
+      </w:pPr>
+      <w:r>
+        <w:rPr/>
+        <w:t>Стосовно керування новинами, через 2-3 дні кожна новина переходить в архів. Нові статті публікуються на сайті та сторінках у соціальних мережах. Для цього застосовується платформа з керування контентом (</w:t>
+      </w:r>
+      <w:r>
+        <w:rPr>
+          <w:lang w:val="en-US"/>
+        </w:rPr>
+        <w:t>Content Management System, CMS).</w:t>
+      </w:r>
+    </w:p>
+    <w:p>
+      <w:pPr>
+        <w:pStyle w:val="P1"/>
+        <w:spacing w:before="0" w:after="0"/>
+        <w:rPr/>
+      </w:pPr>
+      <w:r>
+        <w:rPr/>
+      </w:r>
+    </w:p>
+    <w:p>
+      <w:pPr>
+        <w:pStyle w:val="H3"/>
+        <w:spacing w:before="0" w:after="0"/>
+        <w:rPr/>
+      </w:pPr>
+      <w:r>
+        <w:rPr/>
+        <w:t>В</w:t>
+      </w:r>
+      <w:r>
+        <w:rPr/>
+        <w:t>иготовлення продукції</w:t>
+      </w:r>
+    </w:p>
+    <w:p>
+      <w:pPr>
+        <w:pStyle w:val="P1"/>
+        <w:spacing w:before="0" w:after="0"/>
+        <w:rPr/>
+      </w:pPr>
+      <w:r>
+        <w:rPr/>
+      </w:r>
+    </w:p>
+    <w:p>
+      <w:pPr>
+        <w:pStyle w:val="P1"/>
+        <w:spacing w:before="0" w:after="0"/>
+        <w:rPr/>
+      </w:pPr>
+      <w:r>
+        <w:rPr/>
+        <w:t xml:space="preserve">Новини збирає відповідний відділ компанії. Він постійно спостерігає за подіями міста (уявімо, що це компанія міських новин) та додає до </w:t>
+      </w:r>
+      <w:r>
+        <w:rPr>
+          <w:lang w:val="en-US"/>
+        </w:rPr>
+        <w:t xml:space="preserve">CMS </w:t>
+      </w:r>
+      <w:r>
+        <w:rPr>
+          <w:lang w:val="uk-UA"/>
+        </w:rPr>
+        <w:t>нові статті.</w:t>
+      </w:r>
+    </w:p>
+    <w:p>
+      <w:pPr>
+        <w:pStyle w:val="P1"/>
+        <w:spacing w:before="0" w:after="0"/>
+        <w:rPr/>
+      </w:pPr>
+      <w:r>
+        <w:rPr/>
+      </w:r>
+    </w:p>
+    <w:p>
+      <w:pPr>
+        <w:pStyle w:val="H3"/>
+        <w:spacing w:before="0" w:after="0"/>
+        <w:rPr/>
+      </w:pPr>
+      <w:r>
+        <w:rPr/>
+        <w:t>В</w:t>
+      </w:r>
+      <w:r>
+        <w:rPr/>
+        <w:t>имірювання, аналізування та поліпшування</w:t>
+      </w:r>
+    </w:p>
+    <w:p>
+      <w:pPr>
+        <w:pStyle w:val="P1"/>
+        <w:spacing w:before="0" w:after="0"/>
+        <w:rPr/>
+      </w:pPr>
+      <w:r>
+        <w:rPr/>
+      </w:r>
+    </w:p>
+    <w:p>
+      <w:pPr>
+        <w:pStyle w:val="P1"/>
+        <w:spacing w:before="0" w:after="0"/>
+        <w:rPr/>
+      </w:pPr>
+      <w:r>
+        <w:rPr/>
+        <w:t>Виміри здійснюються з таких категорій:</w:t>
+      </w:r>
+    </w:p>
+    <w:p>
+      <w:pPr>
+        <w:pStyle w:val="P1"/>
+        <w:widowControl/>
+        <w:numPr>
+          <w:ilvl w:val="0"/>
+          <w:numId w:val="2"/>
+        </w:numPr>
+        <w:suppressAutoHyphens w:val="true"/>
+        <w:bidi w:val="0"/>
+        <w:spacing w:lineRule="auto" w:line="360" w:before="0" w:after="0"/>
+        <w:ind w:firstLine="850" w:left="0" w:right="0"/>
+        <w:jc w:val="both"/>
+        <w:rPr/>
+      </w:pPr>
+      <w:r>
+        <w:rPr/>
+        <w:t>кількість переглядів;</w:t>
+      </w:r>
+    </w:p>
+    <w:p>
+      <w:pPr>
+        <w:pStyle w:val="P1"/>
+        <w:widowControl/>
+        <w:numPr>
+          <w:ilvl w:val="0"/>
+          <w:numId w:val="2"/>
+        </w:numPr>
+        <w:suppressAutoHyphens w:val="true"/>
+        <w:bidi w:val="0"/>
+        <w:spacing w:lineRule="auto" w:line="360" w:before="0" w:after="0"/>
+        <w:ind w:firstLine="850" w:left="0" w:right="0"/>
+        <w:jc w:val="both"/>
+        <w:rPr/>
+      </w:pPr>
+      <w:r>
+        <w:rPr/>
+        <w:t>швидкість відкриття сторінки;</w:t>
+      </w:r>
+    </w:p>
+    <w:p>
+      <w:pPr>
+        <w:pStyle w:val="P1"/>
+        <w:widowControl/>
+        <w:numPr>
+          <w:ilvl w:val="0"/>
+          <w:numId w:val="2"/>
+        </w:numPr>
+        <w:suppressAutoHyphens w:val="true"/>
+        <w:bidi w:val="0"/>
+        <w:spacing w:lineRule="auto" w:line="360" w:before="0" w:after="0"/>
+        <w:ind w:firstLine="850" w:left="0" w:right="0"/>
+        <w:jc w:val="both"/>
+        <w:rPr/>
+      </w:pPr>
+      <w:r>
+        <w:rPr/>
+        <w:t>час безперервної роботи ресурсу.</w:t>
+      </w:r>
+    </w:p>
+    <w:p>
+      <w:pPr>
+        <w:pStyle w:val="p11"/>
+        <w:rPr>
+          <w:lang w:val="uk-UA"/>
+        </w:rPr>
+      </w:pPr>
+      <w:r>
+        <w:rPr>
+          <w:lang w:val="uk-UA"/>
+        </w:rPr>
+        <w:t xml:space="preserve">Кожна новина аналізується на правдивість. Якщо новина не є правдивою її позначають такою та архівують. </w:t>
+      </w:r>
+    </w:p>
+    <w:p>
+      <w:pPr>
+        <w:pStyle w:val="p11"/>
+        <w:rPr>
+          <w:lang w:val="uk-UA"/>
+        </w:rPr>
+      </w:pPr>
+      <w:r>
+        <w:rPr>
+          <w:lang w:val="uk-UA"/>
+        </w:rPr>
+        <w:t>Для поліпшення кожен квартал проводиться аудит. Аудит це систематична перевірка в компанії.</w:t>
       </w:r>
     </w:p>
     <w:p>
@@ -2736,7 +3276,31 @@
         <w:rPr>
           <w:lang w:val="uk-UA"/>
         </w:rPr>
-        <w:t>що містять відповіді на контрольні запитання, а також відображають результати виконання роботи та їх критичний аналіз</w:t>
+        <w:t xml:space="preserve">По закінченню виконання роботи було вивчено та застосовано стандарти у сфері якості ДСТУ </w:t>
+      </w:r>
+      <w:r>
+        <w:rPr>
+          <w:lang w:val="en-US"/>
+        </w:rPr>
+        <w:t xml:space="preserve">ISO 9000 </w:t>
+      </w:r>
+      <w:r>
+        <w:rPr>
+          <w:lang w:val="uk-UA"/>
+        </w:rPr>
+        <w:t xml:space="preserve">та </w:t>
+      </w:r>
+      <w:r>
+        <w:rPr>
+          <w:lang w:val="en-US"/>
+        </w:rPr>
+        <w:t xml:space="preserve">9001. </w:t>
+      </w:r>
+      <w:r>
+        <w:rPr>
+          <w:lang w:val="uk-UA"/>
+        </w:rPr>
+        <w:t>Було створено уявну компанію міських новин та розвинено документацію для неї.</w:t>
       </w:r>
     </w:p>
     <w:p>
@@ -3044,6 +3608,143 @@
   <w:abstractNum w:abstractNumId="2">
     <w:lvl w:ilvl="0">
       <w:start w:val="1"/>
+      <w:numFmt w:val="bullet"/>
+      <w:lvlText w:val="-"/>
+      <w:lvlJc w:val="left"/>
+      <w:pPr>
+        <w:tabs>
+          <w:tab w:val="num" w:pos="720"/>
+        </w:tabs>
+        <w:ind w:left="720" w:hanging="360"/>
+      </w:pPr>
+      <w:rPr>
+        <w:rFonts w:ascii="OpenSymbol" w:hAnsi="OpenSymbol" w:cs="OpenSymbol" w:hint="default"/>
+      </w:rPr>
+    </w:lvl>
+    <w:lvl w:ilvl="1">
+      <w:start w:val="1"/>
+      <w:numFmt w:val="bullet"/>
+      <w:lvlText w:val="-"/>
+      <w:lvlJc w:val="left"/>
+      <w:pPr>
+        <w:tabs>
+          <w:tab w:val="num" w:pos="1080"/>
+        </w:tabs>
+        <w:ind w:left="1080" w:hanging="360"/>
+      </w:pPr>
+      <w:rPr>
+        <w:rFonts w:ascii="OpenSymbol" w:hAnsi="OpenSymbol" w:cs="OpenSymbol" w:hint="default"/>
+      </w:rPr>
+    </w:lvl>
+    <w:lvl w:ilvl="2">
+      <w:start w:val="1"/>
+      <w:numFmt w:val="bullet"/>
+      <w:lvlText w:val="-"/>
+      <w:lvlJc w:val="left"/>
+      <w:pPr>
+        <w:tabs>
+          <w:tab w:val="num" w:pos="1440"/>
+        </w:tabs>
+        <w:ind w:left="1440" w:hanging="360"/>
+      </w:pPr>
+      <w:rPr>
+        <w:rFonts w:ascii="OpenSymbol" w:hAnsi="OpenSymbol" w:cs="OpenSymbol" w:hint="default"/>
+      </w:rPr>
+    </w:lvl>
+    <w:lvl w:ilvl="3">
+      <w:start w:val="1"/>
+      <w:numFmt w:val="bullet"/>
+      <w:lvlText w:val="-"/>
+      <w:lvlJc w:val="left"/>
+      <w:pPr>
+        <w:tabs>
+          <w:tab w:val="num" w:pos="1800"/>
+        </w:tabs>
+        <w:ind w:left="1800" w:hanging="360"/>
+      </w:pPr>
+      <w:rPr>
+        <w:rFonts w:ascii="OpenSymbol" w:hAnsi="OpenSymbol" w:cs="OpenSymbol" w:hint="default"/>
+      </w:rPr>
+    </w:lvl>
+    <w:lvl w:ilvl="4">
+      <w:start w:val="1"/>
+      <w:numFmt w:val="bullet"/>
+      <w:lvlText w:val="-"/>
+      <w:lvlJc w:val="left"/>
+      <w:pPr>
+        <w:tabs>
+          <w:tab w:val="num" w:pos="2160"/>
+        </w:tabs>
+        <w:ind w:left="2160" w:hanging="360"/>
+      </w:pPr>
+      <w:rPr>
+        <w:rFonts w:ascii="OpenSymbol" w:hAnsi="OpenSymbol" w:cs="OpenSymbol" w:hint="default"/>
+      </w:rPr>
+    </w:lvl>
+    <w:lvl w:ilvl="5">
+      <w:start w:val="1"/>
+      <w:numFmt w:val="bullet"/>
+      <w:lvlText w:val="-"/>
+      <w:lvlJc w:val="left"/>
+      <w:pPr>
+        <w:tabs>
+          <w:tab w:val="num" w:pos="2520"/>
+        </w:tabs>
+        <w:ind w:left="2520" w:hanging="360"/>
+      </w:pPr>
+      <w:rPr>
+        <w:rFonts w:ascii="OpenSymbol" w:hAnsi="OpenSymbol" w:cs="OpenSymbol" w:hint="default"/>
+      </w:rPr>
+    </w:lvl>
+    <w:lvl w:ilvl="6">
+      <w:start w:val="1"/>
+      <w:numFmt w:val="bullet"/>
+      <w:lvlText w:val="-"/>
+      <w:lvlJc w:val="left"/>
+      <w:pPr>
+        <w:tabs>
+          <w:tab w:val="num" w:pos="2880"/>
+        </w:tabs>
+        <w:ind w:left="2880" w:hanging="360"/>
+      </w:pPr>
+      <w:rPr>
+        <w:rFonts w:ascii="OpenSymbol" w:hAnsi="OpenSymbol" w:cs="OpenSymbol" w:hint="default"/>
+      </w:rPr>
+    </w:lvl>
+    <w:lvl w:ilvl="7">
+      <w:start w:val="1"/>
+      <w:numFmt w:val="bullet"/>
+      <w:lvlText w:val="-"/>
+      <w:lvlJc w:val="left"/>
+      <w:pPr>
+        <w:tabs>
+          <w:tab w:val="num" w:pos="3240"/>
+        </w:tabs>
+        <w:ind w:left="3240" w:hanging="360"/>
+      </w:pPr>
+      <w:rPr>
+        <w:rFonts w:ascii="OpenSymbol" w:hAnsi="OpenSymbol" w:cs="OpenSymbol" w:hint="default"/>
+      </w:rPr>
+    </w:lvl>
+    <w:lvl w:ilvl="8">
+      <w:start w:val="1"/>
+      <w:numFmt w:val="bullet"/>
+      <w:lvlText w:val="-"/>
+      <w:lvlJc w:val="left"/>
+      <w:pPr>
+        <w:tabs>
+          <w:tab w:val="num" w:pos="3600"/>
+        </w:tabs>
+        <w:ind w:left="3600" w:hanging="360"/>
+      </w:pPr>
+      <w:rPr>
+        <w:rFonts w:ascii="OpenSymbol" w:hAnsi="OpenSymbol" w:cs="OpenSymbol" w:hint="default"/>
+      </w:rPr>
+    </w:lvl>
+  </w:abstractNum>
+  <w:abstractNum w:abstractNumId="3">
+    <w:lvl w:ilvl="0">
+      <w:start w:val="1"/>
       <w:numFmt w:val="none"/>
       <w:suff w:val="nothing"/>
       <w:lvlText w:val=""/>
@@ -3165,6 +3866,9 @@
   </w:num>
   <w:num w:numId="2">
     <w:abstractNumId w:val="2"/>
+  </w:num>
+  <w:num w:numId="3">
+    <w:abstractNumId w:val="3"/>
   </w:num>
 </w:numbering>
 </file>
@@ -4159,7 +4863,9 @@
     <w:link w:val="H3Char"/>
     <w:qFormat/>
     <w:rsid w:val="00dc3221"/>
-    <w:pPr/>
+    <w:pPr>
+      <w:spacing w:before="0" w:after="0"/>
+    </w:pPr>
     <w:rPr>
       <w:rFonts w:ascii="Times New Roman" w:hAnsi="Times New Roman" w:cs="Times New Roman"/>
       <w:b/>

</xml_diff>

<commit_message>
feat: SP1 proofread report
</commit_message>
<xml_diff>
--- a/51SP Sertyficazija PZ/1/SP_KNT-116m_Onyshchenko_15_PR1.docx
+++ b/51SP Sertyficazija PZ/1/SP_KNT-116m_Onyshchenko_15_PR1.docx
@@ -236,14 +236,7 @@
           <w:b/>
           <w:bCs/>
         </w:rPr>
-        <w:t xml:space="preserve">Виконав варіант </w:t>
-      </w:r>
-      <w:r>
-        <w:rPr>
-          <w:b/>
-          <w:bCs/>
-        </w:rPr>
-        <w:t>15</w:t>
+        <w:t>Виконав варіант 15</w:t>
       </w:r>
     </w:p>
     <w:p>
@@ -799,7 +792,13 @@
         <w:rPr>
           <w:lang w:val="uk-UA"/>
         </w:rPr>
-        <w:t>Медіа контент це всілякий аудіовізуальний та цифровий контент, який користувач може переглядати (споживати).</w:t>
+        <w:t xml:space="preserve">Медіа контент це всілякий аудіовізуальний та цифровий контент, який користувач може переглядати (споживати). </w:t>
+      </w:r>
+      <w:r>
+        <w:rPr>
+          <w:lang w:val="uk-UA"/>
+        </w:rPr>
+        <w:t>Уявімо, що наша компанія виробляє міські новини.</w:t>
       </w:r>
     </w:p>
     <w:p>
@@ -929,7 +928,7 @@
         <w:rPr>
           <w:lang w:val="uk-UA"/>
         </w:rPr>
-        <w:t>стримінгові платформи: дозволяють користувачеві отримувати доступ до контенту в реальному часі, без його завантаження;</w:t>
+        <w:t>програми для соціальних мереж: медіа компанія потребує допомоги в розповсюджені контенту, для цього можуть бути використані соціальні мережі;</w:t>
       </w:r>
     </w:p>
     <w:p>
@@ -953,7 +952,59 @@
         <w:rPr>
           <w:lang w:val="uk-UA"/>
         </w:rPr>
-        <w:t>програми для соціальних мереж: медіа компанія потребує допомоги в розповсюджені контенту, для цього можуть бути використані соціальні мережі;</w:t>
+        <w:t>системи менеджменту контенту (</w:t>
+      </w:r>
+      <w:r>
+        <w:rPr>
+          <w:lang w:val="en-US"/>
+        </w:rPr>
+        <w:t xml:space="preserve">CMS): </w:t>
+      </w:r>
+      <w:r>
+        <w:rPr>
+          <w:lang w:val="uk-UA"/>
+        </w:rPr>
+        <w:t>системи для керування контентом.</w:t>
+      </w:r>
+    </w:p>
+    <w:p>
+      <w:pPr>
+        <w:pStyle w:val="P1"/>
+        <w:widowControl/>
+        <w:suppressAutoHyphens w:val="true"/>
+        <w:bidi w:val="0"/>
+        <w:spacing w:lineRule="auto" w:line="360" w:before="0" w:after="0"/>
+        <w:ind w:firstLine="850" w:left="0" w:right="0"/>
+        <w:jc w:val="both"/>
+        <w:rPr>
+          <w:lang w:val="uk-UA"/>
+        </w:rPr>
+      </w:pPr>
+      <w:r>
+        <w:rPr>
+          <w:lang w:val="uk-UA"/>
+        </w:rPr>
+        <w:t>Замовником для компанії виступає читач. Заробіток компанії здійснюється через показ реклами на сайті та на сторінках в соціальних мережах.</w:t>
+      </w:r>
+    </w:p>
+    <w:p>
+      <w:pPr>
+        <w:pStyle w:val="P1"/>
+        <w:widowControl/>
+        <w:suppressAutoHyphens w:val="true"/>
+        <w:bidi w:val="0"/>
+        <w:spacing w:lineRule="auto" w:line="360" w:before="0" w:after="0"/>
+        <w:ind w:firstLine="850" w:left="0" w:right="0"/>
+        <w:jc w:val="both"/>
+        <w:rPr>
+          <w:lang w:val="uk-UA"/>
+        </w:rPr>
+      </w:pPr>
+      <w:r>
+        <w:rPr>
+          <w:lang w:val="uk-UA"/>
+        </w:rPr>
+        <w:t>Особливостями новинного сайту є:</w:t>
       </w:r>
     </w:p>
     <w:p>
@@ -977,382 +1028,459 @@
         <w:rPr>
           <w:lang w:val="uk-UA"/>
         </w:rPr>
-        <w:t>системи менеджменту контенту (</w:t>
+        <w:t>потреба його праці 24/7;</w:t>
+      </w:r>
+    </w:p>
+    <w:p>
+      <w:pPr>
+        <w:pStyle w:val="P1"/>
+        <w:widowControl/>
+        <w:numPr>
+          <w:ilvl w:val="0"/>
+          <w:numId w:val="1"/>
+        </w:numPr>
+        <w:suppressAutoHyphens w:val="true"/>
+        <w:bidi w:val="0"/>
+        <w:spacing w:lineRule="auto" w:line="360" w:before="0" w:after="0"/>
+        <w:ind w:firstLine="850" w:left="0" w:right="0"/>
+        <w:jc w:val="both"/>
+        <w:rPr>
+          <w:lang w:val="uk-UA"/>
+        </w:rPr>
+      </w:pPr>
+      <w:r>
+        <w:rPr>
+          <w:lang w:val="uk-UA"/>
+        </w:rPr>
+        <w:t>швидка дизактуалізація новин (бо новіші надходять швидко);</w:t>
+      </w:r>
+    </w:p>
+    <w:p>
+      <w:pPr>
+        <w:pStyle w:val="P1"/>
+        <w:widowControl/>
+        <w:numPr>
+          <w:ilvl w:val="0"/>
+          <w:numId w:val="1"/>
+        </w:numPr>
+        <w:suppressAutoHyphens w:val="true"/>
+        <w:bidi w:val="0"/>
+        <w:spacing w:lineRule="auto" w:line="360" w:before="0" w:after="0"/>
+        <w:ind w:firstLine="850" w:left="0" w:right="0"/>
+        <w:jc w:val="both"/>
+        <w:rPr>
+          <w:lang w:val="uk-UA"/>
+        </w:rPr>
+      </w:pPr>
+      <w:r>
+        <w:rPr>
+          <w:lang w:val="uk-UA"/>
+        </w:rPr>
+        <w:t>новини мають бути достовірними, не має бути фейків.</w:t>
+      </w:r>
+    </w:p>
+    <w:p>
+      <w:pPr>
+        <w:pStyle w:val="P1"/>
+        <w:rPr>
+          <w:lang w:val="uk-UA"/>
+        </w:rPr>
+      </w:pPr>
+      <w:r>
+        <w:rPr>
+          <w:lang w:val="uk-UA"/>
+        </w:rPr>
+      </w:r>
+    </w:p>
+    <w:p>
+      <w:pPr>
+        <w:pStyle w:val="H2"/>
+        <w:rPr/>
+      </w:pPr>
+      <w:r>
+        <w:rPr/>
+        <w:t>Організаційна структура підприємства з коротким описом обов’язків</w:t>
+      </w:r>
+    </w:p>
+    <w:p>
+      <w:pPr>
+        <w:pStyle w:val="P1"/>
+        <w:rPr>
+          <w:lang w:val="uk-UA"/>
+        </w:rPr>
+      </w:pPr>
+      <w:r>
+        <w:rPr>
+          <w:lang w:val="uk-UA"/>
+        </w:rPr>
+      </w:r>
+    </w:p>
+    <w:p>
+      <w:pPr>
+        <w:pStyle w:val="P1"/>
+        <w:rPr>
+          <w:lang w:val="uk-UA"/>
+        </w:rPr>
+      </w:pPr>
+      <w:r>
+        <w:rPr>
+          <w:lang w:val="uk-UA"/>
+        </w:rPr>
+        <w:t>О</w:t>
+      </w:r>
+      <w:r>
+        <w:rPr>
+          <w:lang w:val="uk-UA"/>
+        </w:rPr>
+        <w:t>ргструктура компанії буде наступною:</w:t>
+      </w:r>
+    </w:p>
+    <w:p>
+      <w:pPr>
+        <w:pStyle w:val="P1"/>
+        <w:rPr>
+          <w:lang w:val="uk-UA"/>
+        </w:rPr>
+      </w:pPr>
+      <w:r>
+        <w:rPr>
+          <w:lang w:val="uk-UA"/>
+        </w:rPr>
+      </w:r>
+    </w:p>
+    <w:p>
+      <w:pPr>
+        <w:pStyle w:val="P1"/>
+        <w:rPr>
+          <w:lang w:val="uk-UA"/>
+        </w:rPr>
+      </w:pPr>
+      <w:r>
+        <w:rPr>
+          <w:lang w:val="uk-UA"/>
+        </w:rPr>
+        <w:t>Директор</w:t>
+      </w:r>
+    </w:p>
+    <w:p>
+      <w:pPr>
+        <w:pStyle w:val="P1"/>
+        <w:rPr>
+          <w:lang w:val="uk-UA"/>
+        </w:rPr>
+      </w:pPr>
+      <w:r>
+        <w:rPr>
+          <w:lang w:val="uk-UA"/>
+        </w:rPr>
+        <w:t xml:space="preserve">├── </w:t>
+      </w:r>
+      <w:r>
+        <w:rPr>
+          <w:lang w:val="uk-UA"/>
+        </w:rPr>
+        <w:t>Керівник відділу збору (створення) новин</w:t>
+      </w:r>
+    </w:p>
+    <w:p>
+      <w:pPr>
+        <w:pStyle w:val="P1"/>
+        <w:rPr>
+          <w:lang w:val="uk-UA"/>
+        </w:rPr>
+      </w:pPr>
+      <w:r>
+        <w:rPr>
+          <w:lang w:val="uk-UA"/>
+        </w:rPr>
+        <w:t xml:space="preserve">│   └── </w:t>
+      </w:r>
+      <w:r>
+        <w:rPr>
+          <w:lang w:val="uk-UA"/>
+        </w:rPr>
+        <w:t>Підлеглі відділу збору (створення) новин...</w:t>
+      </w:r>
+    </w:p>
+    <w:p>
+      <w:pPr>
+        <w:pStyle w:val="P1"/>
+        <w:rPr>
+          <w:lang w:val="uk-UA"/>
+        </w:rPr>
+      </w:pPr>
+      <w:r>
+        <w:rPr>
+          <w:lang w:val="uk-UA"/>
+        </w:rPr>
+        <w:t xml:space="preserve">├── </w:t>
+      </w:r>
+      <w:r>
+        <w:rPr>
+          <w:lang w:val="uk-UA"/>
+        </w:rPr>
+        <w:t>Керівник відділу публікації новин в соціальних мережах</w:t>
+      </w:r>
+    </w:p>
+    <w:p>
+      <w:pPr>
+        <w:pStyle w:val="P1"/>
+        <w:rPr>
+          <w:lang w:val="uk-UA"/>
+        </w:rPr>
+      </w:pPr>
+      <w:r>
+        <w:rPr>
+          <w:lang w:val="uk-UA"/>
+        </w:rPr>
+        <w:t xml:space="preserve">│   └── </w:t>
+      </w:r>
+      <w:r>
+        <w:rPr>
+          <w:lang w:val="uk-UA"/>
+        </w:rPr>
+        <w:t>Підлеглі відділу публікації новин в соціальних мережах...</w:t>
+      </w:r>
+    </w:p>
+    <w:p>
+      <w:pPr>
+        <w:pStyle w:val="P1"/>
+        <w:rPr>
+          <w:lang w:val="uk-UA"/>
+        </w:rPr>
+      </w:pPr>
+      <w:r>
+        <w:rPr>
+          <w:lang w:val="uk-UA"/>
+        </w:rPr>
+        <w:t xml:space="preserve">├── </w:t>
+      </w:r>
+      <w:r>
+        <w:rPr>
+          <w:lang w:val="uk-UA"/>
+        </w:rPr>
+        <w:t>Керівник відділу публікації новин на вебсайті</w:t>
+      </w:r>
+    </w:p>
+    <w:p>
+      <w:pPr>
+        <w:pStyle w:val="P1"/>
+        <w:rPr>
+          <w:lang w:val="uk-UA"/>
+        </w:rPr>
+      </w:pPr>
+      <w:r>
+        <w:rPr>
+          <w:lang w:val="uk-UA"/>
+        </w:rPr>
+        <w:t xml:space="preserve">│   └── </w:t>
+      </w:r>
+      <w:r>
+        <w:rPr>
+          <w:lang w:val="uk-UA"/>
+        </w:rPr>
+        <w:t>Підлеглі відділу публікації новин на вебсайті...</w:t>
+      </w:r>
+    </w:p>
+    <w:p>
+      <w:pPr>
+        <w:pStyle w:val="P1"/>
+        <w:rPr>
+          <w:lang w:val="uk-UA"/>
+        </w:rPr>
+      </w:pPr>
+      <w:r>
+        <w:rPr>
+          <w:lang w:val="uk-UA"/>
+        </w:rPr>
+        <w:t xml:space="preserve">├── </w:t>
+      </w:r>
+      <w:r>
+        <w:rPr>
+          <w:lang w:val="uk-UA"/>
+        </w:rPr>
+        <w:t>Керівник ІТ відділу</w:t>
+      </w:r>
+    </w:p>
+    <w:p>
+      <w:pPr>
+        <w:pStyle w:val="P1"/>
+        <w:rPr>
+          <w:lang w:val="uk-UA"/>
+        </w:rPr>
+      </w:pPr>
+      <w:r>
+        <w:rPr>
+          <w:lang w:val="uk-UA"/>
+        </w:rPr>
+        <w:t xml:space="preserve">│   └── </w:t>
+      </w:r>
+      <w:r>
+        <w:rPr>
+          <w:lang w:val="uk-UA"/>
+        </w:rPr>
+        <w:t>Підлеглі ІТ відділу...</w:t>
+      </w:r>
+    </w:p>
+    <w:p>
+      <w:pPr>
+        <w:pStyle w:val="P1"/>
+        <w:rPr>
+          <w:lang w:val="uk-UA"/>
+        </w:rPr>
+      </w:pPr>
+      <w:r>
+        <w:rPr>
+          <w:lang w:val="uk-UA"/>
+        </w:rPr>
+        <w:t xml:space="preserve">└── </w:t>
+      </w:r>
+      <w:r>
+        <w:rPr>
+          <w:lang w:val="uk-UA"/>
+        </w:rPr>
+        <w:t>Керівник бухгалтерії</w:t>
+      </w:r>
+    </w:p>
+    <w:p>
+      <w:pPr>
+        <w:pStyle w:val="P1"/>
+        <w:rPr>
+          <w:lang w:val="uk-UA"/>
+        </w:rPr>
+      </w:pPr>
+      <w:r>
+        <w:rPr>
+          <w:lang w:val="uk-UA"/>
+        </w:rPr>
+        <w:t xml:space="preserve">    └── </w:t>
+      </w:r>
+      <w:r>
+        <w:rPr>
+          <w:lang w:val="uk-UA"/>
+        </w:rPr>
+        <w:t>Підлеглі бухгалтери</w:t>
+      </w:r>
+    </w:p>
+    <w:p>
+      <w:pPr>
+        <w:pStyle w:val="P1"/>
+        <w:rPr>
+          <w:lang w:val="uk-UA"/>
+        </w:rPr>
+      </w:pPr>
+      <w:r>
+        <w:rPr>
+          <w:lang w:val="uk-UA"/>
+        </w:rPr>
+      </w:r>
+    </w:p>
+    <w:p>
+      <w:pPr>
+        <w:pStyle w:val="P1"/>
+        <w:rPr>
+          <w:lang w:val="uk-UA"/>
+        </w:rPr>
+      </w:pPr>
+      <w:r>
+        <w:rPr>
+          <w:lang w:val="uk-UA"/>
+        </w:rPr>
+        <w:t>Обов’язки директора є керування компанією та делегація задач керівникам відділів.</w:t>
+      </w:r>
+    </w:p>
+    <w:p>
+      <w:pPr>
+        <w:pStyle w:val="P1"/>
+        <w:rPr>
+          <w:lang w:val="uk-UA"/>
+        </w:rPr>
+      </w:pPr>
+      <w:r>
+        <w:rPr>
+          <w:lang w:val="uk-UA"/>
+        </w:rPr>
+        <w:t xml:space="preserve">Обов’язки керівника відділу </w:t>
+      </w:r>
+      <w:r>
+        <w:rPr>
+          <w:lang w:val="uk-UA"/>
+        </w:rPr>
+        <w:t xml:space="preserve">є </w:t>
+      </w:r>
+      <w:r>
+        <w:rPr>
+          <w:lang w:val="uk-UA"/>
+        </w:rPr>
+        <w:t>створення (збирання) новин є організація підлеглих для збору та створення новин. Цей відділ також має займатися перевіркою новин на достовірність.</w:t>
+      </w:r>
+    </w:p>
+    <w:p>
+      <w:pPr>
+        <w:pStyle w:val="P1"/>
+        <w:rPr>
+          <w:lang w:val="uk-UA"/>
+        </w:rPr>
+      </w:pPr>
+      <w:r>
+        <w:rPr>
+          <w:lang w:val="uk-UA"/>
+        </w:rPr>
+        <w:t>Обов’язки керівника відділу з соціальних мереж є делегація підлеглим налаштування каналів у соціальних мережах та публікації новин в них.</w:t>
+      </w:r>
+    </w:p>
+    <w:p>
+      <w:pPr>
+        <w:pStyle w:val="P1"/>
+        <w:rPr>
+          <w:lang w:val="uk-UA"/>
+        </w:rPr>
+      </w:pPr>
+      <w:r>
+        <w:rPr>
+          <w:lang w:val="uk-UA"/>
+        </w:rPr>
+        <w:t>Обов’язки керівника відділу публікації новин на вебсайті є організація підлеглих для створення та публікації новин на вебсайті компанії.</w:t>
+      </w:r>
+    </w:p>
+    <w:p>
+      <w:pPr>
+        <w:pStyle w:val="P1"/>
+        <w:rPr>
+          <w:lang w:val="uk-UA"/>
+        </w:rPr>
+      </w:pPr>
+      <w:r>
+        <w:rPr>
+          <w:lang w:val="uk-UA"/>
+        </w:rPr>
+        <w:t xml:space="preserve">Обов’язки керівника ІТ відділу є створення та підтримка </w:t>
       </w:r>
       <w:r>
         <w:rPr>
           <w:lang w:val="en-US"/>
         </w:rPr>
-        <w:t xml:space="preserve">CMS): </w:t>
-      </w:r>
-      <w:r>
-        <w:rPr>
-          <w:lang w:val="uk-UA"/>
-        </w:rPr>
-        <w:t>системи для керування контентом.</w:t>
-      </w:r>
-    </w:p>
-    <w:p>
-      <w:pPr>
-        <w:pStyle w:val="P1"/>
-        <w:rPr>
-          <w:lang w:val="uk-UA"/>
-        </w:rPr>
-      </w:pPr>
-      <w:r>
-        <w:rPr>
-          <w:lang w:val="uk-UA"/>
-        </w:rPr>
-      </w:r>
-    </w:p>
-    <w:p>
-      <w:pPr>
-        <w:pStyle w:val="H2"/>
-        <w:rPr/>
-      </w:pPr>
-      <w:r>
-        <w:rPr/>
-        <w:t>Організаційна структура підприємства з коротким описом обов’язків</w:t>
-      </w:r>
-    </w:p>
-    <w:p>
-      <w:pPr>
-        <w:pStyle w:val="P1"/>
-        <w:rPr>
-          <w:lang w:val="uk-UA"/>
-        </w:rPr>
-      </w:pPr>
-      <w:r>
-        <w:rPr>
-          <w:lang w:val="uk-UA"/>
-        </w:rPr>
-      </w:r>
-    </w:p>
-    <w:p>
-      <w:pPr>
-        <w:pStyle w:val="P1"/>
-        <w:rPr>
-          <w:lang w:val="uk-UA"/>
-        </w:rPr>
-      </w:pPr>
-      <w:r>
-        <w:rPr>
-          <w:lang w:val="uk-UA"/>
-        </w:rPr>
-        <w:t>Уявімо, що наша медіа компанія займається публікацією новин. Тоді оргструктура компанії буде наступною:</w:t>
-      </w:r>
-    </w:p>
-    <w:p>
-      <w:pPr>
-        <w:pStyle w:val="P1"/>
-        <w:rPr>
-          <w:lang w:val="uk-UA"/>
-        </w:rPr>
-      </w:pPr>
-      <w:r>
-        <w:rPr>
-          <w:lang w:val="uk-UA"/>
-        </w:rPr>
-      </w:r>
-    </w:p>
-    <w:p>
-      <w:pPr>
-        <w:pStyle w:val="P1"/>
-        <w:rPr>
-          <w:lang w:val="uk-UA"/>
-        </w:rPr>
-      </w:pPr>
-      <w:r>
-        <w:rPr>
-          <w:lang w:val="uk-UA"/>
-        </w:rPr>
-        <w:t>Директор</w:t>
-      </w:r>
-    </w:p>
-    <w:p>
-      <w:pPr>
-        <w:pStyle w:val="P1"/>
-        <w:rPr>
-          <w:lang w:val="uk-UA"/>
-        </w:rPr>
-      </w:pPr>
-      <w:r>
-        <w:rPr>
-          <w:lang w:val="uk-UA"/>
-        </w:rPr>
-        <w:t xml:space="preserve">├── </w:t>
-      </w:r>
-      <w:r>
-        <w:rPr>
-          <w:lang w:val="uk-UA"/>
-        </w:rPr>
-        <w:t>Керівник відділу збору (створення) новин</w:t>
-      </w:r>
-    </w:p>
-    <w:p>
-      <w:pPr>
-        <w:pStyle w:val="P1"/>
-        <w:rPr>
-          <w:lang w:val="uk-UA"/>
-        </w:rPr>
-      </w:pPr>
-      <w:r>
-        <w:rPr>
-          <w:lang w:val="uk-UA"/>
-        </w:rPr>
-        <w:t xml:space="preserve">│   └── </w:t>
-      </w:r>
-      <w:r>
-        <w:rPr>
-          <w:lang w:val="uk-UA"/>
-        </w:rPr>
-        <w:t>Підлеглі відділу збору (створення) новин...</w:t>
-      </w:r>
-    </w:p>
-    <w:p>
-      <w:pPr>
-        <w:pStyle w:val="P1"/>
-        <w:rPr>
-          <w:lang w:val="uk-UA"/>
-        </w:rPr>
-      </w:pPr>
-      <w:r>
-        <w:rPr>
-          <w:lang w:val="uk-UA"/>
-        </w:rPr>
-        <w:t xml:space="preserve">├── </w:t>
-      </w:r>
-      <w:r>
-        <w:rPr>
-          <w:lang w:val="uk-UA"/>
-        </w:rPr>
-        <w:t>Керівник відділу публікації новин в соціальних мережах</w:t>
-      </w:r>
-    </w:p>
-    <w:p>
-      <w:pPr>
-        <w:pStyle w:val="P1"/>
-        <w:rPr>
-          <w:lang w:val="uk-UA"/>
-        </w:rPr>
-      </w:pPr>
-      <w:r>
-        <w:rPr>
-          <w:lang w:val="uk-UA"/>
-        </w:rPr>
-        <w:t xml:space="preserve">│   └── </w:t>
-      </w:r>
-      <w:r>
-        <w:rPr>
-          <w:lang w:val="uk-UA"/>
-        </w:rPr>
-        <w:t>Підлеглі відділу публікації новин в соціальних мережах...</w:t>
-      </w:r>
-    </w:p>
-    <w:p>
-      <w:pPr>
-        <w:pStyle w:val="P1"/>
-        <w:rPr>
-          <w:lang w:val="uk-UA"/>
-        </w:rPr>
-      </w:pPr>
-      <w:r>
-        <w:rPr>
-          <w:lang w:val="uk-UA"/>
-        </w:rPr>
-        <w:t xml:space="preserve">└── </w:t>
-      </w:r>
-      <w:r>
-        <w:rPr>
-          <w:lang w:val="uk-UA"/>
-        </w:rPr>
-        <w:t>Керівник відділу публікації новин на вебсайті</w:t>
-      </w:r>
-    </w:p>
-    <w:p>
-      <w:pPr>
-        <w:pStyle w:val="P1"/>
-        <w:rPr>
-          <w:lang w:val="uk-UA"/>
-        </w:rPr>
-      </w:pPr>
-      <w:r>
-        <w:rPr>
-          <w:lang w:val="uk-UA"/>
-        </w:rPr>
-        <w:t xml:space="preserve">      └── </w:t>
-      </w:r>
-      <w:r>
-        <w:rPr>
-          <w:lang w:val="uk-UA"/>
-        </w:rPr>
-        <w:t>Підлеглі відділу публікації новин на вебсайті...</w:t>
-      </w:r>
-    </w:p>
-    <w:p>
-      <w:pPr>
-        <w:pStyle w:val="P1"/>
-        <w:rPr>
-          <w:lang w:val="uk-UA"/>
-        </w:rPr>
-      </w:pPr>
-      <w:r>
-        <w:rPr>
-          <w:lang w:val="uk-UA"/>
-        </w:rPr>
-      </w:r>
-    </w:p>
-    <w:p>
-      <w:pPr>
-        <w:pStyle w:val="P1"/>
-        <w:rPr>
-          <w:lang w:val="uk-UA"/>
-        </w:rPr>
-      </w:pPr>
-      <w:r>
-        <w:rPr>
-          <w:lang w:val="uk-UA"/>
-        </w:rPr>
-        <w:t>У вигляді діаграми оргструктура наведена на рисунку 1.1.</w:t>
-      </w:r>
-    </w:p>
-    <w:p>
-      <w:pPr>
-        <w:pStyle w:val="P1"/>
-        <w:rPr>
-          <w:lang w:val="uk-UA"/>
-        </w:rPr>
-      </w:pPr>
-      <w:r>
-        <w:rPr>
-          <w:lang w:val="uk-UA"/>
-        </w:rPr>
-      </w:r>
-    </w:p>
-    <w:p>
-      <w:pPr>
-        <w:pStyle w:val="img1"/>
-        <w:rPr/>
-      </w:pPr>
-      <w:r>
-        <w:rPr/>
-        <w:drawing>
-          <wp:inline distT="0" distB="0" distL="0" distR="0">
-            <wp:extent cx="5731510" cy="1111250"/>
-            <wp:effectExtent l="0" t="0" r="0" b="0"/>
-            <wp:docPr id="1" name="Зображення1"/>
-            <wp:cNvGraphicFramePr>
-              <a:graphicFrameLocks xmlns:a="http://schemas.openxmlformats.org/drawingml/2006/main" noChangeAspect="1"/>
-            </wp:cNvGraphicFramePr>
-            <a:graphic xmlns:a="http://schemas.openxmlformats.org/drawingml/2006/main">
-              <a:graphicData uri="http://schemas.openxmlformats.org/drawingml/2006/picture">
-                <pic:pic xmlns:pic="http://schemas.openxmlformats.org/drawingml/2006/picture">
-                  <pic:nvPicPr>
-                    <pic:cNvPr id="1" name="Зображення1"/>
-                    <pic:cNvPicPr>
-                      <a:picLocks noChangeAspect="1" noChangeArrowheads="1"/>
-                    </pic:cNvPicPr>
-                  </pic:nvPicPr>
-                  <pic:blipFill>
-                    <a:blip r:embed="rId2"/>
-                    <a:stretch>
-                      <a:fillRect/>
-                    </a:stretch>
-                  </pic:blipFill>
-                  <pic:spPr bwMode="auto">
-                    <a:xfrm>
-                      <a:off x="0" y="0"/>
-                      <a:ext cx="5731510" cy="1111250"/>
-                    </a:xfrm>
-                    <a:prstGeom prst="rect">
-                      <a:avLst/>
-                    </a:prstGeom>
-                    <a:noFill/>
-                  </pic:spPr>
-                </pic:pic>
-              </a:graphicData>
-            </a:graphic>
-          </wp:inline>
-        </w:drawing>
-      </w:r>
-    </w:p>
-    <w:p>
-      <w:pPr>
-        <w:pStyle w:val="img1"/>
-        <w:rPr/>
-      </w:pPr>
-      <w:r>
-        <w:rPr/>
-        <w:t>Рисунок 1.1 — Організаційна структура підприємства</w:t>
-      </w:r>
-    </w:p>
-    <w:p>
-      <w:pPr>
-        <w:pStyle w:val="P1"/>
-        <w:rPr>
-          <w:lang w:val="uk-UA"/>
-        </w:rPr>
-      </w:pPr>
-      <w:r>
-        <w:rPr>
-          <w:lang w:val="uk-UA"/>
-        </w:rPr>
-      </w:r>
-    </w:p>
-    <w:p>
-      <w:pPr>
-        <w:pStyle w:val="P1"/>
-        <w:rPr>
-          <w:lang w:val="uk-UA"/>
-        </w:rPr>
-      </w:pPr>
-      <w:r>
-        <w:rPr>
-          <w:lang w:val="uk-UA"/>
-        </w:rPr>
-        <w:t>Обов’язки директора є керування компанією та делегація задач керівникам відділів.</w:t>
-      </w:r>
-    </w:p>
-    <w:p>
-      <w:pPr>
-        <w:pStyle w:val="P1"/>
-        <w:rPr>
-          <w:lang w:val="uk-UA"/>
-        </w:rPr>
-      </w:pPr>
-      <w:r>
-        <w:rPr>
-          <w:lang w:val="uk-UA"/>
-        </w:rPr>
-        <w:t>Обов’язки керівника відділу створення (збирання) новин є організація підлеглих для збору та створення новин.</w:t>
-      </w:r>
-    </w:p>
-    <w:p>
-      <w:pPr>
-        <w:pStyle w:val="P1"/>
-        <w:rPr>
-          <w:lang w:val="uk-UA"/>
-        </w:rPr>
-      </w:pPr>
-      <w:r>
-        <w:rPr>
-          <w:lang w:val="uk-UA"/>
-        </w:rPr>
-        <w:t>Обов’язки керівника відділу з соціальних мереж є делегація підлеглим налаштування каналів у соціальних мережах та публікації новин в них.</w:t>
-      </w:r>
-    </w:p>
-    <w:p>
-      <w:pPr>
-        <w:pStyle w:val="P1"/>
-        <w:rPr>
-          <w:lang w:val="uk-UA"/>
-        </w:rPr>
-      </w:pPr>
-      <w:r>
-        <w:rPr>
-          <w:lang w:val="uk-UA"/>
-        </w:rPr>
-        <w:t>Обов’язки керівника відділу публікації новин на вебсайті є організація підлеглих для створення та публікації новин на вебсайті компанії.</w:t>
+        <w:t xml:space="preserve">CMS </w:t>
+      </w:r>
+      <w:r>
+        <w:rPr>
+          <w:lang w:val="uk-UA"/>
+        </w:rPr>
+        <w:t>для публікації новин. Цей відділ має бути відповідальним за повночасову доступність сайту.</w:t>
+      </w:r>
+    </w:p>
+    <w:p>
+      <w:pPr>
+        <w:pStyle w:val="P1"/>
+        <w:rPr>
+          <w:lang w:val="uk-UA"/>
+        </w:rPr>
+      </w:pPr>
+      <w:r>
+        <w:rPr>
+          <w:lang w:val="uk-UA"/>
+        </w:rPr>
+        <w:t>Обов’язки бухгалтерії є керування ресурсами компанії.</w:t>
       </w:r>
     </w:p>
     <w:p>
@@ -1470,11 +1598,11 @@
         </w:tblCellMar>
       </w:tblPr>
       <w:tblGrid>
-        <w:gridCol w:w="372"/>
-        <w:gridCol w:w="1672"/>
-        <w:gridCol w:w="3372"/>
+        <w:gridCol w:w="371"/>
+        <w:gridCol w:w="1673"/>
+        <w:gridCol w:w="3371"/>
         <w:gridCol w:w="1805"/>
-        <w:gridCol w:w="1805"/>
+        <w:gridCol w:w="1806"/>
       </w:tblGrid>
       <w:tr>
         <w:trPr>
@@ -1482,7 +1610,7 @@
         </w:trPr>
         <w:tc>
           <w:tcPr>
-            <w:tcW w:w="372" w:type="dxa"/>
+            <w:tcW w:w="371" w:type="dxa"/>
             <w:tcBorders>
               <w:top w:val="single" w:sz="4" w:space="0" w:color="000000"/>
               <w:left w:val="single" w:sz="4" w:space="0" w:color="000000"/>
@@ -1492,7 +1620,7 @@
           </w:tcPr>
           <w:p>
             <w:pPr>
-              <w:pStyle w:val="Style16"/>
+              <w:pStyle w:val="user4"/>
               <w:spacing w:lineRule="auto" w:line="240"/>
               <w:ind w:hanging="0" w:left="0"/>
               <w:jc w:val="center"/>
@@ -1516,7 +1644,7 @@
         </w:tc>
         <w:tc>
           <w:tcPr>
-            <w:tcW w:w="1672" w:type="dxa"/>
+            <w:tcW w:w="1673" w:type="dxa"/>
             <w:tcBorders>
               <w:top w:val="single" w:sz="4" w:space="0" w:color="000000"/>
               <w:left w:val="single" w:sz="4" w:space="0" w:color="000000"/>
@@ -1526,7 +1654,7 @@
           </w:tcPr>
           <w:p>
             <w:pPr>
-              <w:pStyle w:val="Style16"/>
+              <w:pStyle w:val="user4"/>
               <w:spacing w:lineRule="auto" w:line="240"/>
               <w:ind w:hanging="0" w:left="0"/>
               <w:jc w:val="center"/>
@@ -1550,7 +1678,7 @@
         </w:tc>
         <w:tc>
           <w:tcPr>
-            <w:tcW w:w="3372" w:type="dxa"/>
+            <w:tcW w:w="3371" w:type="dxa"/>
             <w:tcBorders>
               <w:top w:val="single" w:sz="4" w:space="0" w:color="000000"/>
               <w:left w:val="single" w:sz="4" w:space="0" w:color="000000"/>
@@ -1560,7 +1688,7 @@
           </w:tcPr>
           <w:p>
             <w:pPr>
-              <w:pStyle w:val="Style16"/>
+              <w:pStyle w:val="user4"/>
               <w:spacing w:lineRule="auto" w:line="240"/>
               <w:ind w:hanging="0" w:left="0"/>
               <w:jc w:val="center"/>
@@ -1594,7 +1722,7 @@
           </w:tcPr>
           <w:p>
             <w:pPr>
-              <w:pStyle w:val="Style16"/>
+              <w:pStyle w:val="user4"/>
               <w:spacing w:lineRule="auto" w:line="240"/>
               <w:ind w:hanging="0" w:left="0"/>
               <w:jc w:val="center"/>
@@ -1618,7 +1746,7 @@
         </w:tc>
         <w:tc>
           <w:tcPr>
-            <w:tcW w:w="1805" w:type="dxa"/>
+            <w:tcW w:w="1806" w:type="dxa"/>
             <w:tcBorders>
               <w:top w:val="single" w:sz="4" w:space="0" w:color="000000"/>
               <w:left w:val="single" w:sz="4" w:space="0" w:color="000000"/>
@@ -1656,7 +1784,7 @@
         <w:trPr/>
         <w:tc>
           <w:tcPr>
-            <w:tcW w:w="372" w:type="dxa"/>
+            <w:tcW w:w="371" w:type="dxa"/>
             <w:tcBorders>
               <w:left w:val="single" w:sz="4" w:space="0" w:color="000000"/>
               <w:bottom w:val="single" w:sz="4" w:space="0" w:color="000000"/>
@@ -1665,7 +1793,7 @@
           </w:tcPr>
           <w:p>
             <w:pPr>
-              <w:pStyle w:val="Style16"/>
+              <w:pStyle w:val="user4"/>
               <w:spacing w:lineRule="auto" w:line="240"/>
               <w:ind w:hanging="0" w:left="0"/>
               <w:rPr>
@@ -1684,7 +1812,7 @@
         </w:tc>
         <w:tc>
           <w:tcPr>
-            <w:tcW w:w="1672" w:type="dxa"/>
+            <w:tcW w:w="1673" w:type="dxa"/>
             <w:tcBorders>
               <w:left w:val="single" w:sz="4" w:space="0" w:color="000000"/>
               <w:bottom w:val="single" w:sz="4" w:space="0" w:color="000000"/>
@@ -1693,7 +1821,7 @@
           </w:tcPr>
           <w:p>
             <w:pPr>
-              <w:pStyle w:val="Style16"/>
+              <w:pStyle w:val="user4"/>
               <w:spacing w:lineRule="auto" w:line="240"/>
               <w:ind w:hanging="0" w:left="0"/>
               <w:rPr>
@@ -1712,7 +1840,7 @@
         </w:tc>
         <w:tc>
           <w:tcPr>
-            <w:tcW w:w="3372" w:type="dxa"/>
+            <w:tcW w:w="3371" w:type="dxa"/>
             <w:tcBorders>
               <w:left w:val="single" w:sz="4" w:space="0" w:color="000000"/>
               <w:bottom w:val="single" w:sz="4" w:space="0" w:color="000000"/>
@@ -1768,7 +1896,7 @@
         </w:tc>
         <w:tc>
           <w:tcPr>
-            <w:tcW w:w="1805" w:type="dxa"/>
+            <w:tcW w:w="1806" w:type="dxa"/>
             <w:tcBorders>
               <w:left w:val="single" w:sz="4" w:space="0" w:color="000000"/>
               <w:bottom w:val="single" w:sz="4" w:space="0" w:color="000000"/>
@@ -1800,7 +1928,7 @@
         <w:trPr/>
         <w:tc>
           <w:tcPr>
-            <w:tcW w:w="372" w:type="dxa"/>
+            <w:tcW w:w="371" w:type="dxa"/>
             <w:tcBorders>
               <w:left w:val="single" w:sz="4" w:space="0" w:color="000000"/>
               <w:bottom w:val="single" w:sz="4" w:space="0" w:color="000000"/>
@@ -1809,7 +1937,7 @@
           </w:tcPr>
           <w:p>
             <w:pPr>
-              <w:pStyle w:val="Style16"/>
+              <w:pStyle w:val="user4"/>
               <w:spacing w:lineRule="auto" w:line="240"/>
               <w:ind w:hanging="0" w:left="0"/>
               <w:rPr>
@@ -1828,7 +1956,7 @@
         </w:tc>
         <w:tc>
           <w:tcPr>
-            <w:tcW w:w="1672" w:type="dxa"/>
+            <w:tcW w:w="1673" w:type="dxa"/>
             <w:tcBorders>
               <w:left w:val="single" w:sz="4" w:space="0" w:color="000000"/>
               <w:bottom w:val="single" w:sz="4" w:space="0" w:color="000000"/>
@@ -1837,7 +1965,7 @@
           </w:tcPr>
           <w:p>
             <w:pPr>
-              <w:pStyle w:val="Style16"/>
+              <w:pStyle w:val="user4"/>
               <w:spacing w:lineRule="auto" w:line="240"/>
               <w:ind w:hanging="0" w:left="0"/>
               <w:rPr>
@@ -1856,7 +1984,7 @@
         </w:tc>
         <w:tc>
           <w:tcPr>
-            <w:tcW w:w="3372" w:type="dxa"/>
+            <w:tcW w:w="3371" w:type="dxa"/>
             <w:tcBorders>
               <w:left w:val="single" w:sz="4" w:space="0" w:color="000000"/>
               <w:bottom w:val="single" w:sz="4" w:space="0" w:color="000000"/>
@@ -1865,7 +1993,7 @@
           </w:tcPr>
           <w:p>
             <w:pPr>
-              <w:pStyle w:val="Style16"/>
+              <w:pStyle w:val="user4"/>
               <w:spacing w:lineRule="auto" w:line="240"/>
               <w:ind w:hanging="0" w:left="0"/>
               <w:rPr>
@@ -1893,7 +2021,7 @@
           </w:tcPr>
           <w:p>
             <w:pPr>
-              <w:pStyle w:val="Style16"/>
+              <w:pStyle w:val="user4"/>
               <w:spacing w:lineRule="auto" w:line="240"/>
               <w:ind w:hanging="0" w:left="0"/>
               <w:rPr>
@@ -1912,7 +2040,7 @@
         </w:tc>
         <w:tc>
           <w:tcPr>
-            <w:tcW w:w="1805" w:type="dxa"/>
+            <w:tcW w:w="1806" w:type="dxa"/>
             <w:tcBorders>
               <w:left w:val="single" w:sz="4" w:space="0" w:color="000000"/>
               <w:bottom w:val="single" w:sz="4" w:space="0" w:color="000000"/>
@@ -1944,7 +2072,7 @@
         <w:trPr/>
         <w:tc>
           <w:tcPr>
-            <w:tcW w:w="372" w:type="dxa"/>
+            <w:tcW w:w="371" w:type="dxa"/>
             <w:tcBorders>
               <w:left w:val="single" w:sz="4" w:space="0" w:color="000000"/>
               <w:bottom w:val="single" w:sz="4" w:space="0" w:color="000000"/>
@@ -1953,7 +2081,7 @@
           </w:tcPr>
           <w:p>
             <w:pPr>
-              <w:pStyle w:val="Style16"/>
+              <w:pStyle w:val="user4"/>
               <w:spacing w:lineRule="auto" w:line="240"/>
               <w:ind w:hanging="0" w:left="0"/>
               <w:rPr>
@@ -1972,7 +2100,7 @@
         </w:tc>
         <w:tc>
           <w:tcPr>
-            <w:tcW w:w="1672" w:type="dxa"/>
+            <w:tcW w:w="1673" w:type="dxa"/>
             <w:tcBorders>
               <w:left w:val="single" w:sz="4" w:space="0" w:color="000000"/>
               <w:bottom w:val="single" w:sz="4" w:space="0" w:color="000000"/>
@@ -1981,7 +2109,7 @@
           </w:tcPr>
           <w:p>
             <w:pPr>
-              <w:pStyle w:val="Style16"/>
+              <w:pStyle w:val="user4"/>
               <w:spacing w:lineRule="auto" w:line="240"/>
               <w:ind w:hanging="0" w:left="0"/>
               <w:rPr>
@@ -2000,7 +2128,7 @@
         </w:tc>
         <w:tc>
           <w:tcPr>
-            <w:tcW w:w="3372" w:type="dxa"/>
+            <w:tcW w:w="3371" w:type="dxa"/>
             <w:tcBorders>
               <w:left w:val="single" w:sz="4" w:space="0" w:color="000000"/>
               <w:bottom w:val="single" w:sz="4" w:space="0" w:color="000000"/>
@@ -2009,7 +2137,7 @@
           </w:tcPr>
           <w:p>
             <w:pPr>
-              <w:pStyle w:val="Style16"/>
+              <w:pStyle w:val="user4"/>
               <w:spacing w:lineRule="auto" w:line="240"/>
               <w:ind w:hanging="0" w:left="0"/>
               <w:rPr>
@@ -2037,7 +2165,7 @@
           </w:tcPr>
           <w:p>
             <w:pPr>
-              <w:pStyle w:val="Style16"/>
+              <w:pStyle w:val="user4"/>
               <w:spacing w:lineRule="auto" w:line="240"/>
               <w:ind w:hanging="0" w:left="0"/>
               <w:rPr>
@@ -2056,7 +2184,7 @@
         </w:tc>
         <w:tc>
           <w:tcPr>
-            <w:tcW w:w="1805" w:type="dxa"/>
+            <w:tcW w:w="1806" w:type="dxa"/>
             <w:tcBorders>
               <w:left w:val="single" w:sz="4" w:space="0" w:color="000000"/>
               <w:bottom w:val="single" w:sz="4" w:space="0" w:color="000000"/>
@@ -2088,7 +2216,7 @@
         <w:trPr/>
         <w:tc>
           <w:tcPr>
-            <w:tcW w:w="372" w:type="dxa"/>
+            <w:tcW w:w="371" w:type="dxa"/>
             <w:tcBorders>
               <w:left w:val="single" w:sz="4" w:space="0" w:color="000000"/>
               <w:bottom w:val="single" w:sz="4" w:space="0" w:color="000000"/>
@@ -2097,7 +2225,7 @@
           </w:tcPr>
           <w:p>
             <w:pPr>
-              <w:pStyle w:val="Style16"/>
+              <w:pStyle w:val="user4"/>
               <w:spacing w:lineRule="auto" w:line="240"/>
               <w:ind w:hanging="0" w:left="0"/>
               <w:rPr>
@@ -2116,7 +2244,7 @@
         </w:tc>
         <w:tc>
           <w:tcPr>
-            <w:tcW w:w="1672" w:type="dxa"/>
+            <w:tcW w:w="1673" w:type="dxa"/>
             <w:tcBorders>
               <w:left w:val="single" w:sz="4" w:space="0" w:color="000000"/>
               <w:bottom w:val="single" w:sz="4" w:space="0" w:color="000000"/>
@@ -2125,7 +2253,7 @@
           </w:tcPr>
           <w:p>
             <w:pPr>
-              <w:pStyle w:val="Style16"/>
+              <w:pStyle w:val="user4"/>
               <w:spacing w:lineRule="auto" w:line="240"/>
               <w:ind w:hanging="0" w:left="0"/>
               <w:rPr>
@@ -2144,7 +2272,7 @@
         </w:tc>
         <w:tc>
           <w:tcPr>
-            <w:tcW w:w="3372" w:type="dxa"/>
+            <w:tcW w:w="3371" w:type="dxa"/>
             <w:tcBorders>
               <w:left w:val="single" w:sz="4" w:space="0" w:color="000000"/>
               <w:bottom w:val="single" w:sz="4" w:space="0" w:color="000000"/>
@@ -2153,7 +2281,7 @@
           </w:tcPr>
           <w:p>
             <w:pPr>
-              <w:pStyle w:val="Style16"/>
+              <w:pStyle w:val="user4"/>
               <w:spacing w:lineRule="auto" w:line="240"/>
               <w:ind w:hanging="0" w:left="0"/>
               <w:rPr>
@@ -2181,7 +2309,7 @@
           </w:tcPr>
           <w:p>
             <w:pPr>
-              <w:pStyle w:val="Style16"/>
+              <w:pStyle w:val="user4"/>
               <w:spacing w:lineRule="auto" w:line="240"/>
               <w:ind w:hanging="0" w:left="0"/>
               <w:rPr>
@@ -2200,7 +2328,7 @@
         </w:tc>
         <w:tc>
           <w:tcPr>
-            <w:tcW w:w="1805" w:type="dxa"/>
+            <w:tcW w:w="1806" w:type="dxa"/>
             <w:tcBorders>
               <w:left w:val="single" w:sz="4" w:space="0" w:color="000000"/>
               <w:bottom w:val="single" w:sz="4" w:space="0" w:color="000000"/>
@@ -2232,7 +2360,7 @@
         <w:trPr/>
         <w:tc>
           <w:tcPr>
-            <w:tcW w:w="372" w:type="dxa"/>
+            <w:tcW w:w="371" w:type="dxa"/>
             <w:tcBorders>
               <w:left w:val="single" w:sz="4" w:space="0" w:color="000000"/>
               <w:bottom w:val="single" w:sz="4" w:space="0" w:color="000000"/>
@@ -2241,7 +2369,7 @@
           </w:tcPr>
           <w:p>
             <w:pPr>
-              <w:pStyle w:val="Style16"/>
+              <w:pStyle w:val="user4"/>
               <w:spacing w:lineRule="auto" w:line="240"/>
               <w:ind w:hanging="0" w:left="0"/>
               <w:rPr>
@@ -2260,7 +2388,7 @@
         </w:tc>
         <w:tc>
           <w:tcPr>
-            <w:tcW w:w="1672" w:type="dxa"/>
+            <w:tcW w:w="1673" w:type="dxa"/>
             <w:tcBorders>
               <w:left w:val="single" w:sz="4" w:space="0" w:color="000000"/>
               <w:bottom w:val="single" w:sz="4" w:space="0" w:color="000000"/>
@@ -2269,7 +2397,7 @@
           </w:tcPr>
           <w:p>
             <w:pPr>
-              <w:pStyle w:val="Style16"/>
+              <w:pStyle w:val="user4"/>
               <w:spacing w:lineRule="auto" w:line="240"/>
               <w:ind w:hanging="0" w:left="0"/>
               <w:rPr>
@@ -2288,7 +2416,7 @@
         </w:tc>
         <w:tc>
           <w:tcPr>
-            <w:tcW w:w="3372" w:type="dxa"/>
+            <w:tcW w:w="3371" w:type="dxa"/>
             <w:tcBorders>
               <w:left w:val="single" w:sz="4" w:space="0" w:color="000000"/>
               <w:bottom w:val="single" w:sz="4" w:space="0" w:color="000000"/>
@@ -2297,7 +2425,7 @@
           </w:tcPr>
           <w:p>
             <w:pPr>
-              <w:pStyle w:val="Style16"/>
+              <w:pStyle w:val="user4"/>
               <w:spacing w:lineRule="auto" w:line="240"/>
               <w:ind w:hanging="0" w:left="0"/>
               <w:rPr>
@@ -2325,7 +2453,7 @@
           </w:tcPr>
           <w:p>
             <w:pPr>
-              <w:pStyle w:val="Style16"/>
+              <w:pStyle w:val="user4"/>
               <w:spacing w:lineRule="auto" w:line="240"/>
               <w:ind w:hanging="0" w:left="0"/>
               <w:rPr>
@@ -2344,7 +2472,7 @@
         </w:tc>
         <w:tc>
           <w:tcPr>
-            <w:tcW w:w="1805" w:type="dxa"/>
+            <w:tcW w:w="1806" w:type="dxa"/>
             <w:tcBorders>
               <w:left w:val="single" w:sz="4" w:space="0" w:color="000000"/>
               <w:bottom w:val="single" w:sz="4" w:space="0" w:color="000000"/>
@@ -2376,7 +2504,7 @@
         <w:trPr/>
         <w:tc>
           <w:tcPr>
-            <w:tcW w:w="372" w:type="dxa"/>
+            <w:tcW w:w="371" w:type="dxa"/>
             <w:tcBorders>
               <w:left w:val="single" w:sz="4" w:space="0" w:color="000000"/>
               <w:bottom w:val="single" w:sz="4" w:space="0" w:color="000000"/>
@@ -2385,7 +2513,7 @@
           </w:tcPr>
           <w:p>
             <w:pPr>
-              <w:pStyle w:val="Style16"/>
+              <w:pStyle w:val="user4"/>
               <w:spacing w:lineRule="auto" w:line="240"/>
               <w:ind w:hanging="0" w:left="0"/>
               <w:rPr>
@@ -2404,7 +2532,7 @@
         </w:tc>
         <w:tc>
           <w:tcPr>
-            <w:tcW w:w="1672" w:type="dxa"/>
+            <w:tcW w:w="1673" w:type="dxa"/>
             <w:tcBorders>
               <w:left w:val="single" w:sz="4" w:space="0" w:color="000000"/>
               <w:bottom w:val="single" w:sz="4" w:space="0" w:color="000000"/>
@@ -2413,7 +2541,7 @@
           </w:tcPr>
           <w:p>
             <w:pPr>
-              <w:pStyle w:val="Style16"/>
+              <w:pStyle w:val="user4"/>
               <w:spacing w:lineRule="auto" w:line="240"/>
               <w:ind w:hanging="0" w:left="0"/>
               <w:rPr>
@@ -2432,7 +2560,7 @@
         </w:tc>
         <w:tc>
           <w:tcPr>
-            <w:tcW w:w="3372" w:type="dxa"/>
+            <w:tcW w:w="3371" w:type="dxa"/>
             <w:tcBorders>
               <w:left w:val="single" w:sz="4" w:space="0" w:color="000000"/>
               <w:bottom w:val="single" w:sz="4" w:space="0" w:color="000000"/>
@@ -2441,7 +2569,7 @@
           </w:tcPr>
           <w:p>
             <w:pPr>
-              <w:pStyle w:val="Style16"/>
+              <w:pStyle w:val="user4"/>
               <w:spacing w:lineRule="auto" w:line="240"/>
               <w:ind w:hanging="0" w:left="0"/>
               <w:rPr>
@@ -2469,7 +2597,7 @@
           </w:tcPr>
           <w:p>
             <w:pPr>
-              <w:pStyle w:val="Style16"/>
+              <w:pStyle w:val="user4"/>
               <w:spacing w:lineRule="auto" w:line="240"/>
               <w:ind w:hanging="0" w:left="0"/>
               <w:rPr>
@@ -2488,7 +2616,7 @@
         </w:tc>
         <w:tc>
           <w:tcPr>
-            <w:tcW w:w="1805" w:type="dxa"/>
+            <w:tcW w:w="1806" w:type="dxa"/>
             <w:tcBorders>
               <w:left w:val="single" w:sz="4" w:space="0" w:color="000000"/>
               <w:bottom w:val="single" w:sz="4" w:space="0" w:color="000000"/>
@@ -2601,11 +2729,7 @@
       </w:pPr>
       <w:r>
         <w:rPr/>
-        <w:t>Х</w:t>
-      </w:r>
-      <w:r>
-        <w:rPr/>
-        <w:t>арактеристика діяльності</w:t>
+        <w:t>Характеристика діяльності</w:t>
       </w:r>
     </w:p>
     <w:p>
@@ -2647,11 +2771,7 @@
       </w:pPr>
       <w:r>
         <w:rPr/>
-        <w:t>Т</w:t>
-      </w:r>
-      <w:r>
-        <w:rPr/>
-        <w:t>ерміни та визначення понять</w:t>
+        <w:t>Терміни та визначення понять</w:t>
       </w:r>
     </w:p>
     <w:p>
@@ -2715,11 +2835,7 @@
       </w:pPr>
       <w:r>
         <w:rPr/>
-        <w:t>С</w:t>
-      </w:r>
-      <w:r>
-        <w:rPr/>
-        <w:t>истема управління якістю</w:t>
+        <w:t>Система управління якістю</w:t>
       </w:r>
     </w:p>
     <w:p>
@@ -2882,7 +2998,7 @@
           <wp:inline distT="0" distB="0" distL="0" distR="0">
             <wp:extent cx="2075815" cy="3636645"/>
             <wp:effectExtent l="0" t="0" r="0" b="0"/>
-            <wp:docPr id="2" name="Зображення2"/>
+            <wp:docPr id="1" name="Зображення2"/>
             <wp:cNvGraphicFramePr>
               <a:graphicFrameLocks xmlns:a="http://schemas.openxmlformats.org/drawingml/2006/main" noChangeAspect="1"/>
             </wp:cNvGraphicFramePr>
@@ -2890,13 +3006,13 @@
               <a:graphicData uri="http://schemas.openxmlformats.org/drawingml/2006/picture">
                 <pic:pic xmlns:pic="http://schemas.openxmlformats.org/drawingml/2006/picture">
                   <pic:nvPicPr>
-                    <pic:cNvPr id="2" name="Зображення2"/>
+                    <pic:cNvPr id="1" name="Зображення2"/>
                     <pic:cNvPicPr>
                       <a:picLocks noChangeAspect="1" noChangeArrowheads="1"/>
                     </pic:cNvPicPr>
                   </pic:nvPicPr>
                   <pic:blipFill>
-                    <a:blip r:embed="rId3"/>
+                    <a:blip r:embed="rId2"/>
                     <a:stretch>
                       <a:fillRect/>
                     </a:stretch>
@@ -2946,11 +3062,7 @@
       </w:pPr>
       <w:r>
         <w:rPr/>
-        <w:t>Ві</w:t>
-      </w:r>
-      <w:r>
-        <w:rPr/>
-        <w:t>дповідальність керівництва</w:t>
+        <w:t>Відповідальність керівництва</w:t>
       </w:r>
     </w:p>
     <w:p>
@@ -2992,11 +3104,7 @@
       </w:pPr>
       <w:r>
         <w:rPr/>
-        <w:t>К</w:t>
-      </w:r>
-      <w:r>
-        <w:rPr/>
-        <w:t>ерування ресурсами</w:t>
+        <w:t>Керування ресурсами</w:t>
       </w:r>
     </w:p>
     <w:p>
@@ -3055,11 +3163,7 @@
       </w:pPr>
       <w:r>
         <w:rPr/>
-        <w:t>В</w:t>
-      </w:r>
-      <w:r>
-        <w:rPr/>
-        <w:t>иготовлення продукції</w:t>
+        <w:t>Виготовлення продукції</w:t>
       </w:r>
     </w:p>
     <w:p>
@@ -3113,11 +3217,7 @@
       </w:pPr>
       <w:r>
         <w:rPr/>
-        <w:t>В</w:t>
-      </w:r>
-      <w:r>
-        <w:rPr/>
-        <w:t>имірювання, аналізування та поліпшування</w:t>
+        <w:t>Вимірювання, аналізування та поліпшування</w:t>
       </w:r>
     </w:p>
     <w:p>
@@ -3301,156 +3401,6 @@
           <w:lang w:val="uk-UA"/>
         </w:rPr>
         <w:t>Було створено уявну компанію міських новин та розвинено документацію для неї.</w:t>
-      </w:r>
-    </w:p>
-    <w:p>
-      <w:pPr>
-        <w:pStyle w:val="p11"/>
-        <w:rPr>
-          <w:lang w:val="uk-UA"/>
-        </w:rPr>
-      </w:pPr>
-      <w:r>
-        <w:rPr>
-          <w:lang w:val="uk-UA"/>
-        </w:rPr>
-      </w:r>
-    </w:p>
-    <w:p>
-      <w:pPr>
-        <w:pStyle w:val="h11"/>
-        <w:rPr/>
-      </w:pPr>
-      <w:r>
-        <w:rPr/>
-        <w:t>Питання</w:t>
-      </w:r>
-    </w:p>
-    <w:p>
-      <w:pPr>
-        <w:pStyle w:val="H2"/>
-        <w:rPr/>
-      </w:pPr>
-      <w:r>
-        <w:rPr/>
-        <w:t>Що таке якість?</w:t>
-      </w:r>
-    </w:p>
-    <w:p>
-      <w:pPr>
-        <w:pStyle w:val="P1"/>
-        <w:rPr/>
-      </w:pPr>
-      <w:r>
-        <w:rPr/>
-      </w:r>
-    </w:p>
-    <w:p>
-      <w:pPr>
-        <w:pStyle w:val="P1"/>
-        <w:rPr/>
-      </w:pPr>
-      <w:r>
-        <w:rPr/>
-        <w:t>Властивість об’єкта, яка визначає його вартість та цінність для інших.</w:t>
-      </w:r>
-    </w:p>
-    <w:p>
-      <w:pPr>
-        <w:pStyle w:val="P1"/>
-        <w:rPr/>
-      </w:pPr>
-      <w:r>
-        <w:rPr/>
-      </w:r>
-    </w:p>
-    <w:p>
-      <w:pPr>
-        <w:pStyle w:val="H2"/>
-        <w:rPr/>
-      </w:pPr>
-      <w:r>
-        <w:rPr/>
-        <w:t>Якими принципами управління якістю необхідно керуватися для поліпшення діяльності організації?</w:t>
-      </w:r>
-    </w:p>
-    <w:p>
-      <w:pPr>
-        <w:pStyle w:val="P1"/>
-        <w:rPr/>
-      </w:pPr>
-      <w:r>
-        <w:rPr/>
-      </w:r>
-    </w:p>
-    <w:p>
-      <w:pPr>
-        <w:pStyle w:val="P1"/>
-        <w:rPr/>
-      </w:pPr>
-      <w:r>
-        <w:rPr/>
-        <w:t>Основні принципи управління якістю, якими потрібно керуватися для поліпшення діяльності організації:</w:t>
-      </w:r>
-    </w:p>
-    <w:p>
-      <w:pPr>
-        <w:pStyle w:val="P1"/>
-        <w:rPr/>
-      </w:pPr>
-      <w:r>
-        <w:rPr/>
-        <w:t>- лідерство;</w:t>
-      </w:r>
-    </w:p>
-    <w:p>
-      <w:pPr>
-        <w:pStyle w:val="P1"/>
-        <w:rPr/>
-      </w:pPr>
-      <w:r>
-        <w:rPr/>
-        <w:t>- задіяність персоналу;</w:t>
-      </w:r>
-    </w:p>
-    <w:p>
-      <w:pPr>
-        <w:pStyle w:val="P1"/>
-        <w:rPr/>
-      </w:pPr>
-      <w:r>
-        <w:rPr/>
-        <w:t>- процесний підхід;</w:t>
-      </w:r>
-    </w:p>
-    <w:p>
-      <w:pPr>
-        <w:pStyle w:val="P1"/>
-        <w:rPr/>
-      </w:pPr>
-      <w:r>
-        <w:rPr/>
-        <w:t>- поліпшення;</w:t>
-      </w:r>
-    </w:p>
-    <w:p>
-      <w:pPr>
-        <w:pStyle w:val="P1"/>
-        <w:rPr/>
-      </w:pPr>
-      <w:r>
-        <w:rPr/>
-        <w:t>- прийняття рішень на підставі фактичних даних;</w:t>
-      </w:r>
-    </w:p>
-    <w:p>
-      <w:pPr>
-        <w:pStyle w:val="P1"/>
-        <w:rPr/>
-      </w:pPr>
-      <w:r>
-        <w:rPr/>
-        <w:t>- керування взаємовідносинами.</w:t>
       </w:r>
     </w:p>
     <w:sectPr>
@@ -4658,19 +4608,19 @@
       <w:lang w:val="en-US" w:eastAsia="uk-UA"/>
     </w:rPr>
   </w:style>
-  <w:style w:type="character" w:styleId="Style12">
-    <w:name w:val="Символ нумерації"/>
+  <w:style w:type="character" w:styleId="user">
+    <w:name w:val="Символ нумерації (user)"/>
     <w:qFormat/>
     <w:rPr/>
   </w:style>
-  <w:style w:type="character" w:styleId="Style13">
-    <w:name w:val="Маркери"/>
+  <w:style w:type="character" w:styleId="user1">
+    <w:name w:val="Маркери (user)"/>
     <w:qFormat/>
     <w:rPr>
       <w:rFonts w:ascii="OpenSymbol" w:hAnsi="OpenSymbol" w:eastAsia="OpenSymbol" w:cs="OpenSymbol"/>
     </w:rPr>
   </w:style>
-  <w:style w:type="paragraph" w:styleId="Style14">
+  <w:style w:type="paragraph" w:styleId="Style12">
     <w:name w:val="Заголовок"/>
     <w:basedOn w:val="Normal"/>
     <w:next w:val="BodyText"/>
@@ -4680,7 +4630,7 @@
       <w:spacing w:before="240" w:after="120"/>
     </w:pPr>
     <w:rPr>
-      <w:rFonts w:ascii="Liberation Sans" w:hAnsi="Liberation Sans" w:eastAsia="Microsoft YaHei" w:cs="Lucida Sans"/>
+      <w:rFonts w:ascii="Liberation Sans" w:hAnsi="Liberation Sans" w:eastAsia="Microsoft YaHei" w:cs="Arial Unicode MS"/>
       <w:sz w:val="28"/>
       <w:szCs w:val="28"/>
     </w:rPr>
@@ -4717,7 +4667,7 @@
       <w:szCs w:val="24"/>
     </w:rPr>
   </w:style>
-  <w:style w:type="paragraph" w:styleId="Style15">
+  <w:style w:type="paragraph" w:styleId="Style13">
     <w:name w:val="Покажчик"/>
     <w:basedOn w:val="Normal"/>
     <w:qFormat/>
@@ -4725,10 +4675,10 @@
       <w:suppressLineNumbers/>
     </w:pPr>
     <w:rPr>
-      <w:rFonts w:cs="Lucida Sans"/>
+      <w:rFonts w:cs="Arial Unicode MS"/>
     </w:rPr>
   </w:style>
-  <w:style w:type="paragraph" w:styleId="user">
+  <w:style w:type="paragraph" w:styleId="user2">
     <w:name w:val="Заголовок (user)"/>
     <w:basedOn w:val="Normal"/>
     <w:next w:val="BodyText"/>
@@ -4738,12 +4688,12 @@
       <w:spacing w:before="240" w:after="120"/>
     </w:pPr>
     <w:rPr>
-      <w:rFonts w:ascii="Liberation Sans" w:hAnsi="Liberation Sans" w:eastAsia="Microsoft YaHei" w:cs="Arial Unicode MS"/>
+      <w:rFonts w:ascii="Liberation Sans" w:hAnsi="Liberation Sans" w:eastAsia="Microsoft YaHei" w:cs="Lucida Sans"/>
       <w:sz w:val="28"/>
       <w:szCs w:val="28"/>
     </w:rPr>
   </w:style>
-  <w:style w:type="paragraph" w:styleId="user1">
+  <w:style w:type="paragraph" w:styleId="user3">
     <w:name w:val="Покажчик (user)"/>
     <w:basedOn w:val="Normal"/>
     <w:qFormat/>
@@ -4751,12 +4701,12 @@
       <w:suppressLineNumbers/>
     </w:pPr>
     <w:rPr>
-      <w:rFonts w:cs="Arial Unicode MS"/>
+      <w:rFonts w:cs="Lucida Sans"/>
     </w:rPr>
   </w:style>
   <w:style w:type="paragraph" w:styleId="IndexHeading">
     <w:name w:val="index heading"/>
-    <w:basedOn w:val="user"/>
+    <w:basedOn w:val="Style12"/>
     <w:pPr/>
     <w:rPr/>
   </w:style>
@@ -5034,8 +4984,8 @@
     </w:pPr>
     <w:rPr/>
   </w:style>
-  <w:style w:type="paragraph" w:styleId="Style16">
-    <w:name w:val="Вміст таблиці"/>
+  <w:style w:type="paragraph" w:styleId="user4">
+    <w:name w:val="Вміст таблиці (user)"/>
     <w:basedOn w:val="Normal"/>
     <w:qFormat/>
     <w:pPr>
@@ -5044,8 +4994,8 @@
     </w:pPr>
     <w:rPr/>
   </w:style>
-  <w:style w:type="numbering" w:styleId="user2" w:default="1">
-    <w:name w:val="Без маркерів (user)"/>
+  <w:style w:type="numbering" w:styleId="Style14" w:default="1">
+    <w:name w:val="Без маркерів"/>
     <w:uiPriority w:val="99"/>
     <w:semiHidden/>
     <w:unhideWhenUsed/>

</xml_diff>

<commit_message>
chore: took in the notes from lector, SP1 remaking
</commit_message>
<xml_diff>
--- a/51SP Sertyficazija PZ/1/SP_KNT-116m_Onyshchenko_15_PR1.docx
+++ b/51SP Sertyficazija PZ/1/SP_KNT-116m_Onyshchenko_15_PR1.docx
@@ -786,19 +786,57 @@
       </w:pPr>
       <w:r>
         <w:rPr/>
+        <w:t xml:space="preserve">Створена медіа компанія займається новинами села Комишуваха. Компанією керує директор, </w:t>
+      </w:r>
+      <w:r>
+        <w:rPr/>
+        <w:t xml:space="preserve">він займається системою управління якістю. У компанії є ІТ відділ (складається з двох осіб: один відповідальний за фронтенд та публікацію новин, другий за бекенд) цей відділ відповідальний за розробку та підтримку вебсайту компанії та публікації новин на сторінках у соціальних мережах: </w:t>
+      </w:r>
+      <w:r>
+        <w:rPr>
+          <w:lang w:val="en-US"/>
+        </w:rPr>
+        <w:t>Telegram, Instagram, Facebook.</w:t>
+      </w:r>
+      <w:r>
+        <w:rPr>
+          <w:lang w:val="uk-UA"/>
+        </w:rPr>
+        <w:t xml:space="preserve"> У соціальних мережах публікуються лише посилання на новинну статтю з сайту. Також у компанії є команда збору новин, три людини: один водій, один оператор, один репортер.</w:t>
+      </w:r>
+    </w:p>
+    <w:p>
+      <w:pPr>
+        <w:pStyle w:val="P1"/>
+        <w:rPr/>
+      </w:pPr>
+      <w:r>
+        <w:rPr/>
+      </w:r>
+    </w:p>
+    <w:p>
+      <w:pPr>
+        <w:pStyle w:val="P1"/>
+        <w:rPr/>
+      </w:pPr>
+      <w:r>
+        <w:rPr/>
+      </w:r>
+    </w:p>
+    <w:p>
+      <w:pPr>
+        <w:pStyle w:val="P1"/>
+        <w:rPr/>
+      </w:pPr>
+      <w:r>
+        <w:rPr/>
         <w:t xml:space="preserve">Підприємство медіа компанії спеціалізується на виготовленні та розповсюдженні медіа контенту. </w:t>
       </w:r>
       <w:r>
         <w:rPr>
           <w:lang w:val="uk-UA"/>
         </w:rPr>
-        <w:t xml:space="preserve">Медіа контент це всілякий аудіовізуальний та цифровий контент, який користувач може переглядати (споживати). </w:t>
-      </w:r>
-      <w:r>
-        <w:rPr>
-          <w:lang w:val="uk-UA"/>
-        </w:rPr>
-        <w:t>Уявімо, що наша компанія виробляє міські новини.</w:t>
+        <w:t>Медіа контент це всілякий аудіовізуальний та цифровий контент, який користувач може переглядати (споживати). Уявімо, що наша компанія виробляє міські новини.</w:t>
       </w:r>
     </w:p>
     <w:p>
@@ -1126,13 +1164,7 @@
         <w:rPr>
           <w:lang w:val="uk-UA"/>
         </w:rPr>
-        <w:t>О</w:t>
-      </w:r>
-      <w:r>
-        <w:rPr>
-          <w:lang w:val="uk-UA"/>
-        </w:rPr>
-        <w:t>ргструктура компанії буде наступною:</w:t>
+        <w:t>Оргструктура компанії буде наступною:</w:t>
       </w:r>
     </w:p>
     <w:p>
@@ -1400,19 +1432,7 @@
         <w:rPr>
           <w:lang w:val="uk-UA"/>
         </w:rPr>
-        <w:t xml:space="preserve">Обов’язки керівника відділу </w:t>
-      </w:r>
-      <w:r>
-        <w:rPr>
-          <w:lang w:val="uk-UA"/>
-        </w:rPr>
-        <w:t xml:space="preserve">є </w:t>
-      </w:r>
-      <w:r>
-        <w:rPr>
-          <w:lang w:val="uk-UA"/>
-        </w:rPr>
-        <w:t>створення (збирання) новин є організація підлеглих для збору та створення новин. Цей відділ також має займатися перевіркою новин на достовірність.</w:t>
+        <w:t>Обов’язки керівника відділу є створення (збирання) новин є організація підлеглих для збору та створення новин. Цей відділ також має займатися перевіркою новин на достовірність.</w:t>
       </w:r>
     </w:p>
     <w:p>
@@ -1598,8 +1618,8 @@
         </w:tblCellMar>
       </w:tblPr>
       <w:tblGrid>
-        <w:gridCol w:w="371"/>
-        <w:gridCol w:w="1673"/>
+        <w:gridCol w:w="370"/>
+        <w:gridCol w:w="1674"/>
         <w:gridCol w:w="3371"/>
         <w:gridCol w:w="1805"/>
         <w:gridCol w:w="1806"/>
@@ -1610,7 +1630,7 @@
         </w:trPr>
         <w:tc>
           <w:tcPr>
-            <w:tcW w:w="371" w:type="dxa"/>
+            <w:tcW w:w="370" w:type="dxa"/>
             <w:tcBorders>
               <w:top w:val="single" w:sz="4" w:space="0" w:color="000000"/>
               <w:left w:val="single" w:sz="4" w:space="0" w:color="000000"/>
@@ -1644,7 +1664,7 @@
         </w:tc>
         <w:tc>
           <w:tcPr>
-            <w:tcW w:w="1673" w:type="dxa"/>
+            <w:tcW w:w="1674" w:type="dxa"/>
             <w:tcBorders>
               <w:top w:val="single" w:sz="4" w:space="0" w:color="000000"/>
               <w:left w:val="single" w:sz="4" w:space="0" w:color="000000"/>
@@ -1784,7 +1804,7 @@
         <w:trPr/>
         <w:tc>
           <w:tcPr>
-            <w:tcW w:w="371" w:type="dxa"/>
+            <w:tcW w:w="370" w:type="dxa"/>
             <w:tcBorders>
               <w:left w:val="single" w:sz="4" w:space="0" w:color="000000"/>
               <w:bottom w:val="single" w:sz="4" w:space="0" w:color="000000"/>
@@ -1812,7 +1832,7 @@
         </w:tc>
         <w:tc>
           <w:tcPr>
-            <w:tcW w:w="1673" w:type="dxa"/>
+            <w:tcW w:w="1674" w:type="dxa"/>
             <w:tcBorders>
               <w:left w:val="single" w:sz="4" w:space="0" w:color="000000"/>
               <w:bottom w:val="single" w:sz="4" w:space="0" w:color="000000"/>
@@ -1928,7 +1948,7 @@
         <w:trPr/>
         <w:tc>
           <w:tcPr>
-            <w:tcW w:w="371" w:type="dxa"/>
+            <w:tcW w:w="370" w:type="dxa"/>
             <w:tcBorders>
               <w:left w:val="single" w:sz="4" w:space="0" w:color="000000"/>
               <w:bottom w:val="single" w:sz="4" w:space="0" w:color="000000"/>
@@ -1956,7 +1976,7 @@
         </w:tc>
         <w:tc>
           <w:tcPr>
-            <w:tcW w:w="1673" w:type="dxa"/>
+            <w:tcW w:w="1674" w:type="dxa"/>
             <w:tcBorders>
               <w:left w:val="single" w:sz="4" w:space="0" w:color="000000"/>
               <w:bottom w:val="single" w:sz="4" w:space="0" w:color="000000"/>
@@ -2072,7 +2092,7 @@
         <w:trPr/>
         <w:tc>
           <w:tcPr>
-            <w:tcW w:w="371" w:type="dxa"/>
+            <w:tcW w:w="370" w:type="dxa"/>
             <w:tcBorders>
               <w:left w:val="single" w:sz="4" w:space="0" w:color="000000"/>
               <w:bottom w:val="single" w:sz="4" w:space="0" w:color="000000"/>
@@ -2100,7 +2120,7 @@
         </w:tc>
         <w:tc>
           <w:tcPr>
-            <w:tcW w:w="1673" w:type="dxa"/>
+            <w:tcW w:w="1674" w:type="dxa"/>
             <w:tcBorders>
               <w:left w:val="single" w:sz="4" w:space="0" w:color="000000"/>
               <w:bottom w:val="single" w:sz="4" w:space="0" w:color="000000"/>
@@ -2216,7 +2236,7 @@
         <w:trPr/>
         <w:tc>
           <w:tcPr>
-            <w:tcW w:w="371" w:type="dxa"/>
+            <w:tcW w:w="370" w:type="dxa"/>
             <w:tcBorders>
               <w:left w:val="single" w:sz="4" w:space="0" w:color="000000"/>
               <w:bottom w:val="single" w:sz="4" w:space="0" w:color="000000"/>
@@ -2244,7 +2264,7 @@
         </w:tc>
         <w:tc>
           <w:tcPr>
-            <w:tcW w:w="1673" w:type="dxa"/>
+            <w:tcW w:w="1674" w:type="dxa"/>
             <w:tcBorders>
               <w:left w:val="single" w:sz="4" w:space="0" w:color="000000"/>
               <w:bottom w:val="single" w:sz="4" w:space="0" w:color="000000"/>
@@ -2360,7 +2380,7 @@
         <w:trPr/>
         <w:tc>
           <w:tcPr>
-            <w:tcW w:w="371" w:type="dxa"/>
+            <w:tcW w:w="370" w:type="dxa"/>
             <w:tcBorders>
               <w:left w:val="single" w:sz="4" w:space="0" w:color="000000"/>
               <w:bottom w:val="single" w:sz="4" w:space="0" w:color="000000"/>
@@ -2388,7 +2408,7 @@
         </w:tc>
         <w:tc>
           <w:tcPr>
-            <w:tcW w:w="1673" w:type="dxa"/>
+            <w:tcW w:w="1674" w:type="dxa"/>
             <w:tcBorders>
               <w:left w:val="single" w:sz="4" w:space="0" w:color="000000"/>
               <w:bottom w:val="single" w:sz="4" w:space="0" w:color="000000"/>
@@ -2504,7 +2524,7 @@
         <w:trPr/>
         <w:tc>
           <w:tcPr>
-            <w:tcW w:w="371" w:type="dxa"/>
+            <w:tcW w:w="370" w:type="dxa"/>
             <w:tcBorders>
               <w:left w:val="single" w:sz="4" w:space="0" w:color="000000"/>
               <w:bottom w:val="single" w:sz="4" w:space="0" w:color="000000"/>
@@ -2532,7 +2552,7 @@
         </w:tc>
         <w:tc>
           <w:tcPr>
-            <w:tcW w:w="1673" w:type="dxa"/>
+            <w:tcW w:w="1674" w:type="dxa"/>
             <w:tcBorders>
               <w:left w:val="single" w:sz="4" w:space="0" w:color="000000"/>
               <w:bottom w:val="single" w:sz="4" w:space="0" w:color="000000"/>

</xml_diff>

<commit_message>
chore: had a meeting PM P
</commit_message>
<xml_diff>
--- a/51SP Sertyficazija PZ/1/SP_KNT-116m_Onyshchenko_15_PR1.docx
+++ b/51SP Sertyficazija PZ/1/SP_KNT-116m_Onyshchenko_15_PR1.docx
@@ -802,55 +802,67 @@
         <w:rPr>
           <w:lang w:val="uk-UA"/>
         </w:rPr>
-        <w:t xml:space="preserve"> У соціальних мережах публікуються лише посилання на новинну статтю з сайту. Також у компанії є команда збору новин, три людини: один водій, один оператор, один репортер.</w:t>
-      </w:r>
-    </w:p>
-    <w:p>
-      <w:pPr>
-        <w:pStyle w:val="P1"/>
-        <w:rPr/>
-      </w:pPr>
-      <w:r>
-        <w:rPr/>
-      </w:r>
-    </w:p>
-    <w:p>
-      <w:pPr>
-        <w:pStyle w:val="P1"/>
-        <w:rPr/>
-      </w:pPr>
-      <w:r>
-        <w:rPr/>
-      </w:r>
-    </w:p>
-    <w:p>
-      <w:pPr>
-        <w:pStyle w:val="P1"/>
-        <w:rPr/>
-      </w:pPr>
-      <w:r>
-        <w:rPr/>
-        <w:t xml:space="preserve">Підприємство медіа компанії спеціалізується на виготовленні та розповсюдженні медіа контенту. </w:t>
-      </w:r>
-      <w:r>
-        <w:rPr>
-          <w:lang w:val="uk-UA"/>
-        </w:rPr>
-        <w:t>Медіа контент це всілякий аудіовізуальний та цифровий контент, який користувач може переглядати (споживати). Уявімо, що наша компанія виробляє міські новини.</w:t>
-      </w:r>
-    </w:p>
-    <w:p>
-      <w:pPr>
-        <w:pStyle w:val="P1"/>
-        <w:rPr>
-          <w:lang w:val="uk-UA"/>
-        </w:rPr>
-      </w:pPr>
-      <w:r>
-        <w:rPr>
-          <w:lang w:val="uk-UA"/>
-        </w:rPr>
-        <w:t>Медіа компанії функціонують в три етапи:</w:t>
+        <w:t xml:space="preserve"> У соціальних мережах публікуються лише посилання на новинну статтю з сайту. Також у компанії є команда збору новин, три людини: один водій, один оператор, один репортер. У компанії є одна людина, відповідальна за приймання людей на роботу та бухгалтерію.</w:t>
+      </w:r>
+    </w:p>
+    <w:p>
+      <w:pPr>
+        <w:pStyle w:val="P1"/>
+        <w:rPr>
+          <w:lang w:val="uk-UA"/>
+        </w:rPr>
+      </w:pPr>
+      <w:r>
+        <w:rPr>
+          <w:lang w:val="uk-UA"/>
+        </w:rPr>
+        <w:t xml:space="preserve">Через невеликий масштаб компанії ІТ відділ використовує безкоштовне програмне забезпечення з відкритим кодом. Як редактор коду використовується </w:t>
+      </w:r>
+      <w:r>
+        <w:rPr>
+          <w:lang w:val="en-US"/>
+        </w:rPr>
+        <w:t xml:space="preserve">Visual Studio Code. </w:t>
+      </w:r>
+      <w:r>
+        <w:rPr>
+          <w:lang w:val="uk-UA"/>
+        </w:rPr>
+        <w:t xml:space="preserve">Як система менеджменту контенту використовується </w:t>
+      </w:r>
+      <w:r>
+        <w:rPr>
+          <w:lang w:val="en-US"/>
+        </w:rPr>
+        <w:t>Strapi.</w:t>
+      </w:r>
+    </w:p>
+    <w:p>
+      <w:pPr>
+        <w:pStyle w:val="P1"/>
+        <w:rPr>
+          <w:lang w:val="uk-UA"/>
+        </w:rPr>
+      </w:pPr>
+      <w:r>
+        <w:rPr>
+          <w:lang w:val="uk-UA"/>
+        </w:rPr>
+        <w:t>Замовником компанії є читач новин. Спосіб заробітку є публікація реклами на сайті. За це відповідальний ІТ відділ.</w:t>
+      </w:r>
+    </w:p>
+    <w:p>
+      <w:pPr>
+        <w:pStyle w:val="P1"/>
+        <w:rPr>
+          <w:lang w:val="uk-UA"/>
+        </w:rPr>
+      </w:pPr>
+      <w:r>
+        <w:rPr>
+          <w:lang w:val="uk-UA"/>
+        </w:rPr>
+        <w:t>Ресурси компанії наступні:</w:t>
       </w:r>
     </w:p>
     <w:p>
@@ -874,7 +886,19 @@
         <w:rPr>
           <w:lang w:val="uk-UA"/>
         </w:rPr>
-        <w:t>створення: новий контент обраного формату створюється;</w:t>
+        <w:t xml:space="preserve">1 автомобіль </w:t>
+      </w:r>
+      <w:r>
+        <w:rPr>
+          <w:lang w:val="en-US"/>
+        </w:rPr>
+        <w:t xml:space="preserve">Skoda Fabia 2008, </w:t>
+      </w:r>
+      <w:r>
+        <w:rPr>
+          <w:lang w:val="uk-UA"/>
+        </w:rPr>
+        <w:t>відповідальний водій;</w:t>
       </w:r>
     </w:p>
     <w:p>
@@ -898,7 +922,19 @@
         <w:rPr>
           <w:lang w:val="uk-UA"/>
         </w:rPr>
-        <w:t>маркетинг: інформація про цей контент розповсюджується;</w:t>
+        <w:t xml:space="preserve">1 відеокамера </w:t>
+      </w:r>
+      <w:r>
+        <w:rPr>
+          <w:lang w:val="en-US"/>
+        </w:rPr>
+        <w:t xml:space="preserve">Sony a7 V, </w:t>
+      </w:r>
+      <w:r>
+        <w:rPr>
+          <w:lang w:val="uk-UA"/>
+        </w:rPr>
+        <w:t>відповідальний оператор;</w:t>
       </w:r>
     </w:p>
     <w:p>
@@ -922,27 +958,7 @@
         <w:rPr>
           <w:lang w:val="uk-UA"/>
         </w:rPr>
-        <w:t>розповсюдження: цей контент рекламується та передається на відповідні платформи, де його можна спожити.</w:t>
-      </w:r>
-    </w:p>
-    <w:p>
-      <w:pPr>
-        <w:pStyle w:val="P1"/>
-        <w:widowControl/>
-        <w:suppressAutoHyphens w:val="true"/>
-        <w:bidi w:val="0"/>
-        <w:spacing w:lineRule="auto" w:line="360" w:before="0" w:after="0"/>
-        <w:ind w:firstLine="850" w:left="0" w:right="0"/>
-        <w:jc w:val="both"/>
-        <w:rPr>
-          <w:lang w:val="uk-UA"/>
-        </w:rPr>
-      </w:pPr>
-      <w:r>
-        <w:rPr>
-          <w:lang w:val="uk-UA"/>
-        </w:rPr>
-        <w:t>Медіа компанії потребують таке програмне забезпечення:</w:t>
+        <w:t>1 мікрофон Sennheiser MD46, відповідальний репортер;</w:t>
       </w:r>
     </w:p>
     <w:p>
@@ -966,7 +982,7 @@
         <w:rPr>
           <w:lang w:val="uk-UA"/>
         </w:rPr>
-        <w:t>програми для соціальних мереж: медіа компанія потребує допомоги в розповсюджені контенту, для цього можуть бути використані соціальні мережі;</w:t>
+        <w:t>2 ноутбуки Apple MacBook Air, відповідальний ІТ відділ;</w:t>
       </w:r>
     </w:p>
     <w:p>
@@ -983,66 +999,179 @@
         <w:ind w:firstLine="850" w:left="0" w:right="0"/>
         <w:jc w:val="both"/>
         <w:rPr>
-          <w:lang w:val="uk-UA"/>
-        </w:rPr>
-      </w:pPr>
-      <w:r>
-        <w:rPr>
-          <w:lang w:val="uk-UA"/>
-        </w:rPr>
-        <w:t>системи менеджменту контенту (</w:t>
-      </w:r>
-      <w:r>
-        <w:rPr>
           <w:lang w:val="en-US"/>
         </w:rPr>
-        <w:t xml:space="preserve">CMS): </w:t>
-      </w:r>
-      <w:r>
-        <w:rPr>
-          <w:lang w:val="uk-UA"/>
-        </w:rPr>
-        <w:t>системи для керування контентом.</w:t>
-      </w:r>
-    </w:p>
-    <w:p>
-      <w:pPr>
-        <w:pStyle w:val="P1"/>
-        <w:widowControl/>
-        <w:suppressAutoHyphens w:val="true"/>
-        <w:bidi w:val="0"/>
-        <w:spacing w:lineRule="auto" w:line="360" w:before="0" w:after="0"/>
-        <w:ind w:firstLine="850" w:left="0" w:right="0"/>
-        <w:jc w:val="both"/>
-        <w:rPr>
-          <w:lang w:val="uk-UA"/>
-        </w:rPr>
-      </w:pPr>
-      <w:r>
-        <w:rPr>
-          <w:lang w:val="uk-UA"/>
-        </w:rPr>
-        <w:t>Замовником для компанії виступає читач. Заробіток компанії здійснюється через показ реклами на сайті та на сторінках в соціальних мережах.</w:t>
-      </w:r>
-    </w:p>
-    <w:p>
-      <w:pPr>
-        <w:pStyle w:val="P1"/>
-        <w:widowControl/>
-        <w:suppressAutoHyphens w:val="true"/>
-        <w:bidi w:val="0"/>
-        <w:spacing w:lineRule="auto" w:line="360" w:before="0" w:after="0"/>
-        <w:ind w:firstLine="850" w:left="0" w:right="0"/>
-        <w:jc w:val="both"/>
-        <w:rPr>
-          <w:lang w:val="uk-UA"/>
-        </w:rPr>
-      </w:pPr>
-      <w:r>
-        <w:rPr>
-          <w:lang w:val="uk-UA"/>
-        </w:rPr>
-        <w:t>Особливостями новинного сайту є:</w:t>
+      </w:pPr>
+      <w:r>
+        <w:rPr>
+          <w:lang w:val="en-US"/>
+        </w:rPr>
+        <w:t xml:space="preserve">1 </w:t>
+      </w:r>
+      <w:r>
+        <w:rPr>
+          <w:lang w:val="uk-UA"/>
+        </w:rPr>
+        <w:t>монітор BenQ GW2486TC, відповідальна особа бекенду.</w:t>
+      </w:r>
+    </w:p>
+    <w:p>
+      <w:pPr>
+        <w:pStyle w:val="P1"/>
+        <w:rPr>
+          <w:lang w:val="uk-UA"/>
+        </w:rPr>
+      </w:pPr>
+      <w:r>
+        <w:rPr>
+          <w:lang w:val="uk-UA"/>
+        </w:rPr>
+      </w:r>
+    </w:p>
+    <w:p>
+      <w:pPr>
+        <w:pStyle w:val="H2"/>
+        <w:rPr/>
+      </w:pPr>
+      <w:r>
+        <w:rPr/>
+        <w:t>Організаційна структура підприємства з коротким описом обов’язків</w:t>
+      </w:r>
+    </w:p>
+    <w:p>
+      <w:pPr>
+        <w:pStyle w:val="P1"/>
+        <w:rPr>
+          <w:lang w:val="uk-UA"/>
+        </w:rPr>
+      </w:pPr>
+      <w:r>
+        <w:rPr>
+          <w:lang w:val="uk-UA"/>
+        </w:rPr>
+      </w:r>
+    </w:p>
+    <w:p>
+      <w:pPr>
+        <w:pStyle w:val="P1"/>
+        <w:rPr>
+          <w:lang w:val="uk-UA"/>
+        </w:rPr>
+      </w:pPr>
+      <w:r>
+        <w:rPr>
+          <w:lang w:val="uk-UA"/>
+        </w:rPr>
+        <w:t xml:space="preserve">Організаційна </w:t>
+      </w:r>
+      <w:r>
+        <w:rPr>
+          <w:lang w:val="uk-UA"/>
+        </w:rPr>
+        <w:t xml:space="preserve">структура компанії </w:t>
+      </w:r>
+      <w:r>
+        <w:rPr>
+          <w:lang w:val="uk-UA"/>
+        </w:rPr>
+        <w:t>наведена на рисунку 1.1.</w:t>
+      </w:r>
+    </w:p>
+    <w:p>
+      <w:pPr>
+        <w:pStyle w:val="P1"/>
+        <w:rPr>
+          <w:lang w:val="uk-UA"/>
+        </w:rPr>
+      </w:pPr>
+      <w:r>
+        <w:rPr>
+          <w:lang w:val="uk-UA"/>
+        </w:rPr>
+      </w:r>
+    </w:p>
+    <w:p>
+      <w:pPr>
+        <w:pStyle w:val="img1"/>
+        <w:rPr/>
+      </w:pPr>
+      <w:r>
+        <w:rPr/>
+        <w:drawing>
+          <wp:inline distT="0" distB="0" distL="0" distR="0">
+            <wp:extent cx="5731510" cy="2940685"/>
+            <wp:effectExtent l="0" t="0" r="0" b="0"/>
+            <wp:docPr id="1" name="Зображення1"/>
+            <wp:cNvGraphicFramePr>
+              <a:graphicFrameLocks xmlns:a="http://schemas.openxmlformats.org/drawingml/2006/main" noChangeAspect="1"/>
+            </wp:cNvGraphicFramePr>
+            <a:graphic xmlns:a="http://schemas.openxmlformats.org/drawingml/2006/main">
+              <a:graphicData uri="http://schemas.openxmlformats.org/drawingml/2006/picture">
+                <pic:pic xmlns:pic="http://schemas.openxmlformats.org/drawingml/2006/picture">
+                  <pic:nvPicPr>
+                    <pic:cNvPr id="1" name="Зображення1"/>
+                    <pic:cNvPicPr>
+                      <a:picLocks noChangeAspect="1" noChangeArrowheads="1"/>
+                    </pic:cNvPicPr>
+                  </pic:nvPicPr>
+                  <pic:blipFill>
+                    <a:blip r:embed="rId2"/>
+                    <a:stretch>
+                      <a:fillRect/>
+                    </a:stretch>
+                  </pic:blipFill>
+                  <pic:spPr bwMode="auto">
+                    <a:xfrm>
+                      <a:off x="0" y="0"/>
+                      <a:ext cx="5731510" cy="2940685"/>
+                    </a:xfrm>
+                    <a:prstGeom prst="rect">
+                      <a:avLst/>
+                    </a:prstGeom>
+                    <a:noFill/>
+                  </pic:spPr>
+                </pic:pic>
+              </a:graphicData>
+            </a:graphic>
+          </wp:inline>
+        </w:drawing>
+      </w:r>
+    </w:p>
+    <w:p>
+      <w:pPr>
+        <w:pStyle w:val="img1"/>
+        <w:rPr/>
+      </w:pPr>
+      <w:r>
+        <w:rPr/>
+        <w:t>Рисунок 1.1 — Організаційна структура компанії</w:t>
+      </w:r>
+    </w:p>
+    <w:p>
+      <w:pPr>
+        <w:pStyle w:val="P1"/>
+        <w:rPr>
+          <w:lang w:val="uk-UA"/>
+        </w:rPr>
+      </w:pPr>
+      <w:r>
+        <w:rPr>
+          <w:lang w:val="uk-UA"/>
+        </w:rPr>
+      </w:r>
+    </w:p>
+    <w:p>
+      <w:pPr>
+        <w:pStyle w:val="P1"/>
+        <w:rPr>
+          <w:lang w:val="uk-UA"/>
+        </w:rPr>
+      </w:pPr>
+      <w:r>
+        <w:rPr>
+          <w:lang w:val="uk-UA"/>
+        </w:rPr>
+        <w:t>Обов’язки кожної особи в команді:</w:t>
       </w:r>
     </w:p>
     <w:p>
@@ -1058,15 +1187,11 @@
         <w:spacing w:lineRule="auto" w:line="360" w:before="0" w:after="0"/>
         <w:ind w:firstLine="850" w:left="0" w:right="0"/>
         <w:jc w:val="both"/>
-        <w:rPr>
-          <w:lang w:val="uk-UA"/>
-        </w:rPr>
-      </w:pPr>
-      <w:r>
-        <w:rPr>
-          <w:lang w:val="uk-UA"/>
-        </w:rPr>
-        <w:t>потреба його праці 24/7;</w:t>
+        <w:rPr/>
+      </w:pPr>
+      <w:r>
+        <w:rPr/>
+        <w:t>Директор: управління ресурсами компанії, розподіл обов’язків по команді;</w:t>
       </w:r>
     </w:p>
     <w:p>
@@ -1083,14 +1208,20 @@
         <w:ind w:firstLine="850" w:left="0" w:right="0"/>
         <w:jc w:val="both"/>
         <w:rPr>
-          <w:lang w:val="uk-UA"/>
-        </w:rPr>
-      </w:pPr>
-      <w:r>
-        <w:rPr>
-          <w:lang w:val="uk-UA"/>
-        </w:rPr>
-        <w:t>швидка дизактуалізація новин (бо новіші надходять швидко);</w:t>
+          <w:lang w:val="en-US"/>
+        </w:rPr>
+      </w:pPr>
+      <w:r>
+        <w:rPr>
+          <w:lang w:val="en-US"/>
+        </w:rPr>
+        <w:t xml:space="preserve">HR &amp; </w:t>
+      </w:r>
+      <w:r>
+        <w:rPr>
+          <w:lang w:val="uk-UA"/>
+        </w:rPr>
+        <w:t>Бухгалтер: фінансові потоки компанії, наймання працівників у компанію;</w:t>
       </w:r>
     </w:p>
     <w:p>
@@ -1114,7 +1245,101 @@
         <w:rPr>
           <w:lang w:val="uk-UA"/>
         </w:rPr>
-        <w:t>новини мають бути достовірними, не має бути фейків.</w:t>
+        <w:t>ІТ відділ, фронтенд: розробка клієнтської частини вебсайту, публікація новин;</w:t>
+      </w:r>
+    </w:p>
+    <w:p>
+      <w:pPr>
+        <w:pStyle w:val="P1"/>
+        <w:widowControl/>
+        <w:numPr>
+          <w:ilvl w:val="0"/>
+          <w:numId w:val="1"/>
+        </w:numPr>
+        <w:suppressAutoHyphens w:val="true"/>
+        <w:bidi w:val="0"/>
+        <w:spacing w:lineRule="auto" w:line="360" w:before="0" w:after="0"/>
+        <w:ind w:firstLine="850" w:left="0" w:right="0"/>
+        <w:jc w:val="both"/>
+        <w:rPr>
+          <w:lang w:val="uk-UA"/>
+        </w:rPr>
+      </w:pPr>
+      <w:r>
+        <w:rPr>
+          <w:lang w:val="uk-UA"/>
+        </w:rPr>
+        <w:t>ІТ відділ, бекенд: розробка серверної частини вебсайту;</w:t>
+      </w:r>
+    </w:p>
+    <w:p>
+      <w:pPr>
+        <w:pStyle w:val="P1"/>
+        <w:widowControl/>
+        <w:numPr>
+          <w:ilvl w:val="0"/>
+          <w:numId w:val="1"/>
+        </w:numPr>
+        <w:suppressAutoHyphens w:val="true"/>
+        <w:bidi w:val="0"/>
+        <w:spacing w:lineRule="auto" w:line="360" w:before="0" w:after="0"/>
+        <w:ind w:firstLine="850" w:left="0" w:right="0"/>
+        <w:jc w:val="both"/>
+        <w:rPr>
+          <w:lang w:val="uk-UA"/>
+        </w:rPr>
+      </w:pPr>
+      <w:r>
+        <w:rPr>
+          <w:lang w:val="uk-UA"/>
+        </w:rPr>
+        <w:t>Відділ збору новин, водій: підтримка робочого стану автомобіля компанії, розвезення працівників команди на локації новин;</w:t>
+      </w:r>
+    </w:p>
+    <w:p>
+      <w:pPr>
+        <w:pStyle w:val="P1"/>
+        <w:widowControl/>
+        <w:numPr>
+          <w:ilvl w:val="0"/>
+          <w:numId w:val="1"/>
+        </w:numPr>
+        <w:suppressAutoHyphens w:val="true"/>
+        <w:bidi w:val="0"/>
+        <w:spacing w:lineRule="auto" w:line="360" w:before="0" w:after="0"/>
+        <w:ind w:firstLine="850" w:left="0" w:right="0"/>
+        <w:jc w:val="both"/>
+        <w:rPr>
+          <w:lang w:val="uk-UA"/>
+        </w:rPr>
+      </w:pPr>
+      <w:r>
+        <w:rPr>
+          <w:lang w:val="uk-UA"/>
+        </w:rPr>
+        <w:t>Відділ збору новин, оператор: підтримка камери компанії в робочому стані, відеофіксація репортажів;</w:t>
+      </w:r>
+    </w:p>
+    <w:p>
+      <w:pPr>
+        <w:pStyle w:val="P1"/>
+        <w:widowControl/>
+        <w:numPr>
+          <w:ilvl w:val="0"/>
+          <w:numId w:val="1"/>
+        </w:numPr>
+        <w:suppressAutoHyphens w:val="true"/>
+        <w:bidi w:val="0"/>
+        <w:spacing w:lineRule="auto" w:line="360" w:before="0" w:after="0"/>
+        <w:ind w:firstLine="850" w:left="0" w:right="0"/>
+        <w:jc w:val="both"/>
+        <w:rPr/>
+      </w:pPr>
+      <w:r>
+        <w:rPr>
+          <w:lang w:val="uk-UA"/>
+        </w:rPr>
+        <w:t>Відділ збору новин, репортер: озвучування тексту новини на локації чи в студії.</w:t>
       </w:r>
     </w:p>
     <w:p>
@@ -1137,392 +1362,6 @@
       </w:pPr>
       <w:r>
         <w:rPr/>
-        <w:t>Організаційна структура підприємства з коротким описом обов’язків</w:t>
-      </w:r>
-    </w:p>
-    <w:p>
-      <w:pPr>
-        <w:pStyle w:val="P1"/>
-        <w:rPr>
-          <w:lang w:val="uk-UA"/>
-        </w:rPr>
-      </w:pPr>
-      <w:r>
-        <w:rPr>
-          <w:lang w:val="uk-UA"/>
-        </w:rPr>
-      </w:r>
-    </w:p>
-    <w:p>
-      <w:pPr>
-        <w:pStyle w:val="P1"/>
-        <w:rPr>
-          <w:lang w:val="uk-UA"/>
-        </w:rPr>
-      </w:pPr>
-      <w:r>
-        <w:rPr>
-          <w:lang w:val="uk-UA"/>
-        </w:rPr>
-        <w:t>Оргструктура компанії буде наступною:</w:t>
-      </w:r>
-    </w:p>
-    <w:p>
-      <w:pPr>
-        <w:pStyle w:val="P1"/>
-        <w:rPr>
-          <w:lang w:val="uk-UA"/>
-        </w:rPr>
-      </w:pPr>
-      <w:r>
-        <w:rPr>
-          <w:lang w:val="uk-UA"/>
-        </w:rPr>
-      </w:r>
-    </w:p>
-    <w:p>
-      <w:pPr>
-        <w:pStyle w:val="P1"/>
-        <w:rPr>
-          <w:lang w:val="uk-UA"/>
-        </w:rPr>
-      </w:pPr>
-      <w:r>
-        <w:rPr>
-          <w:lang w:val="uk-UA"/>
-        </w:rPr>
-        <w:t>Директор</w:t>
-      </w:r>
-    </w:p>
-    <w:p>
-      <w:pPr>
-        <w:pStyle w:val="P1"/>
-        <w:rPr>
-          <w:lang w:val="uk-UA"/>
-        </w:rPr>
-      </w:pPr>
-      <w:r>
-        <w:rPr>
-          <w:lang w:val="uk-UA"/>
-        </w:rPr>
-        <w:t xml:space="preserve">├── </w:t>
-      </w:r>
-      <w:r>
-        <w:rPr>
-          <w:lang w:val="uk-UA"/>
-        </w:rPr>
-        <w:t>Керівник відділу збору (створення) новин</w:t>
-      </w:r>
-    </w:p>
-    <w:p>
-      <w:pPr>
-        <w:pStyle w:val="P1"/>
-        <w:rPr>
-          <w:lang w:val="uk-UA"/>
-        </w:rPr>
-      </w:pPr>
-      <w:r>
-        <w:rPr>
-          <w:lang w:val="uk-UA"/>
-        </w:rPr>
-        <w:t xml:space="preserve">│   └── </w:t>
-      </w:r>
-      <w:r>
-        <w:rPr>
-          <w:lang w:val="uk-UA"/>
-        </w:rPr>
-        <w:t>Підлеглі відділу збору (створення) новин...</w:t>
-      </w:r>
-    </w:p>
-    <w:p>
-      <w:pPr>
-        <w:pStyle w:val="P1"/>
-        <w:rPr>
-          <w:lang w:val="uk-UA"/>
-        </w:rPr>
-      </w:pPr>
-      <w:r>
-        <w:rPr>
-          <w:lang w:val="uk-UA"/>
-        </w:rPr>
-        <w:t xml:space="preserve">├── </w:t>
-      </w:r>
-      <w:r>
-        <w:rPr>
-          <w:lang w:val="uk-UA"/>
-        </w:rPr>
-        <w:t>Керівник відділу публікації новин в соціальних мережах</w:t>
-      </w:r>
-    </w:p>
-    <w:p>
-      <w:pPr>
-        <w:pStyle w:val="P1"/>
-        <w:rPr>
-          <w:lang w:val="uk-UA"/>
-        </w:rPr>
-      </w:pPr>
-      <w:r>
-        <w:rPr>
-          <w:lang w:val="uk-UA"/>
-        </w:rPr>
-        <w:t xml:space="preserve">│   └── </w:t>
-      </w:r>
-      <w:r>
-        <w:rPr>
-          <w:lang w:val="uk-UA"/>
-        </w:rPr>
-        <w:t>Підлеглі відділу публікації новин в соціальних мережах...</w:t>
-      </w:r>
-    </w:p>
-    <w:p>
-      <w:pPr>
-        <w:pStyle w:val="P1"/>
-        <w:rPr>
-          <w:lang w:val="uk-UA"/>
-        </w:rPr>
-      </w:pPr>
-      <w:r>
-        <w:rPr>
-          <w:lang w:val="uk-UA"/>
-        </w:rPr>
-        <w:t xml:space="preserve">├── </w:t>
-      </w:r>
-      <w:r>
-        <w:rPr>
-          <w:lang w:val="uk-UA"/>
-        </w:rPr>
-        <w:t>Керівник відділу публікації новин на вебсайті</w:t>
-      </w:r>
-    </w:p>
-    <w:p>
-      <w:pPr>
-        <w:pStyle w:val="P1"/>
-        <w:rPr>
-          <w:lang w:val="uk-UA"/>
-        </w:rPr>
-      </w:pPr>
-      <w:r>
-        <w:rPr>
-          <w:lang w:val="uk-UA"/>
-        </w:rPr>
-        <w:t xml:space="preserve">│   └── </w:t>
-      </w:r>
-      <w:r>
-        <w:rPr>
-          <w:lang w:val="uk-UA"/>
-        </w:rPr>
-        <w:t>Підлеглі відділу публікації новин на вебсайті...</w:t>
-      </w:r>
-    </w:p>
-    <w:p>
-      <w:pPr>
-        <w:pStyle w:val="P1"/>
-        <w:rPr>
-          <w:lang w:val="uk-UA"/>
-        </w:rPr>
-      </w:pPr>
-      <w:r>
-        <w:rPr>
-          <w:lang w:val="uk-UA"/>
-        </w:rPr>
-        <w:t xml:space="preserve">├── </w:t>
-      </w:r>
-      <w:r>
-        <w:rPr>
-          <w:lang w:val="uk-UA"/>
-        </w:rPr>
-        <w:t>Керівник ІТ відділу</w:t>
-      </w:r>
-    </w:p>
-    <w:p>
-      <w:pPr>
-        <w:pStyle w:val="P1"/>
-        <w:rPr>
-          <w:lang w:val="uk-UA"/>
-        </w:rPr>
-      </w:pPr>
-      <w:r>
-        <w:rPr>
-          <w:lang w:val="uk-UA"/>
-        </w:rPr>
-        <w:t xml:space="preserve">│   └── </w:t>
-      </w:r>
-      <w:r>
-        <w:rPr>
-          <w:lang w:val="uk-UA"/>
-        </w:rPr>
-        <w:t>Підлеглі ІТ відділу...</w:t>
-      </w:r>
-    </w:p>
-    <w:p>
-      <w:pPr>
-        <w:pStyle w:val="P1"/>
-        <w:rPr>
-          <w:lang w:val="uk-UA"/>
-        </w:rPr>
-      </w:pPr>
-      <w:r>
-        <w:rPr>
-          <w:lang w:val="uk-UA"/>
-        </w:rPr>
-        <w:t xml:space="preserve">└── </w:t>
-      </w:r>
-      <w:r>
-        <w:rPr>
-          <w:lang w:val="uk-UA"/>
-        </w:rPr>
-        <w:t>Керівник бухгалтерії</w:t>
-      </w:r>
-    </w:p>
-    <w:p>
-      <w:pPr>
-        <w:pStyle w:val="P1"/>
-        <w:rPr>
-          <w:lang w:val="uk-UA"/>
-        </w:rPr>
-      </w:pPr>
-      <w:r>
-        <w:rPr>
-          <w:lang w:val="uk-UA"/>
-        </w:rPr>
-        <w:t xml:space="preserve">    └── </w:t>
-      </w:r>
-      <w:r>
-        <w:rPr>
-          <w:lang w:val="uk-UA"/>
-        </w:rPr>
-        <w:t>Підлеглі бухгалтери</w:t>
-      </w:r>
-    </w:p>
-    <w:p>
-      <w:pPr>
-        <w:pStyle w:val="P1"/>
-        <w:rPr>
-          <w:lang w:val="uk-UA"/>
-        </w:rPr>
-      </w:pPr>
-      <w:r>
-        <w:rPr>
-          <w:lang w:val="uk-UA"/>
-        </w:rPr>
-      </w:r>
-    </w:p>
-    <w:p>
-      <w:pPr>
-        <w:pStyle w:val="P1"/>
-        <w:rPr>
-          <w:lang w:val="uk-UA"/>
-        </w:rPr>
-      </w:pPr>
-      <w:r>
-        <w:rPr>
-          <w:lang w:val="uk-UA"/>
-        </w:rPr>
-        <w:t>Обов’язки директора є керування компанією та делегація задач керівникам відділів.</w:t>
-      </w:r>
-    </w:p>
-    <w:p>
-      <w:pPr>
-        <w:pStyle w:val="P1"/>
-        <w:rPr>
-          <w:lang w:val="uk-UA"/>
-        </w:rPr>
-      </w:pPr>
-      <w:r>
-        <w:rPr>
-          <w:lang w:val="uk-UA"/>
-        </w:rPr>
-        <w:t>Обов’язки керівника відділу є створення (збирання) новин є організація підлеглих для збору та створення новин. Цей відділ також має займатися перевіркою новин на достовірність.</w:t>
-      </w:r>
-    </w:p>
-    <w:p>
-      <w:pPr>
-        <w:pStyle w:val="P1"/>
-        <w:rPr>
-          <w:lang w:val="uk-UA"/>
-        </w:rPr>
-      </w:pPr>
-      <w:r>
-        <w:rPr>
-          <w:lang w:val="uk-UA"/>
-        </w:rPr>
-        <w:t>Обов’язки керівника відділу з соціальних мереж є делегація підлеглим налаштування каналів у соціальних мережах та публікації новин в них.</w:t>
-      </w:r>
-    </w:p>
-    <w:p>
-      <w:pPr>
-        <w:pStyle w:val="P1"/>
-        <w:rPr>
-          <w:lang w:val="uk-UA"/>
-        </w:rPr>
-      </w:pPr>
-      <w:r>
-        <w:rPr>
-          <w:lang w:val="uk-UA"/>
-        </w:rPr>
-        <w:t>Обов’язки керівника відділу публікації новин на вебсайті є організація підлеглих для створення та публікації новин на вебсайті компанії.</w:t>
-      </w:r>
-    </w:p>
-    <w:p>
-      <w:pPr>
-        <w:pStyle w:val="P1"/>
-        <w:rPr>
-          <w:lang w:val="uk-UA"/>
-        </w:rPr>
-      </w:pPr>
-      <w:r>
-        <w:rPr>
-          <w:lang w:val="uk-UA"/>
-        </w:rPr>
-        <w:t xml:space="preserve">Обов’язки керівника ІТ відділу є створення та підтримка </w:t>
-      </w:r>
-      <w:r>
-        <w:rPr>
-          <w:lang w:val="en-US"/>
-        </w:rPr>
-        <w:t xml:space="preserve">CMS </w:t>
-      </w:r>
-      <w:r>
-        <w:rPr>
-          <w:lang w:val="uk-UA"/>
-        </w:rPr>
-        <w:t>для публікації новин. Цей відділ має бути відповідальним за повночасову доступність сайту.</w:t>
-      </w:r>
-    </w:p>
-    <w:p>
-      <w:pPr>
-        <w:pStyle w:val="P1"/>
-        <w:rPr>
-          <w:lang w:val="uk-UA"/>
-        </w:rPr>
-      </w:pPr>
-      <w:r>
-        <w:rPr>
-          <w:lang w:val="uk-UA"/>
-        </w:rPr>
-        <w:t>Обов’язки бухгалтерії є керування ресурсами компанії.</w:t>
-      </w:r>
-    </w:p>
-    <w:p>
-      <w:pPr>
-        <w:pStyle w:val="P1"/>
-        <w:rPr>
-          <w:lang w:val="uk-UA"/>
-        </w:rPr>
-      </w:pPr>
-      <w:r>
-        <w:rPr>
-          <w:lang w:val="uk-UA"/>
-        </w:rPr>
-      </w:r>
-    </w:p>
-    <w:p>
-      <w:pPr>
-        <w:pStyle w:val="H2"/>
-        <w:rPr/>
-      </w:pPr>
-      <w:r>
-        <w:rPr/>
         <w:t xml:space="preserve">Цілі в галузі якості </w:t>
       </w:r>
     </w:p>
@@ -1542,37 +1381,27 @@
       </w:pPr>
       <w:r>
         <w:rPr/>
-        <w:t>Спершу треба визначити групи користувачів, для яких будуть формуватися вимоги. Це:</w:t>
-      </w:r>
-    </w:p>
-    <w:p>
-      <w:pPr>
-        <w:pStyle w:val="p11"/>
-        <w:rPr/>
-      </w:pPr>
-      <w:r>
-        <w:rPr/>
-        <w:t>1. Користувач веб-сайту або соціальної мережі;</w:t>
-      </w:r>
-    </w:p>
-    <w:p>
-      <w:pPr>
-        <w:pStyle w:val="p11"/>
-        <w:rPr/>
-      </w:pPr>
-      <w:r>
-        <w:rPr/>
-        <w:t>2. Рекламодавець;</w:t>
-      </w:r>
-    </w:p>
-    <w:p>
-      <w:pPr>
-        <w:pStyle w:val="p11"/>
-        <w:rPr/>
-      </w:pPr>
-      <w:r>
-        <w:rPr/>
-        <w:t>3. Адміністратор.</w:t>
+        <w:t>Спочатку потрібно визначити ролі користувачів компанії:</w:t>
+      </w:r>
+    </w:p>
+    <w:p>
+      <w:pPr>
+        <w:pStyle w:val="p11"/>
+        <w:rPr/>
+      </w:pPr>
+      <w:r>
+        <w:rPr/>
+        <w:t>- команда — працівники організації з будь-якого відділу;</w:t>
+      </w:r>
+    </w:p>
+    <w:p>
+      <w:pPr>
+        <w:pStyle w:val="p11"/>
+        <w:rPr/>
+      </w:pPr>
+      <w:r>
+        <w:rPr/>
+        <w:t>- споживач — людина, яка користується сайтом чи каналами в соціальних мережах.</w:t>
       </w:r>
     </w:p>
     <w:p>
@@ -1606,9 +1435,9 @@
     </w:p>
     <w:tbl>
       <w:tblPr>
-        <w:tblW w:w="9026" w:type="dxa"/>
+        <w:tblW w:w="11618" w:type="dxa"/>
         <w:jc w:val="left"/>
-        <w:tblInd w:w="55" w:type="dxa"/>
+        <w:tblInd w:w="-1258" w:type="dxa"/>
         <w:tblLayout w:type="fixed"/>
         <w:tblCellMar>
           <w:top w:w="55" w:type="dxa"/>
@@ -1618,11 +1447,10 @@
         </w:tblCellMar>
       </w:tblPr>
       <w:tblGrid>
-        <w:gridCol w:w="370"/>
-        <w:gridCol w:w="1674"/>
-        <w:gridCol w:w="3371"/>
-        <w:gridCol w:w="1805"/>
-        <w:gridCol w:w="1806"/>
+        <w:gridCol w:w="1622"/>
+        <w:gridCol w:w="5100"/>
+        <w:gridCol w:w="1992"/>
+        <w:gridCol w:w="2904"/>
       </w:tblGrid>
       <w:tr>
         <w:trPr>
@@ -1630,7 +1458,7 @@
         </w:trPr>
         <w:tc>
           <w:tcPr>
-            <w:tcW w:w="370" w:type="dxa"/>
+            <w:tcW w:w="1622" w:type="dxa"/>
             <w:tcBorders>
               <w:top w:val="single" w:sz="4" w:space="0" w:color="000000"/>
               <w:left w:val="single" w:sz="4" w:space="0" w:color="000000"/>
@@ -1658,13 +1486,13 @@
                 <w:sz w:val="24"/>
                 <w:szCs w:val="24"/>
               </w:rPr>
-              <w:t>№</w:t>
+              <w:t>Роль</w:t>
             </w:r>
           </w:p>
         </w:tc>
         <w:tc>
           <w:tcPr>
-            <w:tcW w:w="1674" w:type="dxa"/>
+            <w:tcW w:w="5100" w:type="dxa"/>
             <w:tcBorders>
               <w:top w:val="single" w:sz="4" w:space="0" w:color="000000"/>
               <w:left w:val="single" w:sz="4" w:space="0" w:color="000000"/>
@@ -1692,13 +1520,13 @@
                 <w:sz w:val="24"/>
                 <w:szCs w:val="24"/>
               </w:rPr>
-              <w:t>Роль</w:t>
+              <w:t>Ціль</w:t>
             </w:r>
           </w:p>
         </w:tc>
         <w:tc>
           <w:tcPr>
-            <w:tcW w:w="3371" w:type="dxa"/>
+            <w:tcW w:w="1992" w:type="dxa"/>
             <w:tcBorders>
               <w:top w:val="single" w:sz="4" w:space="0" w:color="000000"/>
               <w:left w:val="single" w:sz="4" w:space="0" w:color="000000"/>
@@ -1726,47 +1554,13 @@
                 <w:sz w:val="24"/>
                 <w:szCs w:val="24"/>
               </w:rPr>
-              <w:t>Ціль</w:t>
-            </w:r>
-          </w:p>
-        </w:tc>
-        <w:tc>
-          <w:tcPr>
-            <w:tcW w:w="1805" w:type="dxa"/>
-            <w:tcBorders>
-              <w:top w:val="single" w:sz="4" w:space="0" w:color="000000"/>
-              <w:left w:val="single" w:sz="4" w:space="0" w:color="000000"/>
-              <w:bottom w:val="single" w:sz="4" w:space="0" w:color="000000"/>
-            </w:tcBorders>
-            <w:vAlign w:val="center"/>
-          </w:tcPr>
-          <w:p>
-            <w:pPr>
-              <w:pStyle w:val="user4"/>
-              <w:spacing w:lineRule="auto" w:line="240"/>
-              <w:ind w:hanging="0" w:left="0"/>
-              <w:jc w:val="center"/>
-              <w:rPr>
-                <w:b/>
-                <w:bCs/>
-                <w:sz w:val="24"/>
-                <w:szCs w:val="24"/>
-              </w:rPr>
-            </w:pPr>
-            <w:r>
-              <w:rPr>
-                <w:b/>
-                <w:bCs/>
-                <w:sz w:val="24"/>
-                <w:szCs w:val="24"/>
-              </w:rPr>
               <w:t>Термін</w:t>
             </w:r>
           </w:p>
         </w:tc>
         <w:tc>
           <w:tcPr>
-            <w:tcW w:w="1806" w:type="dxa"/>
+            <w:tcW w:w="2904" w:type="dxa"/>
             <w:tcBorders>
               <w:top w:val="single" w:sz="4" w:space="0" w:color="000000"/>
               <w:left w:val="single" w:sz="4" w:space="0" w:color="000000"/>
@@ -1804,7 +1598,7 @@
         <w:trPr/>
         <w:tc>
           <w:tcPr>
-            <w:tcW w:w="370" w:type="dxa"/>
+            <w:tcW w:w="1622" w:type="dxa"/>
             <w:tcBorders>
               <w:left w:val="single" w:sz="4" w:space="0" w:color="000000"/>
               <w:bottom w:val="single" w:sz="4" w:space="0" w:color="000000"/>
@@ -1826,13 +1620,13 @@
                 <w:sz w:val="24"/>
                 <w:szCs w:val="24"/>
               </w:rPr>
-              <w:t>1</w:t>
+              <w:t>Команда</w:t>
             </w:r>
           </w:p>
         </w:tc>
         <w:tc>
           <w:tcPr>
-            <w:tcW w:w="1674" w:type="dxa"/>
+            <w:tcW w:w="5100" w:type="dxa"/>
             <w:tcBorders>
               <w:left w:val="single" w:sz="4" w:space="0" w:color="000000"/>
               <w:bottom w:val="single" w:sz="4" w:space="0" w:color="000000"/>
@@ -1854,13 +1648,27 @@
                 <w:sz w:val="24"/>
                 <w:szCs w:val="24"/>
               </w:rPr>
-              <w:t>Користувач</w:t>
+              <w:t xml:space="preserve">Система </w:t>
+            </w:r>
+            <w:r>
+              <w:rPr>
+                <w:sz w:val="24"/>
+                <w:szCs w:val="24"/>
+              </w:rPr>
+              <w:t>керування контентом</w:t>
+            </w:r>
+            <w:r>
+              <w:rPr>
+                <w:sz w:val="24"/>
+                <w:szCs w:val="24"/>
+              </w:rPr>
+              <w:t xml:space="preserve"> має містити форми для додавання новин до у зручному місці</w:t>
             </w:r>
           </w:p>
         </w:tc>
         <w:tc>
           <w:tcPr>
-            <w:tcW w:w="3371" w:type="dxa"/>
+            <w:tcW w:w="1992" w:type="dxa"/>
             <w:tcBorders>
               <w:left w:val="single" w:sz="4" w:space="0" w:color="000000"/>
               <w:bottom w:val="single" w:sz="4" w:space="0" w:color="000000"/>
@@ -1869,7 +1677,7 @@
           </w:tcPr>
           <w:p>
             <w:pPr>
-              <w:pStyle w:val="p11"/>
+              <w:pStyle w:val="user4"/>
               <w:spacing w:lineRule="auto" w:line="240"/>
               <w:ind w:hanging="0" w:left="0"/>
               <w:rPr>
@@ -1882,41 +1690,13 @@
                 <w:sz w:val="24"/>
                 <w:szCs w:val="24"/>
               </w:rPr>
-              <w:t>Веб-сайт має завантажуватися менш ніж за три секунди</w:t>
+              <w:t>До кінця кварталу</w:t>
             </w:r>
           </w:p>
         </w:tc>
         <w:tc>
           <w:tcPr>
-            <w:tcW w:w="1805" w:type="dxa"/>
-            <w:tcBorders>
-              <w:left w:val="single" w:sz="4" w:space="0" w:color="000000"/>
-              <w:bottom w:val="single" w:sz="4" w:space="0" w:color="000000"/>
-            </w:tcBorders>
-            <w:vAlign w:val="center"/>
-          </w:tcPr>
-          <w:p>
-            <w:pPr>
-              <w:pStyle w:val="p11"/>
-              <w:spacing w:lineRule="auto" w:line="240"/>
-              <w:ind w:hanging="0" w:left="0"/>
-              <w:rPr>
-                <w:sz w:val="24"/>
-                <w:szCs w:val="24"/>
-              </w:rPr>
-            </w:pPr>
-            <w:r>
-              <w:rPr>
-                <w:sz w:val="24"/>
-                <w:szCs w:val="24"/>
-              </w:rPr>
-              <w:t>До кінця цього кварталу</w:t>
-            </w:r>
-          </w:p>
-        </w:tc>
-        <w:tc>
-          <w:tcPr>
-            <w:tcW w:w="1806" w:type="dxa"/>
+            <w:tcW w:w="2904" w:type="dxa"/>
             <w:tcBorders>
               <w:left w:val="single" w:sz="4" w:space="0" w:color="000000"/>
               <w:bottom w:val="single" w:sz="4" w:space="0" w:color="000000"/>
@@ -1939,7 +1719,7 @@
                 <w:sz w:val="24"/>
                 <w:szCs w:val="24"/>
               </w:rPr>
-              <w:t>Веб-сайт завантажується менше ніж за три секунди</w:t>
+              <w:t>Система керування контентом містить спеціальну форму для додавання нових статей на сайт</w:t>
             </w:r>
           </w:p>
         </w:tc>
@@ -1948,7 +1728,7 @@
         <w:trPr/>
         <w:tc>
           <w:tcPr>
-            <w:tcW w:w="370" w:type="dxa"/>
+            <w:tcW w:w="1622" w:type="dxa"/>
             <w:tcBorders>
               <w:left w:val="single" w:sz="4" w:space="0" w:color="000000"/>
               <w:bottom w:val="single" w:sz="4" w:space="0" w:color="000000"/>
@@ -1970,13 +1750,12 @@
                 <w:sz w:val="24"/>
                 <w:szCs w:val="24"/>
               </w:rPr>
-              <w:t>2</w:t>
             </w:r>
           </w:p>
         </w:tc>
         <w:tc>
           <w:tcPr>
-            <w:tcW w:w="1674" w:type="dxa"/>
+            <w:tcW w:w="5100" w:type="dxa"/>
             <w:tcBorders>
               <w:left w:val="single" w:sz="4" w:space="0" w:color="000000"/>
               <w:bottom w:val="single" w:sz="4" w:space="0" w:color="000000"/>
@@ -1985,7 +1764,7 @@
           </w:tcPr>
           <w:p>
             <w:pPr>
-              <w:pStyle w:val="user4"/>
+              <w:pStyle w:val="p11"/>
               <w:spacing w:lineRule="auto" w:line="240"/>
               <w:ind w:hanging="0" w:left="0"/>
               <w:rPr>
@@ -1998,13 +1777,12 @@
                 <w:sz w:val="24"/>
                 <w:szCs w:val="24"/>
               </w:rPr>
-              <w:t>Користувач</w:t>
             </w:r>
           </w:p>
         </w:tc>
         <w:tc>
           <w:tcPr>
-            <w:tcW w:w="3371" w:type="dxa"/>
+            <w:tcW w:w="1992" w:type="dxa"/>
             <w:tcBorders>
               <w:left w:val="single" w:sz="4" w:space="0" w:color="000000"/>
               <w:bottom w:val="single" w:sz="4" w:space="0" w:color="000000"/>
@@ -2013,7 +1791,7 @@
           </w:tcPr>
           <w:p>
             <w:pPr>
-              <w:pStyle w:val="user4"/>
+              <w:pStyle w:val="p11"/>
               <w:spacing w:lineRule="auto" w:line="240"/>
               <w:ind w:hanging="0" w:left="0"/>
               <w:rPr>
@@ -2026,41 +1804,12 @@
                 <w:sz w:val="24"/>
                 <w:szCs w:val="24"/>
               </w:rPr>
-              <w:t>Веб-сайт має працювати в 99% часу доби</w:t>
             </w:r>
           </w:p>
         </w:tc>
         <w:tc>
           <w:tcPr>
-            <w:tcW w:w="1805" w:type="dxa"/>
-            <w:tcBorders>
-              <w:left w:val="single" w:sz="4" w:space="0" w:color="000000"/>
-              <w:bottom w:val="single" w:sz="4" w:space="0" w:color="000000"/>
-            </w:tcBorders>
-            <w:vAlign w:val="center"/>
-          </w:tcPr>
-          <w:p>
-            <w:pPr>
-              <w:pStyle w:val="user4"/>
-              <w:spacing w:lineRule="auto" w:line="240"/>
-              <w:ind w:hanging="0" w:left="0"/>
-              <w:rPr>
-                <w:sz w:val="24"/>
-                <w:szCs w:val="24"/>
-              </w:rPr>
-            </w:pPr>
-            <w:r>
-              <w:rPr>
-                <w:sz w:val="24"/>
-                <w:szCs w:val="24"/>
-              </w:rPr>
-              <w:t>До кінця року</w:t>
-            </w:r>
-          </w:p>
-        </w:tc>
-        <w:tc>
-          <w:tcPr>
-            <w:tcW w:w="1806" w:type="dxa"/>
+            <w:tcW w:w="2904" w:type="dxa"/>
             <w:tcBorders>
               <w:left w:val="single" w:sz="4" w:space="0" w:color="000000"/>
               <w:bottom w:val="single" w:sz="4" w:space="0" w:color="000000"/>
@@ -2083,7 +1832,6 @@
                 <w:sz w:val="24"/>
                 <w:szCs w:val="24"/>
               </w:rPr>
-              <w:t>Веб-сайт працює в 99% часу доби</w:t>
             </w:r>
           </w:p>
         </w:tc>
@@ -2092,7 +1840,7 @@
         <w:trPr/>
         <w:tc>
           <w:tcPr>
-            <w:tcW w:w="370" w:type="dxa"/>
+            <w:tcW w:w="1622" w:type="dxa"/>
             <w:tcBorders>
               <w:left w:val="single" w:sz="4" w:space="0" w:color="000000"/>
               <w:bottom w:val="single" w:sz="4" w:space="0" w:color="000000"/>
@@ -2114,13 +1862,13 @@
                 <w:sz w:val="24"/>
                 <w:szCs w:val="24"/>
               </w:rPr>
-              <w:t>3</w:t>
+              <w:t>Команда</w:t>
             </w:r>
           </w:p>
         </w:tc>
         <w:tc>
           <w:tcPr>
-            <w:tcW w:w="1674" w:type="dxa"/>
+            <w:tcW w:w="5100" w:type="dxa"/>
             <w:tcBorders>
               <w:left w:val="single" w:sz="4" w:space="0" w:color="000000"/>
               <w:bottom w:val="single" w:sz="4" w:space="0" w:color="000000"/>
@@ -2129,7 +1877,7 @@
           </w:tcPr>
           <w:p>
             <w:pPr>
-              <w:pStyle w:val="user4"/>
+              <w:pStyle w:val="p11"/>
               <w:spacing w:lineRule="auto" w:line="240"/>
               <w:ind w:hanging="0" w:left="0"/>
               <w:rPr>
@@ -2142,13 +1890,13 @@
                 <w:sz w:val="24"/>
                 <w:szCs w:val="24"/>
               </w:rPr>
-              <w:t>Користувач</w:t>
+              <w:t>Веб-сайт має завантажуватися менш ніж за три секунди</w:t>
             </w:r>
           </w:p>
         </w:tc>
         <w:tc>
           <w:tcPr>
-            <w:tcW w:w="3371" w:type="dxa"/>
+            <w:tcW w:w="1992" w:type="dxa"/>
             <w:tcBorders>
               <w:left w:val="single" w:sz="4" w:space="0" w:color="000000"/>
               <w:bottom w:val="single" w:sz="4" w:space="0" w:color="000000"/>
@@ -2157,35 +1905,7 @@
           </w:tcPr>
           <w:p>
             <w:pPr>
-              <w:pStyle w:val="user4"/>
-              <w:spacing w:lineRule="auto" w:line="240"/>
-              <w:ind w:hanging="0" w:left="0"/>
-              <w:rPr>
-                <w:sz w:val="24"/>
-                <w:szCs w:val="24"/>
-              </w:rPr>
-            </w:pPr>
-            <w:r>
-              <w:rPr>
-                <w:sz w:val="24"/>
-                <w:szCs w:val="24"/>
-              </w:rPr>
-              <w:t>Соціальні мережі мають бути такими, що легко знаходяться у пошуку мережі</w:t>
-            </w:r>
-          </w:p>
-        </w:tc>
-        <w:tc>
-          <w:tcPr>
-            <w:tcW w:w="1805" w:type="dxa"/>
-            <w:tcBorders>
-              <w:left w:val="single" w:sz="4" w:space="0" w:color="000000"/>
-              <w:bottom w:val="single" w:sz="4" w:space="0" w:color="000000"/>
-            </w:tcBorders>
-            <w:vAlign w:val="center"/>
-          </w:tcPr>
-          <w:p>
-            <w:pPr>
-              <w:pStyle w:val="user4"/>
+              <w:pStyle w:val="p11"/>
               <w:spacing w:lineRule="auto" w:line="240"/>
               <w:ind w:hanging="0" w:left="0"/>
               <w:rPr>
@@ -2204,7 +1924,7 @@
         </w:tc>
         <w:tc>
           <w:tcPr>
-            <w:tcW w:w="1806" w:type="dxa"/>
+            <w:tcW w:w="2904" w:type="dxa"/>
             <w:tcBorders>
               <w:left w:val="single" w:sz="4" w:space="0" w:color="000000"/>
               <w:bottom w:val="single" w:sz="4" w:space="0" w:color="000000"/>
@@ -2227,7 +1947,7 @@
                 <w:sz w:val="24"/>
                 <w:szCs w:val="24"/>
               </w:rPr>
-              <w:t>Сторінки в соціальних мережах знаходяться менше ніж за 5 секунд</w:t>
+              <w:t>Веб-сайт завантажується менше ніж за три секунди</w:t>
             </w:r>
           </w:p>
         </w:tc>
@@ -2236,7 +1956,7 @@
         <w:trPr/>
         <w:tc>
           <w:tcPr>
-            <w:tcW w:w="370" w:type="dxa"/>
+            <w:tcW w:w="1622" w:type="dxa"/>
             <w:tcBorders>
               <w:left w:val="single" w:sz="4" w:space="0" w:color="000000"/>
               <w:bottom w:val="single" w:sz="4" w:space="0" w:color="000000"/>
@@ -2258,13 +1978,13 @@
                 <w:sz w:val="24"/>
                 <w:szCs w:val="24"/>
               </w:rPr>
-              <w:t>4</w:t>
+              <w:t>Користувач</w:t>
             </w:r>
           </w:p>
         </w:tc>
         <w:tc>
           <w:tcPr>
-            <w:tcW w:w="1674" w:type="dxa"/>
+            <w:tcW w:w="5100" w:type="dxa"/>
             <w:tcBorders>
               <w:left w:val="single" w:sz="4" w:space="0" w:color="000000"/>
               <w:bottom w:val="single" w:sz="4" w:space="0" w:color="000000"/>
@@ -2286,13 +2006,13 @@
                 <w:sz w:val="24"/>
                 <w:szCs w:val="24"/>
               </w:rPr>
-              <w:t>Користувач</w:t>
+              <w:t>Веб-сайт має працювати в 99% часу доби</w:t>
             </w:r>
           </w:p>
         </w:tc>
         <w:tc>
           <w:tcPr>
-            <w:tcW w:w="3371" w:type="dxa"/>
+            <w:tcW w:w="1992" w:type="dxa"/>
             <w:tcBorders>
               <w:left w:val="single" w:sz="4" w:space="0" w:color="000000"/>
               <w:bottom w:val="single" w:sz="4" w:space="0" w:color="000000"/>
@@ -2314,41 +2034,13 @@
                 <w:sz w:val="24"/>
                 <w:szCs w:val="24"/>
               </w:rPr>
-              <w:t>Соціальні мережі повинні містити картинки разом з текстом новини</w:t>
+              <w:t>До кінця року</w:t>
             </w:r>
           </w:p>
         </w:tc>
         <w:tc>
           <w:tcPr>
-            <w:tcW w:w="1805" w:type="dxa"/>
-            <w:tcBorders>
-              <w:left w:val="single" w:sz="4" w:space="0" w:color="000000"/>
-              <w:bottom w:val="single" w:sz="4" w:space="0" w:color="000000"/>
-            </w:tcBorders>
-            <w:vAlign w:val="center"/>
-          </w:tcPr>
-          <w:p>
-            <w:pPr>
-              <w:pStyle w:val="user4"/>
-              <w:spacing w:lineRule="auto" w:line="240"/>
-              <w:ind w:hanging="0" w:left="0"/>
-              <w:rPr>
-                <w:sz w:val="24"/>
-                <w:szCs w:val="24"/>
-              </w:rPr>
-            </w:pPr>
-            <w:r>
-              <w:rPr>
-                <w:sz w:val="24"/>
-                <w:szCs w:val="24"/>
-              </w:rPr>
-              <w:t>До кінця тижня</w:t>
-            </w:r>
-          </w:p>
-        </w:tc>
-        <w:tc>
-          <w:tcPr>
-            <w:tcW w:w="1806" w:type="dxa"/>
+            <w:tcW w:w="2904" w:type="dxa"/>
             <w:tcBorders>
               <w:left w:val="single" w:sz="4" w:space="0" w:color="000000"/>
               <w:bottom w:val="single" w:sz="4" w:space="0" w:color="000000"/>
@@ -2371,7 +2063,7 @@
                 <w:sz w:val="24"/>
                 <w:szCs w:val="24"/>
               </w:rPr>
-              <w:t>Всі пости в соціальних мережах містять картинки</w:t>
+              <w:t>Веб-сайт працює в 99% часу доби</w:t>
             </w:r>
           </w:p>
         </w:tc>
@@ -2380,7 +2072,7 @@
         <w:trPr/>
         <w:tc>
           <w:tcPr>
-            <w:tcW w:w="370" w:type="dxa"/>
+            <w:tcW w:w="1622" w:type="dxa"/>
             <w:tcBorders>
               <w:left w:val="single" w:sz="4" w:space="0" w:color="000000"/>
               <w:bottom w:val="single" w:sz="4" w:space="0" w:color="000000"/>
@@ -2402,13 +2094,13 @@
                 <w:sz w:val="24"/>
                 <w:szCs w:val="24"/>
               </w:rPr>
-              <w:t>5</w:t>
+              <w:t>Користувач</w:t>
             </w:r>
           </w:p>
         </w:tc>
         <w:tc>
           <w:tcPr>
-            <w:tcW w:w="1674" w:type="dxa"/>
+            <w:tcW w:w="5100" w:type="dxa"/>
             <w:tcBorders>
               <w:left w:val="single" w:sz="4" w:space="0" w:color="000000"/>
               <w:bottom w:val="single" w:sz="4" w:space="0" w:color="000000"/>
@@ -2430,13 +2122,13 @@
                 <w:sz w:val="24"/>
                 <w:szCs w:val="24"/>
               </w:rPr>
-              <w:t>Рекламодавець</w:t>
+              <w:t>Соціальні мережі мають бути такими, що легко знаходяться у пошуку мережі</w:t>
             </w:r>
           </w:p>
         </w:tc>
         <w:tc>
           <w:tcPr>
-            <w:tcW w:w="3371" w:type="dxa"/>
+            <w:tcW w:w="1992" w:type="dxa"/>
             <w:tcBorders>
               <w:left w:val="single" w:sz="4" w:space="0" w:color="000000"/>
               <w:bottom w:val="single" w:sz="4" w:space="0" w:color="000000"/>
@@ -2458,41 +2150,13 @@
                 <w:sz w:val="24"/>
                 <w:szCs w:val="24"/>
               </w:rPr>
-              <w:t>Система CMS має містити форми для додавання новин до бази даних у зручному місці</w:t>
-            </w:r>
-          </w:p>
-        </w:tc>
-        <w:tc>
-          <w:tcPr>
-            <w:tcW w:w="1805" w:type="dxa"/>
-            <w:tcBorders>
-              <w:left w:val="single" w:sz="4" w:space="0" w:color="000000"/>
-              <w:bottom w:val="single" w:sz="4" w:space="0" w:color="000000"/>
-            </w:tcBorders>
-            <w:vAlign w:val="center"/>
-          </w:tcPr>
-          <w:p>
-            <w:pPr>
-              <w:pStyle w:val="user4"/>
-              <w:spacing w:lineRule="auto" w:line="240"/>
-              <w:ind w:hanging="0" w:left="0"/>
-              <w:rPr>
-                <w:sz w:val="24"/>
-                <w:szCs w:val="24"/>
-              </w:rPr>
-            </w:pPr>
-            <w:r>
-              <w:rPr>
-                <w:sz w:val="24"/>
-                <w:szCs w:val="24"/>
-              </w:rPr>
               <w:t>До кінця кварталу</w:t>
             </w:r>
           </w:p>
         </w:tc>
         <w:tc>
           <w:tcPr>
-            <w:tcW w:w="1806" w:type="dxa"/>
+            <w:tcW w:w="2904" w:type="dxa"/>
             <w:tcBorders>
               <w:left w:val="single" w:sz="4" w:space="0" w:color="000000"/>
               <w:bottom w:val="single" w:sz="4" w:space="0" w:color="000000"/>
@@ -2515,7 +2179,7 @@
                 <w:sz w:val="24"/>
                 <w:szCs w:val="24"/>
               </w:rPr>
-              <w:t>Система містить форми додавання новин у зручно розташованому місці</w:t>
+              <w:t>Сторінки в соціальних мережах знаходяться менше ніж за 5 секунд</w:t>
             </w:r>
           </w:p>
         </w:tc>
@@ -2524,7 +2188,7 @@
         <w:trPr/>
         <w:tc>
           <w:tcPr>
-            <w:tcW w:w="370" w:type="dxa"/>
+            <w:tcW w:w="1622" w:type="dxa"/>
             <w:tcBorders>
               <w:left w:val="single" w:sz="4" w:space="0" w:color="000000"/>
               <w:bottom w:val="single" w:sz="4" w:space="0" w:color="000000"/>
@@ -2546,13 +2210,13 @@
                 <w:sz w:val="24"/>
                 <w:szCs w:val="24"/>
               </w:rPr>
-              <w:t>6</w:t>
+              <w:t>Користувач</w:t>
             </w:r>
           </w:p>
         </w:tc>
         <w:tc>
           <w:tcPr>
-            <w:tcW w:w="1674" w:type="dxa"/>
+            <w:tcW w:w="5100" w:type="dxa"/>
             <w:tcBorders>
               <w:left w:val="single" w:sz="4" w:space="0" w:color="000000"/>
               <w:bottom w:val="single" w:sz="4" w:space="0" w:color="000000"/>
@@ -2574,13 +2238,13 @@
                 <w:sz w:val="24"/>
                 <w:szCs w:val="24"/>
               </w:rPr>
-              <w:t>Адміністратор</w:t>
+              <w:t>Соціальні мережі повинні містити картинки разом з текстом новини</w:t>
             </w:r>
           </w:p>
         </w:tc>
         <w:tc>
           <w:tcPr>
-            <w:tcW w:w="3371" w:type="dxa"/>
+            <w:tcW w:w="1992" w:type="dxa"/>
             <w:tcBorders>
               <w:left w:val="single" w:sz="4" w:space="0" w:color="000000"/>
               <w:bottom w:val="single" w:sz="4" w:space="0" w:color="000000"/>
@@ -2602,41 +2266,13 @@
                 <w:sz w:val="24"/>
                 <w:szCs w:val="24"/>
               </w:rPr>
-              <w:t>Платформа менеджменту контенту повинна містити статистику переглядів як сайту, так і соціальних мереж</w:t>
+              <w:t>До кінця тижня</w:t>
             </w:r>
           </w:p>
         </w:tc>
         <w:tc>
           <w:tcPr>
-            <w:tcW w:w="1805" w:type="dxa"/>
-            <w:tcBorders>
-              <w:left w:val="single" w:sz="4" w:space="0" w:color="000000"/>
-              <w:bottom w:val="single" w:sz="4" w:space="0" w:color="000000"/>
-            </w:tcBorders>
-            <w:vAlign w:val="center"/>
-          </w:tcPr>
-          <w:p>
-            <w:pPr>
-              <w:pStyle w:val="user4"/>
-              <w:spacing w:lineRule="auto" w:line="240"/>
-              <w:ind w:hanging="0" w:left="0"/>
-              <w:rPr>
-                <w:sz w:val="24"/>
-                <w:szCs w:val="24"/>
-              </w:rPr>
-            </w:pPr>
-            <w:r>
-              <w:rPr>
-                <w:sz w:val="24"/>
-                <w:szCs w:val="24"/>
-              </w:rPr>
-              <w:t>До кінця року</w:t>
-            </w:r>
-          </w:p>
-        </w:tc>
-        <w:tc>
-          <w:tcPr>
-            <w:tcW w:w="1806" w:type="dxa"/>
+            <w:tcW w:w="2904" w:type="dxa"/>
             <w:tcBorders>
               <w:left w:val="single" w:sz="4" w:space="0" w:color="000000"/>
               <w:bottom w:val="single" w:sz="4" w:space="0" w:color="000000"/>
@@ -2659,6 +2295,222 @@
                 <w:sz w:val="24"/>
                 <w:szCs w:val="24"/>
               </w:rPr>
+              <w:t>Всі пости в соціальних мережах містять картинки</w:t>
+            </w:r>
+          </w:p>
+        </w:tc>
+      </w:tr>
+      <w:tr>
+        <w:trPr/>
+        <w:tc>
+          <w:tcPr>
+            <w:tcW w:w="1622" w:type="dxa"/>
+            <w:tcBorders>
+              <w:left w:val="single" w:sz="4" w:space="0" w:color="000000"/>
+              <w:bottom w:val="single" w:sz="4" w:space="0" w:color="000000"/>
+            </w:tcBorders>
+            <w:vAlign w:val="center"/>
+          </w:tcPr>
+          <w:p>
+            <w:pPr>
+              <w:pStyle w:val="user4"/>
+              <w:spacing w:lineRule="auto" w:line="240"/>
+              <w:ind w:hanging="0" w:left="0"/>
+              <w:rPr>
+                <w:sz w:val="24"/>
+                <w:szCs w:val="24"/>
+              </w:rPr>
+            </w:pPr>
+            <w:r>
+              <w:rPr/>
+            </w:r>
+          </w:p>
+        </w:tc>
+        <w:tc>
+          <w:tcPr>
+            <w:tcW w:w="5100" w:type="dxa"/>
+            <w:tcBorders>
+              <w:left w:val="single" w:sz="4" w:space="0" w:color="000000"/>
+              <w:bottom w:val="single" w:sz="4" w:space="0" w:color="000000"/>
+            </w:tcBorders>
+            <w:vAlign w:val="center"/>
+          </w:tcPr>
+          <w:p>
+            <w:pPr>
+              <w:pStyle w:val="user4"/>
+              <w:spacing w:lineRule="auto" w:line="240"/>
+              <w:ind w:hanging="0" w:left="0"/>
+              <w:rPr>
+                <w:sz w:val="24"/>
+                <w:szCs w:val="24"/>
+              </w:rPr>
+            </w:pPr>
+            <w:r>
+              <w:rPr/>
+            </w:r>
+          </w:p>
+        </w:tc>
+        <w:tc>
+          <w:tcPr>
+            <w:tcW w:w="1992" w:type="dxa"/>
+            <w:tcBorders>
+              <w:left w:val="single" w:sz="4" w:space="0" w:color="000000"/>
+              <w:bottom w:val="single" w:sz="4" w:space="0" w:color="000000"/>
+            </w:tcBorders>
+            <w:vAlign w:val="center"/>
+          </w:tcPr>
+          <w:p>
+            <w:pPr>
+              <w:pStyle w:val="user4"/>
+              <w:spacing w:lineRule="auto" w:line="240"/>
+              <w:ind w:hanging="0" w:left="0"/>
+              <w:rPr>
+                <w:sz w:val="24"/>
+                <w:szCs w:val="24"/>
+              </w:rPr>
+            </w:pPr>
+            <w:r>
+              <w:rPr/>
+            </w:r>
+          </w:p>
+        </w:tc>
+        <w:tc>
+          <w:tcPr>
+            <w:tcW w:w="2904" w:type="dxa"/>
+            <w:tcBorders>
+              <w:left w:val="single" w:sz="4" w:space="0" w:color="000000"/>
+              <w:bottom w:val="single" w:sz="4" w:space="0" w:color="000000"/>
+              <w:right w:val="single" w:sz="4" w:space="0" w:color="000000"/>
+            </w:tcBorders>
+            <w:vAlign w:val="center"/>
+          </w:tcPr>
+          <w:p>
+            <w:pPr>
+              <w:pStyle w:val="p11"/>
+              <w:spacing w:lineRule="auto" w:line="240"/>
+              <w:ind w:hanging="0" w:left="0"/>
+              <w:rPr>
+                <w:sz w:val="24"/>
+                <w:szCs w:val="24"/>
+              </w:rPr>
+            </w:pPr>
+            <w:r>
+              <w:rPr/>
+            </w:r>
+          </w:p>
+        </w:tc>
+      </w:tr>
+      <w:tr>
+        <w:trPr/>
+        <w:tc>
+          <w:tcPr>
+            <w:tcW w:w="1622" w:type="dxa"/>
+            <w:tcBorders>
+              <w:left w:val="single" w:sz="4" w:space="0" w:color="000000"/>
+              <w:bottom w:val="single" w:sz="4" w:space="0" w:color="000000"/>
+            </w:tcBorders>
+            <w:vAlign w:val="center"/>
+          </w:tcPr>
+          <w:p>
+            <w:pPr>
+              <w:pStyle w:val="user4"/>
+              <w:spacing w:lineRule="auto" w:line="240"/>
+              <w:ind w:hanging="0" w:left="0"/>
+              <w:rPr>
+                <w:sz w:val="24"/>
+                <w:szCs w:val="24"/>
+              </w:rPr>
+            </w:pPr>
+            <w:r>
+              <w:rPr>
+                <w:sz w:val="24"/>
+                <w:szCs w:val="24"/>
+              </w:rPr>
+              <w:t>Адміністратор</w:t>
+            </w:r>
+          </w:p>
+        </w:tc>
+        <w:tc>
+          <w:tcPr>
+            <w:tcW w:w="5100" w:type="dxa"/>
+            <w:tcBorders>
+              <w:left w:val="single" w:sz="4" w:space="0" w:color="000000"/>
+              <w:bottom w:val="single" w:sz="4" w:space="0" w:color="000000"/>
+            </w:tcBorders>
+            <w:vAlign w:val="center"/>
+          </w:tcPr>
+          <w:p>
+            <w:pPr>
+              <w:pStyle w:val="user4"/>
+              <w:spacing w:lineRule="auto" w:line="240"/>
+              <w:ind w:hanging="0" w:left="0"/>
+              <w:rPr>
+                <w:sz w:val="24"/>
+                <w:szCs w:val="24"/>
+              </w:rPr>
+            </w:pPr>
+            <w:r>
+              <w:rPr>
+                <w:sz w:val="24"/>
+                <w:szCs w:val="24"/>
+              </w:rPr>
+              <w:t>Платформа менеджменту контенту повинна містити статистику переглядів як сайту, так і соціальних мереж</w:t>
+            </w:r>
+          </w:p>
+        </w:tc>
+        <w:tc>
+          <w:tcPr>
+            <w:tcW w:w="1992" w:type="dxa"/>
+            <w:tcBorders>
+              <w:left w:val="single" w:sz="4" w:space="0" w:color="000000"/>
+              <w:bottom w:val="single" w:sz="4" w:space="0" w:color="000000"/>
+            </w:tcBorders>
+            <w:vAlign w:val="center"/>
+          </w:tcPr>
+          <w:p>
+            <w:pPr>
+              <w:pStyle w:val="user4"/>
+              <w:spacing w:lineRule="auto" w:line="240"/>
+              <w:ind w:hanging="0" w:left="0"/>
+              <w:rPr>
+                <w:sz w:val="24"/>
+                <w:szCs w:val="24"/>
+              </w:rPr>
+            </w:pPr>
+            <w:r>
+              <w:rPr>
+                <w:sz w:val="24"/>
+                <w:szCs w:val="24"/>
+              </w:rPr>
+              <w:t>До кінця року</w:t>
+            </w:r>
+          </w:p>
+        </w:tc>
+        <w:tc>
+          <w:tcPr>
+            <w:tcW w:w="2904" w:type="dxa"/>
+            <w:tcBorders>
+              <w:left w:val="single" w:sz="4" w:space="0" w:color="000000"/>
+              <w:bottom w:val="single" w:sz="4" w:space="0" w:color="000000"/>
+              <w:right w:val="single" w:sz="4" w:space="0" w:color="000000"/>
+            </w:tcBorders>
+            <w:vAlign w:val="center"/>
+          </w:tcPr>
+          <w:p>
+            <w:pPr>
+              <w:pStyle w:val="p11"/>
+              <w:spacing w:lineRule="auto" w:line="240"/>
+              <w:ind w:hanging="0" w:left="0"/>
+              <w:rPr>
+                <w:sz w:val="24"/>
+                <w:szCs w:val="24"/>
+              </w:rPr>
+            </w:pPr>
+            <w:r>
+              <w:rPr>
+                <w:sz w:val="24"/>
+                <w:szCs w:val="24"/>
+              </w:rPr>
               <w:t>Платформа містить статистику переглядів сайту та соціальних мереж</w:t>
             </w:r>
           </w:p>
@@ -3018,7 +2870,7 @@
           <wp:inline distT="0" distB="0" distL="0" distR="0">
             <wp:extent cx="2075815" cy="3636645"/>
             <wp:effectExtent l="0" t="0" r="0" b="0"/>
-            <wp:docPr id="1" name="Зображення2"/>
+            <wp:docPr id="2" name="Зображення2"/>
             <wp:cNvGraphicFramePr>
               <a:graphicFrameLocks xmlns:a="http://schemas.openxmlformats.org/drawingml/2006/main" noChangeAspect="1"/>
             </wp:cNvGraphicFramePr>
@@ -3026,13 +2878,13 @@
               <a:graphicData uri="http://schemas.openxmlformats.org/drawingml/2006/picture">
                 <pic:pic xmlns:pic="http://schemas.openxmlformats.org/drawingml/2006/picture">
                   <pic:nvPicPr>
-                    <pic:cNvPr id="1" name="Зображення2"/>
+                    <pic:cNvPr id="2" name="Зображення2"/>
                     <pic:cNvPicPr>
                       <a:picLocks noChangeAspect="1" noChangeArrowheads="1"/>
                     </pic:cNvPicPr>
                   </pic:nvPicPr>
                   <pic:blipFill>
-                    <a:blip r:embed="rId2"/>
+                    <a:blip r:embed="rId3"/>
                     <a:stretch>
                       <a:fillRect/>
                     </a:stretch>
@@ -3267,7 +3119,7 @@
         <w:widowControl/>
         <w:numPr>
           <w:ilvl w:val="0"/>
-          <w:numId w:val="2"/>
+          <w:numId w:val="1"/>
         </w:numPr>
         <w:suppressAutoHyphens w:val="true"/>
         <w:bidi w:val="0"/>
@@ -3287,7 +3139,7 @@
         <w:widowControl/>
         <w:numPr>
           <w:ilvl w:val="0"/>
-          <w:numId w:val="2"/>
+          <w:numId w:val="1"/>
         </w:numPr>
         <w:suppressAutoHyphens w:val="true"/>
         <w:bidi w:val="0"/>
@@ -3307,7 +3159,7 @@
         <w:widowControl/>
         <w:numPr>
           <w:ilvl w:val="0"/>
-          <w:numId w:val="2"/>
+          <w:numId w:val="1"/>
         </w:numPr>
         <w:suppressAutoHyphens w:val="true"/>
         <w:bidi w:val="0"/>
@@ -3457,143 +3309,6 @@
     <w:lvl w:ilvl="1">
       <w:start w:val="1"/>
       <w:numFmt w:val="bullet"/>
-      <w:lvlText w:val="◦"/>
-      <w:lvlJc w:val="left"/>
-      <w:pPr>
-        <w:tabs>
-          <w:tab w:val="num" w:pos="1080"/>
-        </w:tabs>
-        <w:ind w:left="1080" w:hanging="360"/>
-      </w:pPr>
-      <w:rPr>
-        <w:rFonts w:ascii="OpenSymbol" w:hAnsi="OpenSymbol" w:cs="OpenSymbol" w:hint="default"/>
-      </w:rPr>
-    </w:lvl>
-    <w:lvl w:ilvl="2">
-      <w:start w:val="1"/>
-      <w:numFmt w:val="bullet"/>
-      <w:lvlText w:val="▪"/>
-      <w:lvlJc w:val="left"/>
-      <w:pPr>
-        <w:tabs>
-          <w:tab w:val="num" w:pos="1440"/>
-        </w:tabs>
-        <w:ind w:left="1440" w:hanging="360"/>
-      </w:pPr>
-      <w:rPr>
-        <w:rFonts w:ascii="OpenSymbol" w:hAnsi="OpenSymbol" w:cs="OpenSymbol" w:hint="default"/>
-      </w:rPr>
-    </w:lvl>
-    <w:lvl w:ilvl="3">
-      <w:start w:val="1"/>
-      <w:numFmt w:val="bullet"/>
-      <w:lvlText w:val=""/>
-      <w:lvlJc w:val="left"/>
-      <w:pPr>
-        <w:tabs>
-          <w:tab w:val="num" w:pos="1800"/>
-        </w:tabs>
-        <w:ind w:left="1800" w:hanging="360"/>
-      </w:pPr>
-      <w:rPr>
-        <w:rFonts w:ascii="Symbol" w:hAnsi="Symbol" w:cs="Symbol" w:hint="default"/>
-      </w:rPr>
-    </w:lvl>
-    <w:lvl w:ilvl="4">
-      <w:start w:val="1"/>
-      <w:numFmt w:val="bullet"/>
-      <w:lvlText w:val="◦"/>
-      <w:lvlJc w:val="left"/>
-      <w:pPr>
-        <w:tabs>
-          <w:tab w:val="num" w:pos="2160"/>
-        </w:tabs>
-        <w:ind w:left="2160" w:hanging="360"/>
-      </w:pPr>
-      <w:rPr>
-        <w:rFonts w:ascii="OpenSymbol" w:hAnsi="OpenSymbol" w:cs="OpenSymbol" w:hint="default"/>
-      </w:rPr>
-    </w:lvl>
-    <w:lvl w:ilvl="5">
-      <w:start w:val="1"/>
-      <w:numFmt w:val="bullet"/>
-      <w:lvlText w:val="▪"/>
-      <w:lvlJc w:val="left"/>
-      <w:pPr>
-        <w:tabs>
-          <w:tab w:val="num" w:pos="2520"/>
-        </w:tabs>
-        <w:ind w:left="2520" w:hanging="360"/>
-      </w:pPr>
-      <w:rPr>
-        <w:rFonts w:ascii="OpenSymbol" w:hAnsi="OpenSymbol" w:cs="OpenSymbol" w:hint="default"/>
-      </w:rPr>
-    </w:lvl>
-    <w:lvl w:ilvl="6">
-      <w:start w:val="1"/>
-      <w:numFmt w:val="bullet"/>
-      <w:lvlText w:val=""/>
-      <w:lvlJc w:val="left"/>
-      <w:pPr>
-        <w:tabs>
-          <w:tab w:val="num" w:pos="2880"/>
-        </w:tabs>
-        <w:ind w:left="2880" w:hanging="360"/>
-      </w:pPr>
-      <w:rPr>
-        <w:rFonts w:ascii="Symbol" w:hAnsi="Symbol" w:cs="Symbol" w:hint="default"/>
-      </w:rPr>
-    </w:lvl>
-    <w:lvl w:ilvl="7">
-      <w:start w:val="1"/>
-      <w:numFmt w:val="bullet"/>
-      <w:lvlText w:val="◦"/>
-      <w:lvlJc w:val="left"/>
-      <w:pPr>
-        <w:tabs>
-          <w:tab w:val="num" w:pos="3240"/>
-        </w:tabs>
-        <w:ind w:left="3240" w:hanging="360"/>
-      </w:pPr>
-      <w:rPr>
-        <w:rFonts w:ascii="OpenSymbol" w:hAnsi="OpenSymbol" w:cs="OpenSymbol" w:hint="default"/>
-      </w:rPr>
-    </w:lvl>
-    <w:lvl w:ilvl="8">
-      <w:start w:val="1"/>
-      <w:numFmt w:val="bullet"/>
-      <w:lvlText w:val="▪"/>
-      <w:lvlJc w:val="left"/>
-      <w:pPr>
-        <w:tabs>
-          <w:tab w:val="num" w:pos="3600"/>
-        </w:tabs>
-        <w:ind w:left="3600" w:hanging="360"/>
-      </w:pPr>
-      <w:rPr>
-        <w:rFonts w:ascii="OpenSymbol" w:hAnsi="OpenSymbol" w:cs="OpenSymbol" w:hint="default"/>
-      </w:rPr>
-    </w:lvl>
-  </w:abstractNum>
-  <w:abstractNum w:abstractNumId="2">
-    <w:lvl w:ilvl="0">
-      <w:start w:val="1"/>
-      <w:numFmt w:val="bullet"/>
-      <w:lvlText w:val="-"/>
-      <w:lvlJc w:val="left"/>
-      <w:pPr>
-        <w:tabs>
-          <w:tab w:val="num" w:pos="720"/>
-        </w:tabs>
-        <w:ind w:left="720" w:hanging="360"/>
-      </w:pPr>
-      <w:rPr>
-        <w:rFonts w:ascii="OpenSymbol" w:hAnsi="OpenSymbol" w:cs="OpenSymbol" w:hint="default"/>
-      </w:rPr>
-    </w:lvl>
-    <w:lvl w:ilvl="1">
-      <w:start w:val="1"/>
-      <w:numFmt w:val="bullet"/>
       <w:lvlText w:val="-"/>
       <w:lvlJc w:val="left"/>
       <w:pPr>
@@ -3712,7 +3427,7 @@
       </w:rPr>
     </w:lvl>
   </w:abstractNum>
-  <w:abstractNum w:abstractNumId="3">
+  <w:abstractNum w:abstractNumId="2">
     <w:lvl w:ilvl="0">
       <w:start w:val="1"/>
       <w:numFmt w:val="none"/>
@@ -3836,9 +3551,6 @@
   </w:num>
   <w:num w:numId="2">
     <w:abstractNumId w:val="2"/>
-  </w:num>
-  <w:num w:numId="3">
-    <w:abstractNumId w:val="3"/>
   </w:num>
 </w:numbering>
 </file>
@@ -5014,7 +4726,30 @@
     </w:pPr>
     <w:rPr/>
   </w:style>
-  <w:style w:type="numbering" w:styleId="Style14" w:default="1">
+  <w:style w:type="paragraph" w:styleId="Style14">
+    <w:name w:val="Вміст таблиці"/>
+    <w:basedOn w:val="Normal"/>
+    <w:qFormat/>
+    <w:pPr>
+      <w:widowControl w:val="false"/>
+      <w:suppressLineNumbers/>
+    </w:pPr>
+    <w:rPr/>
+  </w:style>
+  <w:style w:type="paragraph" w:styleId="Style15">
+    <w:name w:val="Заголовок таблиці"/>
+    <w:basedOn w:val="Style14"/>
+    <w:qFormat/>
+    <w:pPr>
+      <w:suppressLineNumbers/>
+      <w:jc w:val="center"/>
+    </w:pPr>
+    <w:rPr>
+      <w:b/>
+      <w:bCs/>
+    </w:rPr>
+  </w:style>
+  <w:style w:type="numbering" w:styleId="Style16" w:default="1">
     <w:name w:val="Без маркерів"/>
     <w:uiPriority w:val="99"/>
     <w:semiHidden/>

</xml_diff>